<commit_message>
Prepare final course design submission
</commit_message>
<xml_diff>
--- a/高性能计算光线追踪渲染器实验报告.docx
+++ b/高性能计算光线追踪渲染器实验报告.docx
@@ -222,7 +222,7 @@
               <w:spacing w:after="40"/>
             </w:pPr>
             <w:r>
-              <w:t>串行与 OpenMP 已完成超算实测，CUDA 源码已实现，待 GPU 节点补测</w:t>
+              <w:t>串行与 OpenMP 已完成超算实测；CUDA 版本已可编译，并通过 Slurm 提交 GPU 队列测试</w:t>
             </w:r>
           </w:p>
         </w:tc>
@@ -249,7 +249,7 @@
         <w:ind w:firstLine="420"/>
       </w:pPr>
       <w:r>
-        <w:t>当前已在超算平台上完成串行版本和 OpenMP 版本的实测。测试参数为 400×300 分辨率、64 samples，串行版本运行时间为 39.1013 s，OpenMP 8 线程版本运行时间为 9.72383 s，加速比约为 4.02×。CUDA 版本源码已实现，但由于当前登录节点未找到 nvcc，GPU 实测数据待进入 GPU 节点后补充。</w:t>
+        <w:t>当前已在超算平台上完成串行版本和 OpenMP 版本的实测。测试参数为 400×300 分辨率、64 samples，串行版本运行时间为 39.1013 s，OpenMP 8 线程版本运行时间为 9.72383 s，加速比约为 4.02×。CUDA 版本已经使用 intel/cuda/12.1 模块完成编译，并通过 Slurm 提交到 gpu_4090 分区运行。</w:t>
       </w:r>
     </w:p>
     <w:p>
@@ -257,7 +257,7 @@
         <w:pStyle w:val="Heading1"/>
       </w:pPr>
       <w:r>
-        <w:t>1. 研究背景与实验目标</w:t>
+        <w:t>1. 研究背景与意义</w:t>
       </w:r>
     </w:p>
     <w:p>
@@ -266,6 +266,22 @@
       </w:pPr>
       <w:r>
         <w:t>光线追踪通过模拟光线与场景物体的相交、反射、折射和散射过程生成图像，能够获得较真实的阴影、反射、透明材质和景深效果。由于每个像素通常需要发射多条光线并执行递归追踪，计算量随分辨率、采样数和递归深度快速增长，因此非常适合使用 CPU 多线程和 GPU 并行计算进行加速。</w:t>
+      </w:r>
+    </w:p>
+    <w:p>
+      <w:pPr>
+        <w:ind w:firstLine="420"/>
+      </w:pPr>
+      <w:r>
+        <w:t>游戏画面渲染、影视级离线渲染和实时路径追踪都依赖大量相互独立的像素计算。本课程设计选择光线追踪作为优化对象，可以较直观地体现高性能计算中任务分解、负载均衡、GPU 线程映射和性能加速比分析等核心思想。</w:t>
+      </w:r>
+    </w:p>
+    <w:p>
+      <w:pPr>
+        <w:pStyle w:val="Heading1"/>
+      </w:pPr>
+      <w:r>
+        <w:t>2. 研究内容</w:t>
       </w:r>
     </w:p>
     <w:p>
@@ -309,7 +325,7 @@
         <w:pStyle w:val="Heading1"/>
       </w:pPr>
       <w:r>
-        <w:t>2. 技术路线与程序结构</w:t>
+        <w:t>3. 技术路线与程序结构</w:t>
       </w:r>
     </w:p>
     <w:p>
@@ -416,7 +432,7 @@
         <w:pStyle w:val="Heading1"/>
       </w:pPr>
       <w:r>
-        <w:t>3. 串行版本实现</w:t>
+        <w:t>4. 串行版本实现</w:t>
       </w:r>
     </w:p>
     <w:p>
@@ -589,63 +605,10 @@
     </w:tbl>
     <w:p>
       <w:pPr>
-        <w:jc w:val="center"/>
-      </w:pPr>
-      <w:r>
-        <w:drawing>
-          <wp:inline xmlns:a="http://schemas.openxmlformats.org/drawingml/2006/main" xmlns:pic="http://schemas.openxmlformats.org/drawingml/2006/picture">
-            <wp:extent cx="5852160" cy="2381161"/>
-            <wp:docPr id="1" name="Picture 1"/>
-            <wp:cNvGraphicFramePr>
-              <a:graphicFrameLocks noChangeAspect="1"/>
-            </wp:cNvGraphicFramePr>
-            <a:graphic>
-              <a:graphicData uri="http://schemas.openxmlformats.org/drawingml/2006/picture">
-                <pic:pic>
-                  <pic:nvPicPr>
-                    <pic:cNvPr id="0" name="terminal_serial.png"/>
-                    <pic:cNvPicPr/>
-                  </pic:nvPicPr>
-                  <pic:blipFill>
-                    <a:blip r:embed="rId11"/>
-                    <a:stretch>
-                      <a:fillRect/>
-                    </a:stretch>
-                  </pic:blipFill>
-                  <pic:spPr>
-                    <a:xfrm>
-                      <a:off x="0" y="0"/>
-                      <a:ext cx="5852160" cy="2381161"/>
-                    </a:xfrm>
-                    <a:prstGeom prst="rect"/>
-                  </pic:spPr>
-                </pic:pic>
-              </a:graphicData>
-            </a:graphic>
-          </wp:inline>
-        </w:drawing>
-      </w:r>
-    </w:p>
-    <w:p>
-      <w:pPr>
-        <w:spacing w:after="120"/>
-        <w:jc w:val="center"/>
-      </w:pPr>
-      <w:r>
-        <w:rPr>
-          <w:i/>
-          <w:color w:val="5A5A5A"/>
-          <w:sz w:val="18"/>
-        </w:rPr>
-        <w:t>图 1  超算平台串行版本编译与运行截图：400×300、64 samples，运行时间 39.1013 s。</w:t>
-      </w:r>
-    </w:p>
-    <w:p>
-      <w:pPr>
         <w:pStyle w:val="Heading1"/>
       </w:pPr>
       <w:r>
-        <w:t>4. OpenMP 并行版本实现</w:t>
+        <w:t>5. OpenMP 并行版本实现</w:t>
       </w:r>
     </w:p>
     <w:p>
@@ -803,63 +766,10 @@
     </w:p>
     <w:p>
       <w:pPr>
-        <w:jc w:val="center"/>
-      </w:pPr>
-      <w:r>
-        <w:drawing>
-          <wp:inline xmlns:a="http://schemas.openxmlformats.org/drawingml/2006/main" xmlns:pic="http://schemas.openxmlformats.org/drawingml/2006/picture">
-            <wp:extent cx="5852160" cy="2370766"/>
-            <wp:docPr id="2" name="Picture 2"/>
-            <wp:cNvGraphicFramePr>
-              <a:graphicFrameLocks noChangeAspect="1"/>
-            </wp:cNvGraphicFramePr>
-            <a:graphic>
-              <a:graphicData uri="http://schemas.openxmlformats.org/drawingml/2006/picture">
-                <pic:pic>
-                  <pic:nvPicPr>
-                    <pic:cNvPr id="0" name="terminal_openmp.png"/>
-                    <pic:cNvPicPr/>
-                  </pic:nvPicPr>
-                  <pic:blipFill>
-                    <a:blip r:embed="rId12"/>
-                    <a:stretch>
-                      <a:fillRect/>
-                    </a:stretch>
-                  </pic:blipFill>
-                  <pic:spPr>
-                    <a:xfrm>
-                      <a:off x="0" y="0"/>
-                      <a:ext cx="5852160" cy="2370766"/>
-                    </a:xfrm>
-                    <a:prstGeom prst="rect"/>
-                  </pic:spPr>
-                </pic:pic>
-              </a:graphicData>
-            </a:graphic>
-          </wp:inline>
-        </w:drawing>
-      </w:r>
-    </w:p>
-    <w:p>
-      <w:pPr>
-        <w:spacing w:after="120"/>
-        <w:jc w:val="center"/>
-      </w:pPr>
-      <w:r>
-        <w:rPr>
-          <w:i/>
-          <w:color w:val="5A5A5A"/>
-          <w:sz w:val="18"/>
-        </w:rPr>
-        <w:t>图 2  超算平台 OpenMP 版本运行截图：8 线程运行时间 9.72383 s，并检查了 PPM 文件头。</w:t>
-      </w:r>
-    </w:p>
-    <w:p>
-      <w:pPr>
         <w:pStyle w:val="Heading1"/>
       </w:pPr>
       <w:r>
-        <w:t>5. CUDA 版本设计</w:t>
+        <w:t>6. CUDA 版本设计与超算提交</w:t>
       </w:r>
     </w:p>
     <w:p>
@@ -925,7 +835,29 @@
                 <w:color w:val="14283C"/>
                 <w:sz w:val="17"/>
               </w:rPr>
-              <w:t xml:space="preserve">                              curandState* rand_states, int scene_id) {</w:t>
+              <w:t xml:space="preserve">                              curandState* rand_states, int scene_id,</w:t>
+            </w:r>
+            <w:r>
+              <w:br/>
+            </w:r>
+            <w:r>
+              <w:rPr>
+                <w:rFonts w:ascii="Menlo" w:hAnsi="Menlo" w:eastAsia="Menlo"/>
+                <w:color w:val="14283C"/>
+                <w:sz w:val="17"/>
+              </w:rPr>
+              <w:t xml:space="preserve">                              const Sphere* spheres, int num_spheres,</w:t>
+            </w:r>
+            <w:r>
+              <w:br/>
+            </w:r>
+            <w:r>
+              <w:rPr>
+                <w:rFonts w:ascii="Menlo" w:hAnsi="Menlo" w:eastAsia="Menlo"/>
+                <w:color w:val="14283C"/>
+                <w:sz w:val="17"/>
+              </w:rPr>
+              <w:t xml:space="preserve">                              const MaterialData* materials) {</w:t>
             </w:r>
             <w:r>
               <w:br/>
@@ -1012,7 +944,87 @@
         <w:ind w:firstLine="420"/>
       </w:pPr>
       <w:r>
-        <w:t>当前 CUDA 源码已经完成，但超算登录节点执行 nvcc 时提示 command not found。初步判断 CUDA 环境需要在 GPU 节点或通过 module 加载后使用，因此 GPU 实测数据将在平台恢复后补充。</w:t>
+        <w:t>CUDA 版本使用 cudaMalloc 在显存中保存球体和材质数组，再将指针作为 kernel 参数传入。这样可以避免带构造函数结构体放入 __constant__ 变量时产生的动态初始化问题。</w:t>
+      </w:r>
+    </w:p>
+    <w:tbl>
+      <w:tblPr>
+        <w:tblW w:type="dxa" w:w="9360"/>
+        <w:jc w:val="center"/>
+        <w:tblLook w:firstColumn="1" w:firstRow="1" w:lastColumn="0" w:lastRow="0" w:noHBand="0" w:noVBand="1" w:val="04A0"/>
+      </w:tblPr>
+      <w:tblGrid>
+        <w:gridCol w:w="9792"/>
+      </w:tblGrid>
+      <w:tr>
+        <w:tc>
+          <w:tcPr>
+            <w:tcW w:type="dxa" w:w="9792"/>
+            <w:shd w:fill="F4F6F9"/>
+            <w:tcBorders>
+              <w:top w:val="single" w:sz="4" w:space="0" w:color="CBD5E1"/>
+              <w:left w:val="single" w:sz="4" w:space="0" w:color="CBD5E1"/>
+              <w:bottom w:val="single" w:sz="4" w:space="0" w:color="CBD5E1"/>
+              <w:right w:val="single" w:sz="4" w:space="0" w:color="CBD5E1"/>
+              <w:insideH w:val="single" w:sz="4" w:space="0" w:color="CBD5E1"/>
+              <w:insideV w:val="single" w:sz="4" w:space="0" w:color="CBD5E1"/>
+            </w:tcBorders>
+          </w:tcPr>
+          <w:p>
+            <w:pPr>
+              <w:spacing w:before="80" w:after="80"/>
+            </w:pPr>
+            <w:r>
+              <w:rPr>
+                <w:rFonts w:ascii="Menlo" w:hAnsi="Menlo" w:eastAsia="Menlo"/>
+                <w:color w:val="14283C"/>
+                <w:sz w:val="17"/>
+              </w:rPr>
+              <w:t>module load intel/cuda/12.1</w:t>
+            </w:r>
+            <w:r>
+              <w:br/>
+            </w:r>
+            <w:r>
+              <w:rPr>
+                <w:rFonts w:ascii="Menlo" w:hAnsi="Menlo" w:eastAsia="Menlo"/>
+                <w:color w:val="14283C"/>
+                <w:sz w:val="17"/>
+              </w:rPr>
+              <w:t>nvcc -O3 -arch=sm_80 v3_cuda/main.cu -o v3_cuda/v3_cuda</w:t>
+            </w:r>
+            <w:r>
+              <w:br/>
+            </w:r>
+            <w:r>
+              <w:rPr>
+                <w:rFonts w:ascii="Menlo" w:hAnsi="Menlo" w:eastAsia="Menlo"/>
+                <w:color w:val="14283C"/>
+                <w:sz w:val="17"/>
+              </w:rPr>
+              <w:t>sbatch scripts/submit_gpu_slurm.sh</w:t>
+            </w:r>
+            <w:r>
+              <w:br/>
+            </w:r>
+            <w:r>
+              <w:rPr>
+                <w:rFonts w:ascii="Menlo" w:hAnsi="Menlo" w:eastAsia="Menlo"/>
+                <w:color w:val="14283C"/>
+                <w:sz w:val="17"/>
+              </w:rPr>
+              <w:t>squeue -u bjtu3</w:t>
+            </w:r>
+          </w:p>
+        </w:tc>
+      </w:tr>
+    </w:tbl>
+    <w:p>
+      <w:pPr>
+        <w:ind w:firstLine="420"/>
+      </w:pPr>
+      <w:r>
+        <w:t>实验过程中曾在登录节点直接运行 CUDA 程序并出现 CUDA driver version is insufficient for CUDA runtime version。该问题不是编译错误，而是登录节点通常不提供可用 GPU 运行环境。随后将程序提交到 gpu_4090 分区后，该问题消失，说明 CUDA 程序应在 GPU 计算节点上运行。</w:t>
       </w:r>
     </w:p>
     <w:p>
@@ -1020,7 +1032,7 @@
         <w:pStyle w:val="Heading1"/>
       </w:pPr>
       <w:r>
-        <w:t>6. 渲染结果与图片对比</w:t>
+        <w:t>7. 渲染结果与图片对比</w:t>
       </w:r>
     </w:p>
     <w:p>
@@ -1063,7 +1075,7 @@
               <w:drawing>
                 <wp:inline xmlns:a="http://schemas.openxmlformats.org/drawingml/2006/main" xmlns:pic="http://schemas.openxmlformats.org/drawingml/2006/picture">
                   <wp:extent cx="2743200" cy="2057400"/>
-                  <wp:docPr id="3" name="Picture 3"/>
+                  <wp:docPr id="1" name="Picture 1"/>
                   <wp:cNvGraphicFramePr>
                     <a:graphicFrameLocks noChangeAspect="1"/>
                   </wp:cNvGraphicFramePr>
@@ -1075,7 +1087,7 @@
                           <pic:cNvPicPr/>
                         </pic:nvPicPr>
                         <pic:blipFill>
-                          <a:blip r:embed="rId13"/>
+                          <a:blip r:embed="rId11"/>
                           <a:stretch>
                             <a:fillRect/>
                           </a:stretch>
@@ -1116,7 +1128,7 @@
               <w:drawing>
                 <wp:inline xmlns:a="http://schemas.openxmlformats.org/drawingml/2006/main" xmlns:pic="http://schemas.openxmlformats.org/drawingml/2006/picture">
                   <wp:extent cx="2743200" cy="2057400"/>
-                  <wp:docPr id="4" name="Picture 4"/>
+                  <wp:docPr id="2" name="Picture 2"/>
                   <wp:cNvGraphicFramePr>
                     <a:graphicFrameLocks noChangeAspect="1"/>
                   </wp:cNvGraphicFramePr>
@@ -1128,7 +1140,7 @@
                           <pic:cNvPicPr/>
                         </pic:nvPicPr>
                         <pic:blipFill>
-                          <a:blip r:embed="rId14"/>
+                          <a:blip r:embed="rId12"/>
                           <a:stretch>
                             <a:fillRect/>
                           </a:stretch>
@@ -1219,7 +1231,7 @@
         <w:pStyle w:val="Heading1"/>
       </w:pPr>
       <w:r>
-        <w:t>7. 扩展展示场景</w:t>
+        <w:t>8. 扩展展示场景</w:t>
       </w:r>
     </w:p>
     <w:p>
@@ -1262,7 +1274,7 @@
               <w:drawing>
                 <wp:inline xmlns:a="http://schemas.openxmlformats.org/drawingml/2006/main" xmlns:pic="http://schemas.openxmlformats.org/drawingml/2006/picture">
                   <wp:extent cx="2743200" cy="1543050"/>
-                  <wp:docPr id="5" name="Picture 5"/>
+                  <wp:docPr id="3" name="Picture 3"/>
                   <wp:cNvGraphicFramePr>
                     <a:graphicFrameLocks noChangeAspect="1"/>
                   </wp:cNvGraphicFramePr>
@@ -1274,7 +1286,7 @@
                           <pic:cNvPicPr/>
                         </pic:nvPicPr>
                         <pic:blipFill>
-                          <a:blip r:embed="rId15"/>
+                          <a:blip r:embed="rId13"/>
                           <a:stretch>
                             <a:fillRect/>
                           </a:stretch>
@@ -1315,7 +1327,7 @@
               <w:drawing>
                 <wp:inline xmlns:a="http://schemas.openxmlformats.org/drawingml/2006/main" xmlns:pic="http://schemas.openxmlformats.org/drawingml/2006/picture">
                   <wp:extent cx="2743200" cy="1543050"/>
-                  <wp:docPr id="6" name="Picture 6"/>
+                  <wp:docPr id="4" name="Picture 4"/>
                   <wp:cNvGraphicFramePr>
                     <a:graphicFrameLocks noChangeAspect="1"/>
                   </wp:cNvGraphicFramePr>
@@ -1327,7 +1339,7 @@
                           <pic:cNvPicPr/>
                         </pic:nvPicPr>
                         <pic:blipFill>
-                          <a:blip r:embed="rId16"/>
+                          <a:blip r:embed="rId14"/>
                           <a:stretch>
                             <a:fillRect/>
                           </a:stretch>
@@ -1413,7 +1425,7 @@
         <w:drawing>
           <wp:inline xmlns:a="http://schemas.openxmlformats.org/drawingml/2006/main" xmlns:pic="http://schemas.openxmlformats.org/drawingml/2006/picture">
             <wp:extent cx="4389120" cy="2468880"/>
-            <wp:docPr id="7" name="Picture 7"/>
+            <wp:docPr id="5" name="Picture 5"/>
             <wp:cNvGraphicFramePr>
               <a:graphicFrameLocks noChangeAspect="1"/>
             </wp:cNvGraphicFramePr>
@@ -1425,7 +1437,7 @@
                     <pic:cNvPicPr/>
                   </pic:nvPicPr>
                   <pic:blipFill>
-                    <a:blip r:embed="rId17"/>
+                    <a:blip r:embed="rId15"/>
                     <a:stretch>
                       <a:fillRect/>
                     </a:stretch>
@@ -1463,7 +1475,7 @@
         <w:pStyle w:val="Heading1"/>
       </w:pPr>
       <w:r>
-        <w:t>8. 性能结果与分析</w:t>
+        <w:t>9. 性能结果与分析</w:t>
       </w:r>
     </w:p>
     <w:tbl>
@@ -1976,7 +1988,117 @@
         <w:pStyle w:val="Heading1"/>
       </w:pPr>
       <w:r>
-        <w:t>9. 遇到的问题与后续计划</w:t>
+        <w:t>10. 复现方法与提交文件说明</w:t>
+      </w:r>
+    </w:p>
+    <w:p>
+      <w:pPr>
+        <w:ind w:firstLine="420"/>
+      </w:pPr>
+      <w:r>
+        <w:t>提交压缩包中包含原始串行代码、OpenMP 优化代码、CUDA 优化代码、运行说明、实验报告以及答辩 PPT PDF。助教可按以下命令复现小规模正确性测试。</w:t>
+      </w:r>
+    </w:p>
+    <w:tbl>
+      <w:tblPr>
+        <w:tblW w:type="dxa" w:w="9360"/>
+        <w:jc w:val="center"/>
+        <w:tblLook w:firstColumn="1" w:firstRow="1" w:lastColumn="0" w:lastRow="0" w:noHBand="0" w:noVBand="1" w:val="04A0"/>
+      </w:tblPr>
+      <w:tblGrid>
+        <w:gridCol w:w="9792"/>
+      </w:tblGrid>
+      <w:tr>
+        <w:tc>
+          <w:tcPr>
+            <w:tcW w:type="dxa" w:w="9792"/>
+            <w:shd w:fill="F4F6F9"/>
+            <w:tcBorders>
+              <w:top w:val="single" w:sz="4" w:space="0" w:color="CBD5E1"/>
+              <w:left w:val="single" w:sz="4" w:space="0" w:color="CBD5E1"/>
+              <w:bottom w:val="single" w:sz="4" w:space="0" w:color="CBD5E1"/>
+              <w:right w:val="single" w:sz="4" w:space="0" w:color="CBD5E1"/>
+              <w:insideH w:val="single" w:sz="4" w:space="0" w:color="CBD5E1"/>
+              <w:insideV w:val="single" w:sz="4" w:space="0" w:color="CBD5E1"/>
+            </w:tcBorders>
+          </w:tcPr>
+          <w:p>
+            <w:pPr>
+              <w:spacing w:before="80" w:after="80"/>
+            </w:pPr>
+            <w:r>
+              <w:rPr>
+                <w:rFonts w:ascii="Menlo" w:hAnsi="Menlo" w:eastAsia="Menlo"/>
+                <w:color w:val="14283C"/>
+                <w:sz w:val="17"/>
+              </w:rPr>
+              <w:t>g++ -O2 -std=c++17 v1_serial/main.cpp -o v1_serial/v1_serial</w:t>
+            </w:r>
+            <w:r>
+              <w:br/>
+            </w:r>
+            <w:r>
+              <w:rPr>
+                <w:rFonts w:ascii="Menlo" w:hAnsi="Menlo" w:eastAsia="Menlo"/>
+                <w:color w:val="14283C"/>
+                <w:sz w:val="17"/>
+              </w:rPr>
+              <w:t>g++ -O2 -std=c++17 -fopenmp v2_openmp/main.cpp -o v2_openmp/v2_openmp</w:t>
+            </w:r>
+            <w:r>
+              <w:br/>
+            </w:r>
+            <w:r>
+              <w:rPr>
+                <w:rFonts w:ascii="Menlo" w:hAnsi="Menlo" w:eastAsia="Menlo"/>
+                <w:color w:val="14283C"/>
+                <w:sz w:val="17"/>
+              </w:rPr>
+              <w:t>module load intel/cuda/12.1</w:t>
+            </w:r>
+            <w:r>
+              <w:br/>
+            </w:r>
+            <w:r>
+              <w:rPr>
+                <w:rFonts w:ascii="Menlo" w:hAnsi="Menlo" w:eastAsia="Menlo"/>
+                <w:color w:val="14283C"/>
+                <w:sz w:val="17"/>
+              </w:rPr>
+              <w:t>nvcc -O3 -arch=sm_80 v3_cuda/main.cu -o v3_cuda/v3_cuda</w:t>
+            </w:r>
+            <w:r>
+              <w:br/>
+            </w:r>
+            <w:r>
+              <w:rPr>
+                <w:rFonts w:ascii="Menlo" w:hAnsi="Menlo" w:eastAsia="Menlo"/>
+                <w:color w:val="14283C"/>
+                <w:sz w:val="17"/>
+              </w:rPr>
+              <w:t>OMP_NUM_THREADS=8 ./v2_openmp/v2_openmp --width 400 --height 300 --samples 64 --scene racing</w:t>
+            </w:r>
+            <w:r>
+              <w:br/>
+            </w:r>
+            <w:r>
+              <w:rPr>
+                <w:rFonts w:ascii="Menlo" w:hAnsi="Menlo" w:eastAsia="Menlo"/>
+                <w:color w:val="14283C"/>
+                <w:sz w:val="17"/>
+              </w:rPr>
+              <w:t>sbatch scripts/submit_gpu_slurm.sh</w:t>
+            </w:r>
+          </w:p>
+        </w:tc>
+      </w:tr>
+    </w:tbl>
+    <w:p>
+      <w:pPr>
+        <w:pStyle w:val="Heading1"/>
+      </w:pPr>
+      <w:r>
+        <w:t>11. 遇到的问题与后续计划</w:t>
       </w:r>
     </w:p>
     <w:p>
@@ -1985,7 +2107,7 @@
         <w:spacing w:after="60"/>
       </w:pPr>
       <w:r>
-        <w:t>CUDA 编译器暂不可用：登录节点执行 nvcc 提示 command not found，后续需要进入 GPU 队列或加载正确 CUDA module。</w:t>
+        <w:t>CUDA 登录节点运行限制：登录节点不能作为正式 GPU 运行环境，应通过 Slurm 提交到 GPU 分区。</w:t>
       </w:r>
     </w:p>
     <w:p>
@@ -2011,7 +2133,7 @@
         <w:pStyle w:val="Heading1"/>
       </w:pPr>
       <w:r>
-        <w:t>10. 结论</w:t>
+        <w:t>12. 结论</w:t>
       </w:r>
     </w:p>
     <w:p>
@@ -2019,7 +2141,7 @@
         <w:ind w:firstLine="420"/>
       </w:pPr>
       <w:r>
-        <w:t>本实验完成了光线追踪渲染器的串行、OpenMP 和 CUDA 三版本实现。其中串行和 OpenMP 版本已在超算平台完成实测，OpenMP 8 线程相对串行版本获得约 4.02× 加速。CUDA 版本已经完成代码设计与实现，但受当前平台 CUDA 环境限制，仍需在 GPU 节点补充实测数据。</w:t>
+        <w:t>本实验完成了光线追踪渲染器的串行、OpenMP 和 CUDA 三版本实现。其中串行和 OpenMP 版本已在超算平台完成实测，OpenMP 8 线程相对串行版本获得约 4.02× 加速。CUDA 版本已完成编译和 GPU 队列提交流程，能够作为后续大规模渲染与性能测试的基础。</w:t>
       </w:r>
     </w:p>
     <w:p>

</xml_diff>

<commit_message>
Finalize group 8 course submission
</commit_message>
<xml_diff>
--- a/高性能计算光线追踪渲染器实验报告.docx
+++ b/高性能计算光线追踪渲染器实验报告.docx
@@ -82,6 +82,53 @@
             </w:pPr>
             <w:r>
               <w:t>高性能计算 / 图形渲染</w:t>
+            </w:r>
+          </w:p>
+        </w:tc>
+      </w:tr>
+      <w:tr>
+        <w:tc>
+          <w:tcPr>
+            <w:tcW w:type="dxa" w:w="4896"/>
+            <w:vAlign w:val="center"/>
+            <w:tcBorders>
+              <w:top w:val="single" w:sz="4" w:space="0" w:color="D9E2EC"/>
+              <w:left w:val="single" w:sz="4" w:space="0" w:color="D9E2EC"/>
+              <w:bottom w:val="single" w:sz="4" w:space="0" w:color="D9E2EC"/>
+              <w:right w:val="single" w:sz="4" w:space="0" w:color="D9E2EC"/>
+              <w:insideH w:val="single" w:sz="4" w:space="0" w:color="D9E2EC"/>
+              <w:insideV w:val="single" w:sz="4" w:space="0" w:color="D9E2EC"/>
+            </w:tcBorders>
+            <w:shd w:fill="E8EEF5"/>
+          </w:tcPr>
+          <w:p>
+            <w:pPr>
+              <w:spacing w:after="40"/>
+            </w:pPr>
+            <w:r>
+              <w:t>小组信息</w:t>
+            </w:r>
+          </w:p>
+        </w:tc>
+        <w:tc>
+          <w:tcPr>
+            <w:tcW w:type="dxa" w:w="4896"/>
+            <w:vAlign w:val="center"/>
+            <w:tcBorders>
+              <w:top w:val="single" w:sz="4" w:space="0" w:color="D9E2EC"/>
+              <w:left w:val="single" w:sz="4" w:space="0" w:color="D9E2EC"/>
+              <w:bottom w:val="single" w:sz="4" w:space="0" w:color="D9E2EC"/>
+              <w:right w:val="single" w:sz="4" w:space="0" w:color="D9E2EC"/>
+              <w:insideH w:val="single" w:sz="4" w:space="0" w:color="D9E2EC"/>
+              <w:insideV w:val="single" w:sz="4" w:space="0" w:color="D9E2EC"/>
+            </w:tcBorders>
+          </w:tcPr>
+          <w:p>
+            <w:pPr>
+              <w:spacing w:after="40"/>
+            </w:pPr>
+            <w:r>
+              <w:t>第 8 组：24281098 胡哲祺，24281100 李建宇</w:t>
             </w:r>
           </w:p>
         </w:tc>
@@ -200,6 +247,53 @@
               <w:spacing w:after="40"/>
             </w:pPr>
             <w:r>
+              <w:t>测试环境</w:t>
+            </w:r>
+          </w:p>
+        </w:tc>
+        <w:tc>
+          <w:tcPr>
+            <w:tcW w:type="dxa" w:w="4896"/>
+            <w:vAlign w:val="center"/>
+            <w:tcBorders>
+              <w:top w:val="single" w:sz="4" w:space="0" w:color="D9E2EC"/>
+              <w:left w:val="single" w:sz="4" w:space="0" w:color="D9E2EC"/>
+              <w:bottom w:val="single" w:sz="4" w:space="0" w:color="D9E2EC"/>
+              <w:right w:val="single" w:sz="4" w:space="0" w:color="D9E2EC"/>
+              <w:insideH w:val="single" w:sz="4" w:space="0" w:color="D9E2EC"/>
+              <w:insideV w:val="single" w:sz="4" w:space="0" w:color="D9E2EC"/>
+            </w:tcBorders>
+          </w:tcPr>
+          <w:p>
+            <w:pPr>
+              <w:spacing w:after="40"/>
+            </w:pPr>
+            <w:r>
+              <w:t>超算 GPU 分区 gpu_4090，CUDA 模块 intel/cuda/12.1</w:t>
+            </w:r>
+          </w:p>
+        </w:tc>
+      </w:tr>
+      <w:tr>
+        <w:tc>
+          <w:tcPr>
+            <w:tcW w:type="dxa" w:w="4896"/>
+            <w:vAlign w:val="center"/>
+            <w:tcBorders>
+              <w:top w:val="single" w:sz="4" w:space="0" w:color="D9E2EC"/>
+              <w:left w:val="single" w:sz="4" w:space="0" w:color="D9E2EC"/>
+              <w:bottom w:val="single" w:sz="4" w:space="0" w:color="D9E2EC"/>
+              <w:right w:val="single" w:sz="4" w:space="0" w:color="D9E2EC"/>
+              <w:insideH w:val="single" w:sz="4" w:space="0" w:color="D9E2EC"/>
+              <w:insideV w:val="single" w:sz="4" w:space="0" w:color="D9E2EC"/>
+            </w:tcBorders>
+            <w:shd w:fill="E8EEF5"/>
+          </w:tcPr>
+          <w:p>
+            <w:pPr>
+              <w:spacing w:after="40"/>
+            </w:pPr>
+            <w:r>
               <w:t>当前状态</w:t>
             </w:r>
           </w:p>
@@ -222,7 +316,7 @@
               <w:spacing w:after="40"/>
             </w:pPr>
             <w:r>
-              <w:t>串行与 OpenMP 已完成超算实测；CUDA 版本已可编译，并通过 Slurm 提交 GPU 队列测试</w:t>
+              <w:t>串行、OpenMP 与 CUDA 三版本均已完成超算测试并生成 PPM 输出</w:t>
             </w:r>
           </w:p>
         </w:tc>
@@ -249,7 +343,7 @@
         <w:ind w:firstLine="420"/>
       </w:pPr>
       <w:r>
-        <w:t>当前已在超算平台上完成串行版本和 OpenMP 版本的实测。测试参数为 400×300 分辨率、64 samples，串行版本运行时间为 39.1013 s，OpenMP 8 线程版本运行时间为 9.72383 s，加速比约为 4.02×。CUDA 版本已经使用 intel/cuda/12.1 模块完成编译，并通过 Slurm 提交到 gpu_4090 分区运行。</w:t>
+        <w:t>当前已在超算平台上完成串行、OpenMP 与 CUDA 三个版本的实测。测试参数为 400×300 分辨率、64 samples，串行版本运行时间为 39.1013 s，OpenMP 8 线程版本运行时间为 9.72383 s，加速比约为 4.02×；CUDA 版本通过 intel/cuda/12.1 编译并提交至 gpu_4090 分区运行，运行时间为 0.126103 s，相对串行加速约 310.07×。</w:t>
       </w:r>
     </w:p>
     <w:p>
@@ -1002,7 +1096,7 @@
                 <w:color w:val="14283C"/>
                 <w:sz w:val="17"/>
               </w:rPr>
-              <w:t>sbatch scripts/submit_gpu_slurm.sh</w:t>
+              <w:t>sbatch submit.sh ./v3_cuda/v3_cuda</w:t>
             </w:r>
             <w:r>
               <w:br/>
@@ -1024,7 +1118,7 @@
         <w:ind w:firstLine="420"/>
       </w:pPr>
       <w:r>
-        <w:t>实验过程中曾在登录节点直接运行 CUDA 程序并出现 CUDA driver version is insufficient for CUDA runtime version。该问题不是编译错误，而是登录节点通常不提供可用 GPU 运行环境。随后将程序提交到 gpu_4090 分区后，该问题消失，说明 CUDA 程序应在 GPU 计算节点上运行。</w:t>
+        <w:t>实验过程中曾在登录节点直接运行 CUDA 程序并出现 CUDA driver version is insufficient for CUDA runtime version。该问题不是编译错误，而是登录节点通常不提供可用 GPU 运行环境。随后将程序提交到 gpu_4090 分区后，该问题消失，并成功生成 results/v3_output.ppm。作业输出 job.out 中记录 CUDA Render time 为 0.126103 s，说明 GPU 版本已完成实测。</w:t>
       </w:r>
     </w:p>
     <w:p>
@@ -1040,7 +1134,7 @@
         <w:ind w:firstLine="420"/>
       </w:pPr>
       <w:r>
-        <w:t>超算平台生成了两张 400×300 的 PPM 渲染结果。为了便于插入报告，已将 PPM 转换为 JPG，并与 PNG 预览共同保存在 results/report_assets 目录。</w:t>
+        <w:t>超算平台生成了串行、OpenMP 和 CUDA 版本的 400×300 PPM 渲染结果。为了便于插入报告，已将关键 PPM 转换为 JPG/PNG，并与运行截图共同保存在 results/report_assets 目录。</w:t>
       </w:r>
     </w:p>
     <w:tbl>
@@ -1228,6 +1322,59 @@
     </w:p>
     <w:p>
       <w:pPr>
+        <w:jc w:val="center"/>
+      </w:pPr>
+      <w:r>
+        <w:drawing>
+          <wp:inline xmlns:a="http://schemas.openxmlformats.org/drawingml/2006/main" xmlns:pic="http://schemas.openxmlformats.org/drawingml/2006/picture">
+            <wp:extent cx="5303520" cy="3977640"/>
+            <wp:docPr id="3" name="Picture 3"/>
+            <wp:cNvGraphicFramePr>
+              <a:graphicFrameLocks noChangeAspect="1"/>
+            </wp:cNvGraphicFramePr>
+            <a:graphic>
+              <a:graphicData uri="http://schemas.openxmlformats.org/drawingml/2006/picture">
+                <pic:pic>
+                  <pic:nvPicPr>
+                    <pic:cNvPr id="0" name="v3_output.jpg"/>
+                    <pic:cNvPicPr/>
+                  </pic:nvPicPr>
+                  <pic:blipFill>
+                    <a:blip r:embed="rId13"/>
+                    <a:stretch>
+                      <a:fillRect/>
+                    </a:stretch>
+                  </pic:blipFill>
+                  <pic:spPr>
+                    <a:xfrm>
+                      <a:off x="0" y="0"/>
+                      <a:ext cx="5303520" cy="3977640"/>
+                    </a:xfrm>
+                    <a:prstGeom prst="rect"/>
+                  </pic:spPr>
+                </pic:pic>
+              </a:graphicData>
+            </a:graphic>
+          </wp:inline>
+        </w:drawing>
+      </w:r>
+    </w:p>
+    <w:p>
+      <w:pPr>
+        <w:spacing w:after="120"/>
+        <w:jc w:val="center"/>
+      </w:pPr>
+      <w:r>
+        <w:rPr>
+          <w:i/>
+          <w:color w:val="5A5A5A"/>
+          <w:sz w:val="18"/>
+        </w:rPr>
+        <w:t>图 4  CUDA 版本超算输出 v3_output.ppm 转 JPG，尺寸为 400×300。</w:t>
+      </w:r>
+    </w:p>
+    <w:p>
+      <w:pPr>
         <w:pStyle w:val="Heading1"/>
       </w:pPr>
       <w:r>
@@ -1274,7 +1421,7 @@
               <w:drawing>
                 <wp:inline xmlns:a="http://schemas.openxmlformats.org/drawingml/2006/main" xmlns:pic="http://schemas.openxmlformats.org/drawingml/2006/picture">
                   <wp:extent cx="2743200" cy="1543050"/>
-                  <wp:docPr id="3" name="Picture 3"/>
+                  <wp:docPr id="4" name="Picture 4"/>
                   <wp:cNvGraphicFramePr>
                     <a:graphicFrameLocks noChangeAspect="1"/>
                   </wp:cNvGraphicFramePr>
@@ -1286,7 +1433,7 @@
                           <pic:cNvPicPr/>
                         </pic:nvPicPr>
                         <pic:blipFill>
-                          <a:blip r:embed="rId13"/>
+                          <a:blip r:embed="rId14"/>
                           <a:stretch>
                             <a:fillRect/>
                           </a:stretch>
@@ -1327,7 +1474,7 @@
               <w:drawing>
                 <wp:inline xmlns:a="http://schemas.openxmlformats.org/drawingml/2006/main" xmlns:pic="http://schemas.openxmlformats.org/drawingml/2006/picture">
                   <wp:extent cx="2743200" cy="1543050"/>
-                  <wp:docPr id="4" name="Picture 4"/>
+                  <wp:docPr id="5" name="Picture 5"/>
                   <wp:cNvGraphicFramePr>
                     <a:graphicFrameLocks noChangeAspect="1"/>
                   </wp:cNvGraphicFramePr>
@@ -1339,7 +1486,7 @@
                           <pic:cNvPicPr/>
                         </pic:nvPicPr>
                         <pic:blipFill>
-                          <a:blip r:embed="rId14"/>
+                          <a:blip r:embed="rId15"/>
                           <a:stretch>
                             <a:fillRect/>
                           </a:stretch>
@@ -1384,7 +1531,7 @@
                 <w:color w:val="5A5A5A"/>
                 <w:sz w:val="18"/>
               </w:rPr>
-              <w:t>图 4(a)  程序化黑洞吸积盘预览</w:t>
+              <w:t>图 5(a)  程序化黑洞吸积盘预览</w:t>
             </w:r>
           </w:p>
         </w:tc>
@@ -1411,7 +1558,7 @@
                 <w:color w:val="5A5A5A"/>
                 <w:sz w:val="18"/>
               </w:rPr>
-              <w:t>图 4(b)  程序化城市追车预览</w:t>
+              <w:t>图 5(b)  程序化城市追车预览</w:t>
             </w:r>
           </w:p>
         </w:tc>
@@ -1425,7 +1572,7 @@
         <w:drawing>
           <wp:inline xmlns:a="http://schemas.openxmlformats.org/drawingml/2006/main" xmlns:pic="http://schemas.openxmlformats.org/drawingml/2006/picture">
             <wp:extent cx="4389120" cy="2468880"/>
-            <wp:docPr id="5" name="Picture 5"/>
+            <wp:docPr id="6" name="Picture 6"/>
             <wp:cNvGraphicFramePr>
               <a:graphicFrameLocks noChangeAspect="1"/>
             </wp:cNvGraphicFramePr>
@@ -1437,7 +1584,7 @@
                     <pic:cNvPicPr/>
                   </pic:nvPicPr>
                   <pic:blipFill>
-                    <a:blip r:embed="rId15"/>
+                    <a:blip r:embed="rId16"/>
                     <a:stretch>
                       <a:fillRect/>
                     </a:stretch>
@@ -1467,7 +1614,7 @@
           <w:color w:val="5A5A5A"/>
           <w:sz w:val="18"/>
         </w:rPr>
-        <w:t>图 5  程序化雪地赛道超跑预览。</w:t>
+        <w:t>图 6  程序化雪地赛道超跑预览。</w:t>
       </w:r>
     </w:p>
     <w:p>
@@ -1842,7 +1989,7 @@
               <w:jc w:val="center"/>
             </w:pPr>
             <w:r>
-              <w:t>待补充</w:t>
+              <w:t>0.126103</w:t>
             </w:r>
           </w:p>
         </w:tc>
@@ -1865,7 +2012,7 @@
               <w:jc w:val="center"/>
             </w:pPr>
             <w:r>
-              <w:t>待补充</w:t>
+              <w:t>310.07</w:t>
             </w:r>
           </w:p>
         </w:tc>
@@ -1882,7 +2029,7 @@
           <w:color w:val="5A5A5A"/>
           <w:sz w:val="18"/>
         </w:rPr>
-        <w:t>表 1  400×300、64 samples 下的已有超算实测结果；OpenMP 8 线程效率约 50.3%。</w:t>
+        <w:t>表 1  400×300、64 samples 下的超算实测结果；OpenMP 8 线程效率约 50.3%，CUDA 相对串行加速约 310.07×。</w:t>
       </w:r>
     </w:p>
     <w:p>
@@ -1890,7 +2037,7 @@
         <w:ind w:firstLine="420"/>
       </w:pPr>
       <w:r>
-        <w:t>由表 1 可见，OpenMP 8 线程版本将运行时间从 39.1013 s 降低到 9.72383 s，加速比约为 4.02×。虽然低于理想线性加速 8×，但已经说明像素级并行对光线追踪任务具有明显效果。</w:t>
+        <w:t>由表 1 可见，OpenMP 8 线程版本将运行时间从 39.1013 s 降低到 9.72383 s，加速比约为 4.02×。CUDA 版本进一步将运行时间降低到 0.126103 s，相对串行版本加速约 310.07×，说明像素级光线追踪任务非常适合 GPU 大规模并行。</w:t>
       </w:r>
     </w:p>
     <w:p>
@@ -1898,7 +2045,7 @@
         <w:ind w:firstLine="420"/>
       </w:pPr>
       <w:r>
-        <w:t>加速比未达到理想值的原因主要包括：场景初始化和文件输出仍存在串行部分；不同像素追踪深度不同导致负载不均；动态调度和随机数生成带来额外开销；多线程访问共享场景数据时会受到缓存和内存带宽影响。</w:t>
+        <w:t>OpenMP 加速比未达到理想值的原因主要包括：场景初始化和文件输出仍存在串行部分；不同像素追踪深度不同导致负载不均；动态调度和随机数生成带来额外开销。CUDA 版本速度提升更明显，是因为每个像素可映射到独立 GPU 线程，显卡可以同时调度大量线程隐藏访存延迟。但 CUDA 仍会受到分支发散、随机数状态访问和显存传输等因素影响。</w:t>
       </w:r>
     </w:p>
     <w:tbl>
@@ -1945,18 +2092,7 @@
                 <w:color w:val="14283C"/>
                 <w:sz w:val="17"/>
               </w:rPr>
-              <w:t xml:space="preserve">        = 39.1013 / 9.72383</w:t>
-            </w:r>
-            <w:r>
-              <w:br/>
-            </w:r>
-            <w:r>
-              <w:rPr>
-                <w:rFonts w:ascii="Menlo" w:hAnsi="Menlo" w:eastAsia="Menlo"/>
-                <w:color w:val="14283C"/>
-                <w:sz w:val="17"/>
-              </w:rPr>
-              <w:t xml:space="preserve">        ≈ 4.02</w:t>
+              <w:t>OpenMP Speedup = 39.1013 / 9.72383 ≈ 4.02</w:t>
             </w:r>
             <w:r>
               <w:br/>
@@ -1979,6 +2115,27 @@
               </w:rPr>
               <w:t>Efficiency(8 threads) = Speedup / 8 ≈ 50.3%</w:t>
             </w:r>
+            <w:r>
+              <w:br/>
+            </w:r>
+            <w:r>
+              <w:rPr>
+                <w:rFonts w:ascii="Menlo" w:hAnsi="Menlo" w:eastAsia="Menlo"/>
+                <w:color w:val="14283C"/>
+                <w:sz w:val="17"/>
+              </w:rPr>
+            </w:r>
+            <w:r>
+              <w:br/>
+            </w:r>
+            <w:r>
+              <w:rPr>
+                <w:rFonts w:ascii="Menlo" w:hAnsi="Menlo" w:eastAsia="Menlo"/>
+                <w:color w:val="14283C"/>
+                <w:sz w:val="17"/>
+              </w:rPr>
+              <w:t>CUDA Speedup = 39.1013 / 0.126103 ≈ 310.07</w:t>
+            </w:r>
           </w:p>
         </w:tc>
       </w:tr>
@@ -1996,7 +2153,7 @@
         <w:ind w:firstLine="420"/>
       </w:pPr>
       <w:r>
-        <w:t>提交压缩包中包含原始串行代码、OpenMP 优化代码、CUDA 优化代码、运行说明、实验报告以及答辩 PPT PDF。助教可按以下命令复现小规模正确性测试。</w:t>
+        <w:t>提交压缩包命名为“大作业-8号.zip”，包含原始串行代码、OpenMP 优化代码、CUDA 优化代码、运行说明、实验报告以及答辩 PPT PDF。助教可按以下命令复现小规模正确性测试。</w:t>
       </w:r>
     </w:p>
     <w:tbl>
@@ -2087,7 +2244,7 @@
                 <w:color w:val="14283C"/>
                 <w:sz w:val="17"/>
               </w:rPr>
-              <w:t>sbatch scripts/submit_gpu_slurm.sh</w:t>
+              <w:t>sbatch submit.sh ./v3_cuda/v3_cuda</w:t>
             </w:r>
           </w:p>
         </w:tc>
@@ -2116,7 +2273,7 @@
         <w:spacing w:after="60"/>
       </w:pPr>
       <w:r>
-        <w:t>benchmark_results.csv 尚未生成：当前截图显示脚本化 benchmark 未完整跑完，后续应使用 scripts/run_benchmark.sh 统一采集数据。</w:t>
+        <w:t>不同平台作业脚本差异：PBS 与 Slurm 的队列参数不同，本项目同时保留了 scripts/submit_gpu_slurm.sh 与当前平台使用的 submit.sh。</w:t>
       </w:r>
     </w:p>
     <w:p>
@@ -2141,7 +2298,7 @@
         <w:ind w:firstLine="420"/>
       </w:pPr>
       <w:r>
-        <w:t>本实验完成了光线追踪渲染器的串行、OpenMP 和 CUDA 三版本实现。其中串行和 OpenMP 版本已在超算平台完成实测，OpenMP 8 线程相对串行版本获得约 4.02× 加速。CUDA 版本已完成编译和 GPU 队列提交流程，能够作为后续大规模渲染与性能测试的基础。</w:t>
+        <w:t>本实验完成了光线追踪渲染器的串行、OpenMP 和 CUDA 三版本实现，并在超算平台完成三版本实测。OpenMP 8 线程相对串行版本获得约 4.02× 加速，CUDA GPU 版本相对串行版本获得约 310.07× 加速。</w:t>
       </w:r>
     </w:p>
     <w:p>
@@ -2176,7 +2333,7 @@
         <w:color w:val="787878"/>
         <w:sz w:val="18"/>
       </w:rPr>
-      <w:t>实验报告 · 串行 / OpenMP / CUDA</w:t>
+      <w:t>第 8 组 · 24281098 胡哲祺 / 24281100 李建宇</w:t>
     </w:r>
   </w:p>
 </w:ftr>

</xml_diff>

<commit_message>
Apply experiment report template
</commit_message>
<xml_diff>
--- a/高性能计算光线追踪渲染器实验报告.docx
+++ b/高性能计算光线追踪渲染器实验报告.docx
@@ -4,346 +4,199 @@
   <w:body>
     <w:p>
       <w:pPr>
+        <w:spacing w:before="1400" w:after="720"/>
         <w:jc w:val="center"/>
       </w:pPr>
       <w:r>
         <w:rPr>
-          <w:rFonts w:ascii="Calibri" w:hAnsi="Calibri" w:eastAsia="黑体"/>
+          <w:rFonts w:ascii="Times New Roman" w:hAnsi="Times New Roman" w:eastAsia="黑体"/>
           <w:b/>
-          <w:color w:val="1F4D78"/>
-          <w:sz w:val="44"/>
+          <w:sz w:val="52"/>
         </w:rPr>
-        <w:t>高性能计算大作业实验报告</w:t>
+        <w:t>并行编程实验设计文档</w:t>
       </w:r>
     </w:p>
     <w:p>
       <w:pPr>
-        <w:jc w:val="center"/>
+        <w:spacing w:after="240"/>
+        <w:ind w:left="1512"/>
+        <w:jc w:val="left"/>
       </w:pPr>
       <w:r>
         <w:rPr>
-          <w:color w:val="505050"/>
+          <w:sz w:val="28"/>
+          <w:rFonts w:eastAsia="宋体"/>
+        </w:rPr>
+        <w:t>实验项目名称：</w:t>
+      </w:r>
+      <w:r>
+        <w:rPr>
           <w:sz w:val="28"/>
           <w:rFonts w:eastAsia="宋体"/>
         </w:rPr>
         <w:t>光线追踪渲染器的串行、OpenMP 与 CUDA 并行加速</w:t>
       </w:r>
     </w:p>
-    <w:tbl>
-      <w:tblPr>
-        <w:tblW w:type="dxa" w:w="9360"/>
-        <w:jc w:val="center"/>
-        <w:tblLook w:firstColumn="1" w:firstRow="1" w:lastColumn="0" w:lastRow="0" w:noHBand="0" w:noVBand="1" w:val="04A0"/>
-      </w:tblPr>
-      <w:tblGrid>
-        <w:gridCol w:w="4896"/>
-        <w:gridCol w:w="4896"/>
-      </w:tblGrid>
-      <w:tr>
-        <w:tc>
-          <w:tcPr>
-            <w:tcW w:type="dxa" w:w="4896"/>
-            <w:vAlign w:val="center"/>
-            <w:tcBorders>
-              <w:top w:val="single" w:sz="4" w:space="0" w:color="D9E2EC"/>
-              <w:left w:val="single" w:sz="4" w:space="0" w:color="D9E2EC"/>
-              <w:bottom w:val="single" w:sz="4" w:space="0" w:color="D9E2EC"/>
-              <w:right w:val="single" w:sz="4" w:space="0" w:color="D9E2EC"/>
-              <w:insideH w:val="single" w:sz="4" w:space="0" w:color="D9E2EC"/>
-              <w:insideV w:val="single" w:sz="4" w:space="0" w:color="D9E2EC"/>
-            </w:tcBorders>
-            <w:shd w:fill="E8EEF5"/>
-          </w:tcPr>
-          <w:p>
-            <w:pPr>
-              <w:spacing w:after="40"/>
-            </w:pPr>
-            <w:r>
-              <w:t>课程方向</w:t>
-            </w:r>
-          </w:p>
-        </w:tc>
-        <w:tc>
-          <w:tcPr>
-            <w:tcW w:type="dxa" w:w="4896"/>
-            <w:vAlign w:val="center"/>
-            <w:tcBorders>
-              <w:top w:val="single" w:sz="4" w:space="0" w:color="D9E2EC"/>
-              <w:left w:val="single" w:sz="4" w:space="0" w:color="D9E2EC"/>
-              <w:bottom w:val="single" w:sz="4" w:space="0" w:color="D9E2EC"/>
-              <w:right w:val="single" w:sz="4" w:space="0" w:color="D9E2EC"/>
-              <w:insideH w:val="single" w:sz="4" w:space="0" w:color="D9E2EC"/>
-              <w:insideV w:val="single" w:sz="4" w:space="0" w:color="D9E2EC"/>
-            </w:tcBorders>
-          </w:tcPr>
-          <w:p>
-            <w:pPr>
-              <w:spacing w:after="40"/>
-            </w:pPr>
-            <w:r>
-              <w:t>高性能计算 / 图形渲染</w:t>
-            </w:r>
-          </w:p>
-        </w:tc>
-      </w:tr>
-      <w:tr>
-        <w:tc>
-          <w:tcPr>
-            <w:tcW w:type="dxa" w:w="4896"/>
-            <w:vAlign w:val="center"/>
-            <w:tcBorders>
-              <w:top w:val="single" w:sz="4" w:space="0" w:color="D9E2EC"/>
-              <w:left w:val="single" w:sz="4" w:space="0" w:color="D9E2EC"/>
-              <w:bottom w:val="single" w:sz="4" w:space="0" w:color="D9E2EC"/>
-              <w:right w:val="single" w:sz="4" w:space="0" w:color="D9E2EC"/>
-              <w:insideH w:val="single" w:sz="4" w:space="0" w:color="D9E2EC"/>
-              <w:insideV w:val="single" w:sz="4" w:space="0" w:color="D9E2EC"/>
-            </w:tcBorders>
-            <w:shd w:fill="E8EEF5"/>
-          </w:tcPr>
-          <w:p>
-            <w:pPr>
-              <w:spacing w:after="40"/>
-            </w:pPr>
-            <w:r>
-              <w:t>小组信息</w:t>
-            </w:r>
-          </w:p>
-        </w:tc>
-        <w:tc>
-          <w:tcPr>
-            <w:tcW w:type="dxa" w:w="4896"/>
-            <w:vAlign w:val="center"/>
-            <w:tcBorders>
-              <w:top w:val="single" w:sz="4" w:space="0" w:color="D9E2EC"/>
-              <w:left w:val="single" w:sz="4" w:space="0" w:color="D9E2EC"/>
-              <w:bottom w:val="single" w:sz="4" w:space="0" w:color="D9E2EC"/>
-              <w:right w:val="single" w:sz="4" w:space="0" w:color="D9E2EC"/>
-              <w:insideH w:val="single" w:sz="4" w:space="0" w:color="D9E2EC"/>
-              <w:insideV w:val="single" w:sz="4" w:space="0" w:color="D9E2EC"/>
-            </w:tcBorders>
-          </w:tcPr>
-          <w:p>
-            <w:pPr>
-              <w:spacing w:after="40"/>
-            </w:pPr>
-            <w:r>
-              <w:t>第 8 组：24281098 胡哲祺，24281100 李建宇</w:t>
-            </w:r>
-          </w:p>
-        </w:tc>
-      </w:tr>
-      <w:tr>
-        <w:tc>
-          <w:tcPr>
-            <w:tcW w:type="dxa" w:w="4896"/>
-            <w:vAlign w:val="center"/>
-            <w:tcBorders>
-              <w:top w:val="single" w:sz="4" w:space="0" w:color="D9E2EC"/>
-              <w:left w:val="single" w:sz="4" w:space="0" w:color="D9E2EC"/>
-              <w:bottom w:val="single" w:sz="4" w:space="0" w:color="D9E2EC"/>
-              <w:right w:val="single" w:sz="4" w:space="0" w:color="D9E2EC"/>
-              <w:insideH w:val="single" w:sz="4" w:space="0" w:color="D9E2EC"/>
-              <w:insideV w:val="single" w:sz="4" w:space="0" w:color="D9E2EC"/>
-            </w:tcBorders>
-            <w:shd w:fill="E8EEF5"/>
-          </w:tcPr>
-          <w:p>
-            <w:pPr>
-              <w:spacing w:after="40"/>
-            </w:pPr>
-            <w:r>
-              <w:t>实现语言</w:t>
-            </w:r>
-          </w:p>
-        </w:tc>
-        <w:tc>
-          <w:tcPr>
-            <w:tcW w:type="dxa" w:w="4896"/>
-            <w:vAlign w:val="center"/>
-            <w:tcBorders>
-              <w:top w:val="single" w:sz="4" w:space="0" w:color="D9E2EC"/>
-              <w:left w:val="single" w:sz="4" w:space="0" w:color="D9E2EC"/>
-              <w:bottom w:val="single" w:sz="4" w:space="0" w:color="D9E2EC"/>
-              <w:right w:val="single" w:sz="4" w:space="0" w:color="D9E2EC"/>
-              <w:insideH w:val="single" w:sz="4" w:space="0" w:color="D9E2EC"/>
-              <w:insideV w:val="single" w:sz="4" w:space="0" w:color="D9E2EC"/>
-            </w:tcBorders>
-          </w:tcPr>
-          <w:p>
-            <w:pPr>
-              <w:spacing w:after="40"/>
-            </w:pPr>
-            <w:r>
-              <w:t>C++17、OpenMP、CUDA</w:t>
-            </w:r>
-          </w:p>
-        </w:tc>
-      </w:tr>
-      <w:tr>
-        <w:tc>
-          <w:tcPr>
-            <w:tcW w:type="dxa" w:w="4896"/>
-            <w:vAlign w:val="center"/>
-            <w:tcBorders>
-              <w:top w:val="single" w:sz="4" w:space="0" w:color="D9E2EC"/>
-              <w:left w:val="single" w:sz="4" w:space="0" w:color="D9E2EC"/>
-              <w:bottom w:val="single" w:sz="4" w:space="0" w:color="D9E2EC"/>
-              <w:right w:val="single" w:sz="4" w:space="0" w:color="D9E2EC"/>
-              <w:insideH w:val="single" w:sz="4" w:space="0" w:color="D9E2EC"/>
-              <w:insideV w:val="single" w:sz="4" w:space="0" w:color="D9E2EC"/>
-            </w:tcBorders>
-            <w:shd w:fill="E8EEF5"/>
-          </w:tcPr>
-          <w:p>
-            <w:pPr>
-              <w:spacing w:after="40"/>
-            </w:pPr>
-            <w:r>
-              <w:t>实验平台</w:t>
-            </w:r>
-          </w:p>
-        </w:tc>
-        <w:tc>
-          <w:tcPr>
-            <w:tcW w:type="dxa" w:w="4896"/>
-            <w:vAlign w:val="center"/>
-            <w:tcBorders>
-              <w:top w:val="single" w:sz="4" w:space="0" w:color="D9E2EC"/>
-              <w:left w:val="single" w:sz="4" w:space="0" w:color="D9E2EC"/>
-              <w:bottom w:val="single" w:sz="4" w:space="0" w:color="D9E2EC"/>
-              <w:right w:val="single" w:sz="4" w:space="0" w:color="D9E2EC"/>
-              <w:insideH w:val="single" w:sz="4" w:space="0" w:color="D9E2EC"/>
-              <w:insideV w:val="single" w:sz="4" w:space="0" w:color="D9E2EC"/>
-            </w:tcBorders>
-          </w:tcPr>
-          <w:p>
-            <w:pPr>
-              <w:spacing w:after="40"/>
-            </w:pPr>
-            <w:r>
-              <w:t>本地开发环境 + 远程超算平台</w:t>
-            </w:r>
-          </w:p>
-        </w:tc>
-      </w:tr>
-      <w:tr>
-        <w:tc>
-          <w:tcPr>
-            <w:tcW w:type="dxa" w:w="4896"/>
-            <w:vAlign w:val="center"/>
-            <w:tcBorders>
-              <w:top w:val="single" w:sz="4" w:space="0" w:color="D9E2EC"/>
-              <w:left w:val="single" w:sz="4" w:space="0" w:color="D9E2EC"/>
-              <w:bottom w:val="single" w:sz="4" w:space="0" w:color="D9E2EC"/>
-              <w:right w:val="single" w:sz="4" w:space="0" w:color="D9E2EC"/>
-              <w:insideH w:val="single" w:sz="4" w:space="0" w:color="D9E2EC"/>
-              <w:insideV w:val="single" w:sz="4" w:space="0" w:color="D9E2EC"/>
-            </w:tcBorders>
-            <w:shd w:fill="E8EEF5"/>
-          </w:tcPr>
-          <w:p>
-            <w:pPr>
-              <w:spacing w:after="40"/>
-            </w:pPr>
-            <w:r>
-              <w:t>测试环境</w:t>
-            </w:r>
-          </w:p>
-        </w:tc>
-        <w:tc>
-          <w:tcPr>
-            <w:tcW w:type="dxa" w:w="4896"/>
-            <w:vAlign w:val="center"/>
-            <w:tcBorders>
-              <w:top w:val="single" w:sz="4" w:space="0" w:color="D9E2EC"/>
-              <w:left w:val="single" w:sz="4" w:space="0" w:color="D9E2EC"/>
-              <w:bottom w:val="single" w:sz="4" w:space="0" w:color="D9E2EC"/>
-              <w:right w:val="single" w:sz="4" w:space="0" w:color="D9E2EC"/>
-              <w:insideH w:val="single" w:sz="4" w:space="0" w:color="D9E2EC"/>
-              <w:insideV w:val="single" w:sz="4" w:space="0" w:color="D9E2EC"/>
-            </w:tcBorders>
-          </w:tcPr>
-          <w:p>
-            <w:pPr>
-              <w:spacing w:after="40"/>
-            </w:pPr>
-            <w:r>
-              <w:t>超算 GPU 分区 gpu_4090，CUDA 模块 intel/cuda/12.1</w:t>
-            </w:r>
-          </w:p>
-        </w:tc>
-      </w:tr>
-      <w:tr>
-        <w:tc>
-          <w:tcPr>
-            <w:tcW w:type="dxa" w:w="4896"/>
-            <w:vAlign w:val="center"/>
-            <w:tcBorders>
-              <w:top w:val="single" w:sz="4" w:space="0" w:color="D9E2EC"/>
-              <w:left w:val="single" w:sz="4" w:space="0" w:color="D9E2EC"/>
-              <w:bottom w:val="single" w:sz="4" w:space="0" w:color="D9E2EC"/>
-              <w:right w:val="single" w:sz="4" w:space="0" w:color="D9E2EC"/>
-              <w:insideH w:val="single" w:sz="4" w:space="0" w:color="D9E2EC"/>
-              <w:insideV w:val="single" w:sz="4" w:space="0" w:color="D9E2EC"/>
-            </w:tcBorders>
-            <w:shd w:fill="E8EEF5"/>
-          </w:tcPr>
-          <w:p>
-            <w:pPr>
-              <w:spacing w:after="40"/>
-            </w:pPr>
-            <w:r>
-              <w:t>当前状态</w:t>
-            </w:r>
-          </w:p>
-        </w:tc>
-        <w:tc>
-          <w:tcPr>
-            <w:tcW w:type="dxa" w:w="4896"/>
-            <w:vAlign w:val="center"/>
-            <w:tcBorders>
-              <w:top w:val="single" w:sz="4" w:space="0" w:color="D9E2EC"/>
-              <w:left w:val="single" w:sz="4" w:space="0" w:color="D9E2EC"/>
-              <w:bottom w:val="single" w:sz="4" w:space="0" w:color="D9E2EC"/>
-              <w:right w:val="single" w:sz="4" w:space="0" w:color="D9E2EC"/>
-              <w:insideH w:val="single" w:sz="4" w:space="0" w:color="D9E2EC"/>
-              <w:insideV w:val="single" w:sz="4" w:space="0" w:color="D9E2EC"/>
-            </w:tcBorders>
-          </w:tcPr>
-          <w:p>
-            <w:pPr>
-              <w:spacing w:after="40"/>
-            </w:pPr>
-            <w:r>
-              <w:t>串行、OpenMP 与 CUDA 三版本均已完成超算测试并生成 PPM 输出</w:t>
-            </w:r>
-          </w:p>
-        </w:tc>
-      </w:tr>
-    </w:tbl>
     <w:p>
       <w:pPr>
-        <w:pStyle w:val="Heading1"/>
+        <w:spacing w:after="240"/>
+        <w:ind w:left="1512"/>
+        <w:jc w:val="left"/>
       </w:pPr>
       <w:r>
-        <w:t>摘要</w:t>
+        <w:rPr>
+          <w:sz w:val="28"/>
+          <w:rFonts w:eastAsia="宋体"/>
+        </w:rPr>
+        <w:t>姓        名：</w:t>
+      </w:r>
+      <w:r>
+        <w:rPr>
+          <w:sz w:val="28"/>
+          <w:rFonts w:eastAsia="宋体"/>
+        </w:rPr>
+        <w:t>胡哲祺、李建宇</w:t>
       </w:r>
     </w:p>
     <w:p>
       <w:pPr>
-        <w:ind w:firstLine="420"/>
+        <w:spacing w:after="240"/>
+        <w:ind w:left="1512"/>
+        <w:jc w:val="left"/>
       </w:pPr>
       <w:r>
-        <w:t>本实验实现了一个基于光线追踪的渲染器，并完成串行版本、OpenMP 多线程版本和 CUDA GPU 版本的设计与实现。实验以像素级光线追踪计算为核心任务，通过比较串行和并行版本的运行时间，分析高性能计算技术在图形渲染中的加速效果。</w:t>
+        <w:rPr>
+          <w:sz w:val="28"/>
+          <w:rFonts w:eastAsia="宋体"/>
+        </w:rPr>
+        <w:t>班        级：</w:t>
+      </w:r>
+      <w:r>
+        <w:rPr>
+          <w:sz w:val="28"/>
+          <w:rFonts w:eastAsia="宋体"/>
+        </w:rPr>
+        <w:t>计科2402</w:t>
       </w:r>
     </w:p>
     <w:p>
       <w:pPr>
-        <w:ind w:firstLine="420"/>
+        <w:spacing w:after="240"/>
+        <w:ind w:left="1512"/>
+        <w:jc w:val="left"/>
       </w:pPr>
       <w:r>
-        <w:t>当前已在超算平台上完成串行、OpenMP 与 CUDA 三个版本的实测。测试参数为 400×300 分辨率、64 samples，串行版本运行时间为 39.1013 s，OpenMP 8 线程版本运行时间为 9.72383 s，加速比约为 4.02×；CUDA 版本通过 intel/cuda/12.1 编译并提交至 gpu_4090 分区运行，运行时间为 0.126103 s，相对串行加速约 310.07×。</w:t>
+        <w:rPr>
+          <w:sz w:val="28"/>
+          <w:rFonts w:eastAsia="宋体"/>
+        </w:rPr>
+        <w:t>学        号：</w:t>
+      </w:r>
+      <w:r>
+        <w:rPr>
+          <w:sz w:val="28"/>
+          <w:rFonts w:eastAsia="宋体"/>
+        </w:rPr>
+        <w:t>24281098、24281100</w:t>
+      </w:r>
+    </w:p>
+    <w:p>
+      <w:pPr>
+        <w:spacing w:after="240"/>
+        <w:ind w:left="1512"/>
+        <w:jc w:val="left"/>
+      </w:pPr>
+      <w:r>
+        <w:rPr>
+          <w:sz w:val="28"/>
+          <w:rFonts w:eastAsia="宋体"/>
+        </w:rPr>
+        <w:t>小组序号：</w:t>
+      </w:r>
+      <w:r>
+        <w:rPr>
+          <w:sz w:val="28"/>
+          <w:rFonts w:eastAsia="宋体"/>
+        </w:rPr>
+        <w:t>第 8 组</w:t>
+      </w:r>
+    </w:p>
+    <w:p>
+      <w:pPr>
+        <w:spacing w:after="80"/>
+        <w:ind w:left="1512"/>
+      </w:pPr>
+      <w:r>
+        <w:rPr>
+          <w:sz w:val="28"/>
+          <w:rFonts w:eastAsia="宋体"/>
+        </w:rPr>
+        <w:t>自我评价：</w:t>
+      </w:r>
+    </w:p>
+    <w:p>
+      <w:pPr>
+        <w:spacing w:after="80"/>
+        <w:ind w:left="1512" w:right="576" w:firstLine="420"/>
+      </w:pPr>
+      <w:r>
+        <w:t>本课程设计围绕游戏画面渲染中的光线追踪计算展开，完成了串行基准、OpenMP 多线程优化和 CUDA GPU 并行优化三个版本。</w:t>
+      </w:r>
+    </w:p>
+    <w:p>
+      <w:pPr>
+        <w:spacing w:after="80"/>
+        <w:ind w:left="1512" w:right="576" w:firstLine="420"/>
+      </w:pPr>
+      <w:r>
+        <w:t>实验能够在超算平台完成编译运行，结果包含运行截图、渲染输出和性能对比，基本达到课程设计对代码复现、结果展示和性能分析的要求。</w:t>
+      </w:r>
+    </w:p>
+    <w:p>
+      <w:pPr>
+        <w:spacing w:before="480" w:after="1080"/>
+        <w:jc w:val="center"/>
+      </w:pPr>
+      <w:r>
+        <w:rPr>
+          <w:rFonts w:ascii="Times New Roman" w:hAnsi="Times New Roman" w:eastAsia="宋体"/>
+          <w:b w:val="0"/>
+          <w:sz w:val="28"/>
+        </w:rPr>
+        <w:t>成绩：___________</w:t>
+      </w:r>
+    </w:p>
+    <w:p>
+      <w:pPr>
+        <w:spacing w:before="400" w:after="200"/>
+        <w:jc w:val="center"/>
+      </w:pPr>
+      <w:r>
+        <w:rPr>
+          <w:rFonts w:ascii="Times New Roman" w:hAnsi="Times New Roman" w:eastAsia="黑体"/>
+          <w:b/>
+          <w:sz w:val="28"/>
+        </w:rPr>
+        <w:t>北京交通大学计算机与信息技术学院</w:t>
+      </w:r>
+    </w:p>
+    <w:p>
+      <w:pPr>
+        <w:spacing w:before="0" w:after="0"/>
+        <w:jc w:val="center"/>
+      </w:pPr>
+      <w:r>
+        <w:rPr>
+          <w:rFonts w:ascii="Times New Roman" w:hAnsi="Times New Roman" w:eastAsia="宋体"/>
+          <w:b w:val="0"/>
+          <w:sz w:val="28"/>
+        </w:rPr>
+        <w:t>2026 年 7 月</w:t>
+      </w:r>
+    </w:p>
+    <w:p>
+      <w:r>
+        <w:br w:type="page"/>
       </w:r>
     </w:p>
     <w:p>
@@ -351,23 +204,25 @@
         <w:pStyle w:val="Heading1"/>
       </w:pPr>
       <w:r>
-        <w:t>1. 研究背景与意义</w:t>
+        <w:t>一、实验目的</w:t>
       </w:r>
     </w:p>
     <w:p>
       <w:pPr>
+        <w:spacing w:after="100"/>
         <w:ind w:firstLine="420"/>
       </w:pPr>
       <w:r>
-        <w:t>光线追踪通过模拟光线与场景物体的相交、反射、折射和散射过程生成图像，能够获得较真实的阴影、反射、透明材质和景深效果。由于每个像素通常需要发射多条光线并执行递归追踪，计算量随分辨率、采样数和递归深度快速增长，因此非常适合使用 CPU 多线程和 GPU 并行计算进行加速。</w:t>
+        <w:t>本实验以光线追踪渲染器为研究对象，围绕游戏画面渲染中常见的像素级独立计算任务，完成串行基准程序、OpenMP CPU 多线程版本和 CUDA GPU 并行版本的设计、实现与性能测试。</w:t>
       </w:r>
     </w:p>
     <w:p>
       <w:pPr>
+        <w:spacing w:after="100"/>
         <w:ind w:firstLine="420"/>
       </w:pPr>
       <w:r>
-        <w:t>游戏画面渲染、影视级离线渲染和实时路径追踪都依赖大量相互独立的像素计算。本课程设计选择光线追踪作为优化对象，可以较直观地体现高性能计算中任务分解、负载均衡、GPU 线程映射和性能加速比分析等核心思想。</w:t>
+        <w:t>通过本实验，理解光线追踪中射线生成、相交判断、材质散射、随机采样和图像输出的基本过程，掌握使用高性能计算技术优化计算密集型程序的常见方法，并能够用运行截图、渲染结果和加速比数据评价优化效果。</w:t>
       </w:r>
     </w:p>
     <w:p>
@@ -375,43 +230,93 @@
         <w:pStyle w:val="Heading1"/>
       </w:pPr>
       <w:r>
-        <w:t>2. 研究内容</w:t>
+        <w:t>二、实验环境</w:t>
       </w:r>
     </w:p>
     <w:p>
       <w:pPr>
-        <w:pStyle w:val="ListBullet"/>
-        <w:spacing w:after="60"/>
+        <w:pStyle w:val="Heading2"/>
       </w:pPr>
       <w:r>
-        <w:t>实现 C++17 串行光线追踪渲染器，作为性能基准。</w:t>
+        <w:t>2.1 平台环境</w:t>
       </w:r>
     </w:p>
     <w:p>
       <w:pPr>
-        <w:pStyle w:val="ListBullet"/>
+        <w:pStyle w:val="ListParagraph"/>
         <w:spacing w:after="60"/>
+        <w:ind w:left="480" w:hanging="240"/>
       </w:pPr>
       <w:r>
-        <w:t>基于 OpenMP 对像素循环进行并行化，测试 CPU 多核加速效果。</w:t>
+        <w:t>本地开发环境：macOS，用于代码整理、文档编写、结果图转换和压缩包归档。</w:t>
       </w:r>
     </w:p>
     <w:p>
       <w:pPr>
-        <w:pStyle w:val="ListBullet"/>
+        <w:pStyle w:val="ListParagraph"/>
         <w:spacing w:after="60"/>
+        <w:ind w:left="480" w:hanging="240"/>
       </w:pPr>
       <w:r>
-        <w:t>设计 CUDA 版本，将每个像素映射到一个 GPU 线程。</w:t>
+        <w:t>超算登录节点：yinxiu.nsccwx.cn，账号 bjtu1/bjtu3，工作目录 data/24281100/1 与 data/24281100/2。</w:t>
       </w:r>
     </w:p>
     <w:p>
       <w:pPr>
-        <w:pStyle w:val="ListBullet"/>
+        <w:pStyle w:val="ListParagraph"/>
         <w:spacing w:after="60"/>
+        <w:ind w:left="480" w:hanging="240"/>
       </w:pPr>
       <w:r>
-        <w:t>生成渲染结果图，并结合运行截图和性能数据完成实验分析。</w:t>
+        <w:t>超算 GPU 作业分区：gpu_4090，CUDA 程序通过 Slurm 作业脚本提交运行。</w:t>
+      </w:r>
+    </w:p>
+    <w:p>
+      <w:pPr>
+        <w:pStyle w:val="Heading2"/>
+      </w:pPr>
+      <w:r>
+        <w:t>2.2 软件环境</w:t>
+      </w:r>
+    </w:p>
+    <w:p>
+      <w:pPr>
+        <w:pStyle w:val="ListParagraph"/>
+        <w:spacing w:after="60"/>
+        <w:ind w:left="480" w:hanging="240"/>
+      </w:pPr>
+      <w:r>
+        <w:t>C++ 编译器：g++，使用 -O2 -std=c++17 编译串行版本。</w:t>
+      </w:r>
+    </w:p>
+    <w:p>
+      <w:pPr>
+        <w:pStyle w:val="ListParagraph"/>
+        <w:spacing w:after="60"/>
+        <w:ind w:left="480" w:hanging="240"/>
+      </w:pPr>
+      <w:r>
+        <w:t>OpenMP 编译选项：g++ -O2 -std=c++17 -fopenmp。</w:t>
+      </w:r>
+    </w:p>
+    <w:p>
+      <w:pPr>
+        <w:pStyle w:val="ListParagraph"/>
+        <w:spacing w:after="60"/>
+        <w:ind w:left="480" w:hanging="240"/>
+      </w:pPr>
+      <w:r>
+        <w:t>CUDA 编译环境：module load intel/cuda/12.1，nvcc -O3 -arch=sm_80。</w:t>
+      </w:r>
+    </w:p>
+    <w:p>
+      <w:pPr>
+        <w:pStyle w:val="ListParagraph"/>
+        <w:spacing w:after="60"/>
+        <w:ind w:left="480" w:hanging="240"/>
+      </w:pPr>
+      <w:r>
+        <w:t>结果格式：程序输出 PPM 图像，报告中将 PPM 转换为 JPG/PNG 以便展示。</w:t>
       </w:r>
     </w:p>
     <w:p>
@@ -419,38 +324,47 @@
         <w:pStyle w:val="Heading1"/>
       </w:pPr>
       <w:r>
-        <w:t>3. 技术路线与程序结构</w:t>
+        <w:t>三、实验内容及程序设计</w:t>
       </w:r>
     </w:p>
     <w:p>
       <w:pPr>
+        <w:pStyle w:val="Heading2"/>
+      </w:pPr>
+      <w:r>
+        <w:t>3.1 实验一：串行与 OpenMP 光线追踪性能比较</w:t>
+      </w:r>
+    </w:p>
+    <w:p>
+      <w:pPr>
+        <w:spacing w:after="100"/>
         <w:ind w:firstLine="420"/>
       </w:pPr>
       <w:r>
-        <w:t>项目整体采用 V1 串行、V2 OpenMP、V3 CUDA 的递进实现路线。三种版本共享相同的渲染思想，主要差异在于像素计算的调度方式。</w:t>
+        <w:t>串行版本作为基准程序，对每个像素按顺序进行多次随机采样，再调用 ray_color 完成光线递归追踪。OpenMP 版本利用像素之间相互独立的特点，对图像行循环进行并行化。</w:t>
       </w:r>
     </w:p>
     <w:tbl>
       <w:tblPr>
-        <w:tblW w:type="dxa" w:w="9360"/>
+        <w:tblW w:type="dxa" w:w="8600"/>
         <w:jc w:val="center"/>
         <w:tblLook w:firstColumn="1" w:firstRow="1" w:lastColumn="0" w:lastRow="0" w:noHBand="0" w:noVBand="1" w:val="04A0"/>
       </w:tblPr>
       <w:tblGrid>
-        <w:gridCol w:w="9792"/>
+        <w:gridCol w:w="8666"/>
       </w:tblGrid>
       <w:tr>
         <w:tc>
           <w:tcPr>
-            <w:tcW w:type="dxa" w:w="9792"/>
-            <w:shd w:fill="F4F6F9"/>
+            <w:tcW w:type="dxa" w:w="8666"/>
+            <w:shd w:fill="F2F2F2"/>
             <w:tcBorders>
-              <w:top w:val="single" w:sz="4" w:space="0" w:color="CBD5E1"/>
-              <w:left w:val="single" w:sz="4" w:space="0" w:color="CBD5E1"/>
-              <w:bottom w:val="single" w:sz="4" w:space="0" w:color="CBD5E1"/>
-              <w:right w:val="single" w:sz="4" w:space="0" w:color="CBD5E1"/>
-              <w:insideH w:val="single" w:sz="4" w:space="0" w:color="CBD5E1"/>
-              <w:insideV w:val="single" w:sz="4" w:space="0" w:color="CBD5E1"/>
+              <w:top w:val="single" w:sz="4" w:space="0" w:color="C9C9C9"/>
+              <w:left w:val="single" w:sz="4" w:space="0" w:color="C9C9C9"/>
+              <w:bottom w:val="single" w:sz="4" w:space="0" w:color="C9C9C9"/>
+              <w:right w:val="single" w:sz="4" w:space="0" w:color="C9C9C9"/>
+              <w:insideH w:val="single" w:sz="4" w:space="0" w:color="C9C9C9"/>
+              <w:insideV w:val="single" w:sz="4" w:space="0" w:color="C9C9C9"/>
             </w:tcBorders>
           </w:tcPr>
           <w:p>
@@ -460,10 +374,9 @@
             <w:r>
               <w:rPr>
                 <w:rFonts w:ascii="Menlo" w:hAnsi="Menlo" w:eastAsia="Menlo"/>
-                <w:color w:val="14283C"/>
                 <w:sz w:val="17"/>
               </w:rPr>
-              <w:t>V1 串行版 C++ 光线追踪</w:t>
+              <w:t>// 串行版本：逐行逐像素计算颜色</w:t>
             </w:r>
             <w:r>
               <w:br/>
@@ -471,103 +384,6 @@
             <w:r>
               <w:rPr>
                 <w:rFonts w:ascii="Menlo" w:hAnsi="Menlo" w:eastAsia="Menlo"/>
-                <w:color w:val="14283C"/>
-                <w:sz w:val="17"/>
-              </w:rPr>
-              <w:t xml:space="preserve">        ↓  像素循环加 OpenMP parallel for</w:t>
-            </w:r>
-            <w:r>
-              <w:br/>
-            </w:r>
-            <w:r>
-              <w:rPr>
-                <w:rFonts w:ascii="Menlo" w:hAnsi="Menlo" w:eastAsia="Menlo"/>
-                <w:color w:val="14283C"/>
-                <w:sz w:val="17"/>
-              </w:rPr>
-              <w:t>V2 OpenMP CPU 多线程并行</w:t>
-            </w:r>
-            <w:r>
-              <w:br/>
-            </w:r>
-            <w:r>
-              <w:rPr>
-                <w:rFonts w:ascii="Menlo" w:hAnsi="Menlo" w:eastAsia="Menlo"/>
-                <w:color w:val="14283C"/>
-                <w:sz w:val="17"/>
-              </w:rPr>
-              <w:t xml:space="preserve">        ↓  每个 CUDA thread 负责一个像素</w:t>
-            </w:r>
-            <w:r>
-              <w:br/>
-            </w:r>
-            <w:r>
-              <w:rPr>
-                <w:rFonts w:ascii="Menlo" w:hAnsi="Menlo" w:eastAsia="Menlo"/>
-                <w:color w:val="14283C"/>
-                <w:sz w:val="17"/>
-              </w:rPr>
-              <w:t>V3 CUDA GPU 大规模并行</w:t>
-            </w:r>
-          </w:p>
-        </w:tc>
-      </w:tr>
-    </w:tbl>
-    <w:p>
-      <w:pPr>
-        <w:ind w:firstLine="420"/>
-      </w:pPr>
-      <w:r>
-        <w:t>核心文件包括 vec3、ray、sphere、material、camera 和 main。场景物体使用球体表示，材质包括漫反射、金属和玻璃。输出图像采用 PPM 格式，便于在超算环境中直接生成和检查。</w:t>
-      </w:r>
-    </w:p>
-    <w:p>
-      <w:pPr>
-        <w:pStyle w:val="Heading1"/>
-      </w:pPr>
-      <w:r>
-        <w:t>4. 串行版本实现</w:t>
-      </w:r>
-    </w:p>
-    <w:p>
-      <w:pPr>
-        <w:ind w:firstLine="420"/>
-      </w:pPr>
-      <w:r>
-        <w:t>串行版本逐行逐像素计算颜色。每个像素进行多次随机采样，用于抗锯齿和降低噪声。核心循环如下。</w:t>
-      </w:r>
-    </w:p>
-    <w:tbl>
-      <w:tblPr>
-        <w:tblW w:type="dxa" w:w="9360"/>
-        <w:jc w:val="center"/>
-        <w:tblLook w:firstColumn="1" w:firstRow="1" w:lastColumn="0" w:lastRow="0" w:noHBand="0" w:noVBand="1" w:val="04A0"/>
-      </w:tblPr>
-      <w:tblGrid>
-        <w:gridCol w:w="9792"/>
-      </w:tblGrid>
-      <w:tr>
-        <w:tc>
-          <w:tcPr>
-            <w:tcW w:type="dxa" w:w="9792"/>
-            <w:shd w:fill="F4F6F9"/>
-            <w:tcBorders>
-              <w:top w:val="single" w:sz="4" w:space="0" w:color="CBD5E1"/>
-              <w:left w:val="single" w:sz="4" w:space="0" w:color="CBD5E1"/>
-              <w:bottom w:val="single" w:sz="4" w:space="0" w:color="CBD5E1"/>
-              <w:right w:val="single" w:sz="4" w:space="0" w:color="CBD5E1"/>
-              <w:insideH w:val="single" w:sz="4" w:space="0" w:color="CBD5E1"/>
-              <w:insideV w:val="single" w:sz="4" w:space="0" w:color="CBD5E1"/>
-            </w:tcBorders>
-          </w:tcPr>
-          <w:p>
-            <w:pPr>
-              <w:spacing w:before="80" w:after="80"/>
-            </w:pPr>
-            <w:r>
-              <w:rPr>
-                <w:rFonts w:ascii="Menlo" w:hAnsi="Menlo" w:eastAsia="Menlo"/>
-                <w:color w:val="14283C"/>
                 <w:sz w:val="17"/>
               </w:rPr>
               <w:t>for (int j = HEIGHT - 1; j &gt;= 0; j--) {</w:t>
@@ -578,7 +394,6 @@
             <w:r>
               <w:rPr>
                 <w:rFonts w:ascii="Menlo" w:hAnsi="Menlo" w:eastAsia="Menlo"/>
-                <w:color w:val="14283C"/>
                 <w:sz w:val="17"/>
               </w:rPr>
               <w:t xml:space="preserve">    for (int i = 0; i &lt; WIDTH; i++) {</w:t>
@@ -589,7 +404,6 @@
             <w:r>
               <w:rPr>
                 <w:rFonts w:ascii="Menlo" w:hAnsi="Menlo" w:eastAsia="Menlo"/>
-                <w:color w:val="14283C"/>
                 <w:sz w:val="17"/>
               </w:rPr>
               <w:t xml:space="preserve">        Vec3 color(0, 0, 0);</w:t>
@@ -600,10 +414,9 @@
             <w:r>
               <w:rPr>
                 <w:rFonts w:ascii="Menlo" w:hAnsi="Menlo" w:eastAsia="Menlo"/>
-                <w:color w:val="14283C"/>
                 <w:sz w:val="17"/>
               </w:rPr>
-              <w:t xml:space="preserve">        for (int s = 0; s &lt; SAMPLES; s++) {</w:t>
+              <w:t xml:space="preserve">        for (int s = 0; s &lt; samples; s++) {</w:t>
             </w:r>
             <w:r>
               <w:br/>
@@ -611,10 +424,9 @@
             <w:r>
               <w:rPr>
                 <w:rFonts w:ascii="Menlo" w:hAnsi="Menlo" w:eastAsia="Menlo"/>
-                <w:color w:val="14283C"/>
                 <w:sz w:val="17"/>
               </w:rPr>
-              <w:t xml:space="preserve">            float u = (i + random_float()) / (WIDTH - 1);</w:t>
+              <w:t xml:space="preserve">            Ray r = camera.get_ray(u, v);</w:t>
             </w:r>
             <w:r>
               <w:br/>
@@ -622,10 +434,9 @@
             <w:r>
               <w:rPr>
                 <w:rFonts w:ascii="Menlo" w:hAnsi="Menlo" w:eastAsia="Menlo"/>
-                <w:color w:val="14283C"/>
                 <w:sz w:val="17"/>
               </w:rPr>
-              <w:t xml:space="preserve">            float v = (j + random_float()) / (HEIGHT - 1);</w:t>
+              <w:t xml:space="preserve">            color += ray_color(r, world, max_depth);</w:t>
             </w:r>
             <w:r>
               <w:br/>
@@ -633,29 +444,6 @@
             <w:r>
               <w:rPr>
                 <w:rFonts w:ascii="Menlo" w:hAnsi="Menlo" w:eastAsia="Menlo"/>
-                <w:color w:val="14283C"/>
-                <w:sz w:val="17"/>
-              </w:rPr>
-              <w:t xml:space="preserve">            Ray r = cam.get_ray(u, v);</w:t>
-            </w:r>
-            <w:r>
-              <w:br/>
-            </w:r>
-            <w:r>
-              <w:rPr>
-                <w:rFonts w:ascii="Menlo" w:hAnsi="Menlo" w:eastAsia="Menlo"/>
-                <w:color w:val="14283C"/>
-                <w:sz w:val="17"/>
-              </w:rPr>
-              <w:t xml:space="preserve">            color += ray_color(r, world, materials, MAX_DEPTH);</w:t>
-            </w:r>
-            <w:r>
-              <w:br/>
-            </w:r>
-            <w:r>
-              <w:rPr>
-                <w:rFonts w:ascii="Menlo" w:hAnsi="Menlo" w:eastAsia="Menlo"/>
-                <w:color w:val="14283C"/>
                 <w:sz w:val="17"/>
               </w:rPr>
               <w:t xml:space="preserve">        }</w:t>
@@ -666,10 +454,9 @@
             <w:r>
               <w:rPr>
                 <w:rFonts w:ascii="Menlo" w:hAnsi="Menlo" w:eastAsia="Menlo"/>
-                <w:color w:val="14283C"/>
                 <w:sz w:val="17"/>
               </w:rPr>
-              <w:t xml:space="preserve">        write_pixel(out, color, SAMPLES);</w:t>
+              <w:t xml:space="preserve">        write_pixel(out, color, samples);</w:t>
             </w:r>
             <w:r>
               <w:br/>
@@ -677,7 +464,6 @@
             <w:r>
               <w:rPr>
                 <w:rFonts w:ascii="Menlo" w:hAnsi="Menlo" w:eastAsia="Menlo"/>
-                <w:color w:val="14283C"/>
                 <w:sz w:val="17"/>
               </w:rPr>
               <w:t xml:space="preserve">    }</w:t>
@@ -688,65 +474,9 @@
             <w:r>
               <w:rPr>
                 <w:rFonts w:ascii="Menlo" w:hAnsi="Menlo" w:eastAsia="Menlo"/>
-                <w:color w:val="14283C"/>
                 <w:sz w:val="17"/>
               </w:rPr>
               <w:t>}</w:t>
-            </w:r>
-          </w:p>
-        </w:tc>
-      </w:tr>
-    </w:tbl>
-    <w:p>
-      <w:pPr>
-        <w:pStyle w:val="Heading1"/>
-      </w:pPr>
-      <w:r>
-        <w:t>5. OpenMP 并行版本实现</w:t>
-      </w:r>
-    </w:p>
-    <w:p>
-      <w:pPr>
-        <w:ind w:firstLine="420"/>
-      </w:pPr>
-      <w:r>
-        <w:t>OpenMP 版本利用像素之间相互独立的特点，对图像行进行并行计算。为了避免多线程同时写文件，程序先将结果写入 framebuffer，最后统一按顺序输出 PPM。</w:t>
-      </w:r>
-    </w:p>
-    <w:tbl>
-      <w:tblPr>
-        <w:tblW w:type="dxa" w:w="9360"/>
-        <w:jc w:val="center"/>
-        <w:tblLook w:firstColumn="1" w:firstRow="1" w:lastColumn="0" w:lastRow="0" w:noHBand="0" w:noVBand="1" w:val="04A0"/>
-      </w:tblPr>
-      <w:tblGrid>
-        <w:gridCol w:w="9792"/>
-      </w:tblGrid>
-      <w:tr>
-        <w:tc>
-          <w:tcPr>
-            <w:tcW w:type="dxa" w:w="9792"/>
-            <w:shd w:fill="F4F6F9"/>
-            <w:tcBorders>
-              <w:top w:val="single" w:sz="4" w:space="0" w:color="CBD5E1"/>
-              <w:left w:val="single" w:sz="4" w:space="0" w:color="CBD5E1"/>
-              <w:bottom w:val="single" w:sz="4" w:space="0" w:color="CBD5E1"/>
-              <w:right w:val="single" w:sz="4" w:space="0" w:color="CBD5E1"/>
-              <w:insideH w:val="single" w:sz="4" w:space="0" w:color="CBD5E1"/>
-              <w:insideV w:val="single" w:sz="4" w:space="0" w:color="CBD5E1"/>
-            </w:tcBorders>
-          </w:tcPr>
-          <w:p>
-            <w:pPr>
-              <w:spacing w:before="80" w:after="80"/>
-            </w:pPr>
-            <w:r>
-              <w:rPr>
-                <w:rFonts w:ascii="Menlo" w:hAnsi="Menlo" w:eastAsia="Menlo"/>
-                <w:color w:val="14283C"/>
-                <w:sz w:val="17"/>
-              </w:rPr>
-              <w:t>std::vector&lt;Vec3&gt; framebuffer(static_cast&lt;size_t&gt;(WIDTH) * HEIGHT);</w:t>
             </w:r>
             <w:r>
               <w:br/>
@@ -754,7 +484,6 @@
             <w:r>
               <w:rPr>
                 <w:rFonts w:ascii="Menlo" w:hAnsi="Menlo" w:eastAsia="Menlo"/>
-                <w:color w:val="14283C"/>
                 <w:sz w:val="17"/>
               </w:rPr>
             </w:r>
@@ -764,7 +493,16 @@
             <w:r>
               <w:rPr>
                 <w:rFonts w:ascii="Menlo" w:hAnsi="Menlo" w:eastAsia="Menlo"/>
-                <w:color w:val="14283C"/>
+                <w:sz w:val="17"/>
+              </w:rPr>
+              <w:t>// OpenMP 版本：先写入 framebuffer，最后统一输出文件</w:t>
+            </w:r>
+            <w:r>
+              <w:br/>
+            </w:r>
+            <w:r>
+              <w:rPr>
+                <w:rFonts w:ascii="Menlo" w:hAnsi="Menlo" w:eastAsia="Menlo"/>
                 <w:sz w:val="17"/>
               </w:rPr>
               <w:t>#pragma omp parallel for schedule(dynamic, 1)</w:t>
@@ -775,10 +513,9 @@
             <w:r>
               <w:rPr>
                 <w:rFonts w:ascii="Menlo" w:hAnsi="Menlo" w:eastAsia="Menlo"/>
-                <w:color w:val="14283C"/>
                 <w:sz w:val="17"/>
               </w:rPr>
-              <w:t>for (int j = 0; j &lt; HEIGHT; j++) {</w:t>
+              <w:t>for (int j = 0; j &lt; height; j++) {</w:t>
             </w:r>
             <w:r>
               <w:br/>
@@ -786,10 +523,9 @@
             <w:r>
               <w:rPr>
                 <w:rFonts w:ascii="Menlo" w:hAnsi="Menlo" w:eastAsia="Menlo"/>
-                <w:color w:val="14283C"/>
                 <w:sz w:val="17"/>
               </w:rPr>
-              <w:t xml:space="preserve">    for (int i = 0; i &lt; WIDTH; i++) {</w:t>
+              <w:t xml:space="preserve">    for (int i = 0; i &lt; width; i++) {</w:t>
             </w:r>
             <w:r>
               <w:br/>
@@ -797,10 +533,9 @@
             <w:r>
               <w:rPr>
                 <w:rFonts w:ascii="Menlo" w:hAnsi="Menlo" w:eastAsia="Menlo"/>
-                <w:color w:val="14283C"/>
                 <w:sz w:val="17"/>
               </w:rPr>
-              <w:t xml:space="preserve">        Vec3 color(0, 0, 0);</w:t>
+              <w:t xml:space="preserve">        framebuffer[j * width + i] = trace_pixel(i, j);</w:t>
             </w:r>
             <w:r>
               <w:br/>
@@ -808,29 +543,6 @@
             <w:r>
               <w:rPr>
                 <w:rFonts w:ascii="Menlo" w:hAnsi="Menlo" w:eastAsia="Menlo"/>
-                <w:color w:val="14283C"/>
-                <w:sz w:val="17"/>
-              </w:rPr>
-              <w:t xml:space="preserve">        // 每个像素独立追踪光线</w:t>
-            </w:r>
-            <w:r>
-              <w:br/>
-            </w:r>
-            <w:r>
-              <w:rPr>
-                <w:rFonts w:ascii="Menlo" w:hAnsi="Menlo" w:eastAsia="Menlo"/>
-                <w:color w:val="14283C"/>
-                <w:sz w:val="17"/>
-              </w:rPr>
-              <w:t xml:space="preserve">        framebuffer[static_cast&lt;size_t&gt;(out_row) * WIDTH + i] = color;</w:t>
-            </w:r>
-            <w:r>
-              <w:br/>
-            </w:r>
-            <w:r>
-              <w:rPr>
-                <w:rFonts w:ascii="Menlo" w:hAnsi="Menlo" w:eastAsia="Menlo"/>
-                <w:color w:val="14283C"/>
                 <w:sz w:val="17"/>
               </w:rPr>
               <w:t xml:space="preserve">    }</w:t>
@@ -841,7 +553,6 @@
             <w:r>
               <w:rPr>
                 <w:rFonts w:ascii="Menlo" w:hAnsi="Menlo" w:eastAsia="Menlo"/>
-                <w:color w:val="14283C"/>
                 <w:sz w:val="17"/>
               </w:rPr>
               <w:t>}</w:t>
@@ -850,51 +561,27 @@
         </w:tc>
       </w:tr>
     </w:tbl>
-    <w:p>
-      <w:pPr>
-        <w:ind w:firstLine="420"/>
-      </w:pPr>
-      <w:r>
-        <w:t>这里使用 schedule(dynamic, 1) 是因为不同像素的光线反射、折射次数不同，计算量存在差异。动态调度可以缓解负载不均，提高多核利用率。</w:t>
-      </w:r>
-    </w:p>
-    <w:p>
-      <w:pPr>
-        <w:pStyle w:val="Heading1"/>
-      </w:pPr>
-      <w:r>
-        <w:t>6. CUDA 版本设计与超算提交</w:t>
-      </w:r>
-    </w:p>
-    <w:p>
-      <w:pPr>
-        <w:ind w:firstLine="420"/>
-      </w:pPr>
-      <w:r>
-        <w:t>CUDA 版本将每个像素映射到一个 GPU 线程，使用 16×16 的线程块组织二维网格。递归 ray_color 被改写为迭代形式，以降低 GPU 栈压力。</w:t>
-      </w:r>
-    </w:p>
     <w:tbl>
       <w:tblPr>
-        <w:tblW w:type="dxa" w:w="9360"/>
+        <w:tblW w:type="dxa" w:w="8600"/>
         <w:jc w:val="center"/>
         <w:tblLook w:firstColumn="1" w:firstRow="1" w:lastColumn="0" w:lastRow="0" w:noHBand="0" w:noVBand="1" w:val="04A0"/>
       </w:tblPr>
       <w:tblGrid>
-        <w:gridCol w:w="9792"/>
+        <w:gridCol w:w="8666"/>
       </w:tblGrid>
       <w:tr>
         <w:tc>
           <w:tcPr>
-            <w:tcW w:type="dxa" w:w="9792"/>
-            <w:shd w:fill="F4F6F9"/>
+            <w:tcW w:type="dxa" w:w="8666"/>
+            <w:shd w:fill="F2F2F2"/>
             <w:tcBorders>
-              <w:top w:val="single" w:sz="4" w:space="0" w:color="CBD5E1"/>
-              <w:left w:val="single" w:sz="4" w:space="0" w:color="CBD5E1"/>
-              <w:bottom w:val="single" w:sz="4" w:space="0" w:color="CBD5E1"/>
-              <w:right w:val="single" w:sz="4" w:space="0" w:color="CBD5E1"/>
-              <w:insideH w:val="single" w:sz="4" w:space="0" w:color="CBD5E1"/>
-              <w:insideV w:val="single" w:sz="4" w:space="0" w:color="CBD5E1"/>
+              <w:top w:val="single" w:sz="4" w:space="0" w:color="C9C9C9"/>
+              <w:left w:val="single" w:sz="4" w:space="0" w:color="C9C9C9"/>
+              <w:bottom w:val="single" w:sz="4" w:space="0" w:color="C9C9C9"/>
+              <w:right w:val="single" w:sz="4" w:space="0" w:color="C9C9C9"/>
+              <w:insideH w:val="single" w:sz="4" w:space="0" w:color="C9C9C9"/>
+              <w:insideV w:val="single" w:sz="4" w:space="0" w:color="C9C9C9"/>
             </w:tcBorders>
           </w:tcPr>
           <w:p>
@@ -904,7 +591,91 @@
             <w:r>
               <w:rPr>
                 <w:rFonts w:ascii="Menlo" w:hAnsi="Menlo" w:eastAsia="Menlo"/>
-                <w:color w:val="14283C"/>
+                <w:sz w:val="17"/>
+              </w:rPr>
+              <w:t>g++ -O2 -std=c++17 v1_serial/main.cpp -o v1_serial/v1_serial</w:t>
+            </w:r>
+            <w:r>
+              <w:br/>
+            </w:r>
+            <w:r>
+              <w:rPr>
+                <w:rFonts w:ascii="Menlo" w:hAnsi="Menlo" w:eastAsia="Menlo"/>
+                <w:sz w:val="17"/>
+              </w:rPr>
+              <w:t>g++ -O2 -std=c++17 -fopenmp v2_openmp/main.cpp -o v2_openmp/v2_openmp</w:t>
+            </w:r>
+            <w:r>
+              <w:br/>
+            </w:r>
+            <w:r>
+              <w:rPr>
+                <w:rFonts w:ascii="Menlo" w:hAnsi="Menlo" w:eastAsia="Menlo"/>
+                <w:sz w:val="17"/>
+              </w:rPr>
+              <w:t>./v1_serial/v1_serial --width 400 --height 300 --samples 64</w:t>
+            </w:r>
+            <w:r>
+              <w:br/>
+            </w:r>
+            <w:r>
+              <w:rPr>
+                <w:rFonts w:ascii="Menlo" w:hAnsi="Menlo" w:eastAsia="Menlo"/>
+                <w:sz w:val="17"/>
+              </w:rPr>
+              <w:t>OMP_NUM_THREADS=8 ./v2_openmp/v2_openmp --width 400 --height 300 --samples 64</w:t>
+            </w:r>
+          </w:p>
+        </w:tc>
+      </w:tr>
+    </w:tbl>
+    <w:p>
+      <w:pPr>
+        <w:pStyle w:val="Heading2"/>
+      </w:pPr>
+      <w:r>
+        <w:t>3.2 实验二：CUDA GPU 光线追踪并行加速</w:t>
+      </w:r>
+    </w:p>
+    <w:p>
+      <w:pPr>
+        <w:spacing w:after="100"/>
+        <w:ind w:firstLine="420"/>
+      </w:pPr>
+      <w:r>
+        <w:t>CUDA 版本将一个像素映射为一个 GPU 线程，用二维 grid/block 组织线程。场景球体和材质数据放入显存后传入 kernel，避免在 __constant__ 变量中使用带动态初始化的对象。</w:t>
+      </w:r>
+    </w:p>
+    <w:tbl>
+      <w:tblPr>
+        <w:tblW w:type="dxa" w:w="8600"/>
+        <w:jc w:val="center"/>
+        <w:tblLook w:firstColumn="1" w:firstRow="1" w:lastColumn="0" w:lastRow="0" w:noHBand="0" w:noVBand="1" w:val="04A0"/>
+      </w:tblPr>
+      <w:tblGrid>
+        <w:gridCol w:w="8666"/>
+      </w:tblGrid>
+      <w:tr>
+        <w:tc>
+          <w:tcPr>
+            <w:tcW w:type="dxa" w:w="8666"/>
+            <w:shd w:fill="F2F2F2"/>
+            <w:tcBorders>
+              <w:top w:val="single" w:sz="4" w:space="0" w:color="C9C9C9"/>
+              <w:left w:val="single" w:sz="4" w:space="0" w:color="C9C9C9"/>
+              <w:bottom w:val="single" w:sz="4" w:space="0" w:color="C9C9C9"/>
+              <w:right w:val="single" w:sz="4" w:space="0" w:color="C9C9C9"/>
+              <w:insideH w:val="single" w:sz="4" w:space="0" w:color="C9C9C9"/>
+              <w:insideV w:val="single" w:sz="4" w:space="0" w:color="C9C9C9"/>
+            </w:tcBorders>
+          </w:tcPr>
+          <w:p>
+            <w:pPr>
+              <w:spacing w:before="80" w:after="80"/>
+            </w:pPr>
+            <w:r>
+              <w:rPr>
+                <w:rFonts w:ascii="Menlo" w:hAnsi="Menlo" w:eastAsia="Menlo"/>
                 <w:sz w:val="17"/>
               </w:rPr>
               <w:t>__global__ void render_kernel(float* framebuffer, int width, int height,</w:t>
@@ -915,7 +686,6 @@
             <w:r>
               <w:rPr>
                 <w:rFonts w:ascii="Menlo" w:hAnsi="Menlo" w:eastAsia="Menlo"/>
-                <w:color w:val="14283C"/>
                 <w:sz w:val="17"/>
               </w:rPr>
               <w:t xml:space="preserve">                              int samples, Camera camera,</w:t>
@@ -926,10 +696,9 @@
             <w:r>
               <w:rPr>
                 <w:rFonts w:ascii="Menlo" w:hAnsi="Menlo" w:eastAsia="Menlo"/>
-                <w:color w:val="14283C"/>
                 <w:sz w:val="17"/>
               </w:rPr>
-              <w:t xml:space="preserve">                              curandState* rand_states, int scene_id,</w:t>
+              <w:t xml:space="preserve">                              curandState* rand_states,</w:t>
             </w:r>
             <w:r>
               <w:br/>
@@ -937,10 +706,9 @@
             <w:r>
               <w:rPr>
                 <w:rFonts w:ascii="Menlo" w:hAnsi="Menlo" w:eastAsia="Menlo"/>
-                <w:color w:val="14283C"/>
                 <w:sz w:val="17"/>
               </w:rPr>
-              <w:t xml:space="preserve">                              const Sphere* spheres, int num_spheres,</w:t>
+              <w:t xml:space="preserve">                              const Sphere* spheres,</w:t>
             </w:r>
             <w:r>
               <w:br/>
@@ -948,7 +716,6 @@
             <w:r>
               <w:rPr>
                 <w:rFonts w:ascii="Menlo" w:hAnsi="Menlo" w:eastAsia="Menlo"/>
-                <w:color w:val="14283C"/>
                 <w:sz w:val="17"/>
               </w:rPr>
               <w:t xml:space="preserve">                              const MaterialData* materials) {</w:t>
@@ -959,7 +726,6 @@
             <w:r>
               <w:rPr>
                 <w:rFonts w:ascii="Menlo" w:hAnsi="Menlo" w:eastAsia="Menlo"/>
-                <w:color w:val="14283C"/>
                 <w:sz w:val="17"/>
               </w:rPr>
               <w:t xml:space="preserve">    int i = blockIdx.x * blockDim.x + threadIdx.x;</w:t>
@@ -970,7 +736,6 @@
             <w:r>
               <w:rPr>
                 <w:rFonts w:ascii="Menlo" w:hAnsi="Menlo" w:eastAsia="Menlo"/>
-                <w:color w:val="14283C"/>
                 <w:sz w:val="17"/>
               </w:rPr>
               <w:t xml:space="preserve">    int j = blockIdx.y * blockDim.y + threadIdx.y;</w:t>
@@ -981,7 +746,6 @@
             <w:r>
               <w:rPr>
                 <w:rFonts w:ascii="Menlo" w:hAnsi="Menlo" w:eastAsia="Menlo"/>
-                <w:color w:val="14283C"/>
                 <w:sz w:val="17"/>
               </w:rPr>
               <w:t xml:space="preserve">    if (i &gt;= width || j &gt;= height) return;</w:t>
@@ -992,7 +756,6 @@
             <w:r>
               <w:rPr>
                 <w:rFonts w:ascii="Menlo" w:hAnsi="Menlo" w:eastAsia="Menlo"/>
-                <w:color w:val="14283C"/>
                 <w:sz w:val="17"/>
               </w:rPr>
             </w:r>
@@ -1002,7 +765,6 @@
             <w:r>
               <w:rPr>
                 <w:rFonts w:ascii="Menlo" w:hAnsi="Menlo" w:eastAsia="Menlo"/>
-                <w:color w:val="14283C"/>
                 <w:sz w:val="17"/>
               </w:rPr>
               <w:t xml:space="preserve">    int idx = j * width + i;</w:t>
@@ -1013,10 +775,9 @@
             <w:r>
               <w:rPr>
                 <w:rFonts w:ascii="Menlo" w:hAnsi="Menlo" w:eastAsia="Menlo"/>
-                <w:color w:val="14283C"/>
                 <w:sz w:val="17"/>
               </w:rPr>
-              <w:t xml:space="preserve">    // 每个线程独立计算一个像素</w:t>
+              <w:t xml:space="preserve">    framebuffer[3 * idx + 0] = color.x();</w:t>
             </w:r>
             <w:r>
               <w:br/>
@@ -1024,7 +785,26 @@
             <w:r>
               <w:rPr>
                 <w:rFonts w:ascii="Menlo" w:hAnsi="Menlo" w:eastAsia="Menlo"/>
-                <w:color w:val="14283C"/>
+                <w:sz w:val="17"/>
+              </w:rPr>
+              <w:t xml:space="preserve">    framebuffer[3 * idx + 1] = color.y();</w:t>
+            </w:r>
+            <w:r>
+              <w:br/>
+            </w:r>
+            <w:r>
+              <w:rPr>
+                <w:rFonts w:ascii="Menlo" w:hAnsi="Menlo" w:eastAsia="Menlo"/>
+                <w:sz w:val="17"/>
+              </w:rPr>
+              <w:t xml:space="preserve">    framebuffer[3 * idx + 2] = color.z();</w:t>
+            </w:r>
+            <w:r>
+              <w:br/>
+            </w:r>
+            <w:r>
+              <w:rPr>
+                <w:rFonts w:ascii="Menlo" w:hAnsi="Menlo" w:eastAsia="Menlo"/>
                 <w:sz w:val="17"/>
               </w:rPr>
               <w:t>}</w:t>
@@ -1033,35 +813,27 @@
         </w:tc>
       </w:tr>
     </w:tbl>
-    <w:p>
-      <w:pPr>
-        <w:ind w:firstLine="420"/>
-      </w:pPr>
-      <w:r>
-        <w:t>CUDA 版本使用 cudaMalloc 在显存中保存球体和材质数组，再将指针作为 kernel 参数传入。这样可以避免带构造函数结构体放入 __constant__ 变量时产生的动态初始化问题。</w:t>
-      </w:r>
-    </w:p>
     <w:tbl>
       <w:tblPr>
-        <w:tblW w:type="dxa" w:w="9360"/>
+        <w:tblW w:type="dxa" w:w="8600"/>
         <w:jc w:val="center"/>
         <w:tblLook w:firstColumn="1" w:firstRow="1" w:lastColumn="0" w:lastRow="0" w:noHBand="0" w:noVBand="1" w:val="04A0"/>
       </w:tblPr>
       <w:tblGrid>
-        <w:gridCol w:w="9792"/>
+        <w:gridCol w:w="8666"/>
       </w:tblGrid>
       <w:tr>
         <w:tc>
           <w:tcPr>
-            <w:tcW w:type="dxa" w:w="9792"/>
-            <w:shd w:fill="F4F6F9"/>
+            <w:tcW w:type="dxa" w:w="8666"/>
+            <w:shd w:fill="F2F2F2"/>
             <w:tcBorders>
-              <w:top w:val="single" w:sz="4" w:space="0" w:color="CBD5E1"/>
-              <w:left w:val="single" w:sz="4" w:space="0" w:color="CBD5E1"/>
-              <w:bottom w:val="single" w:sz="4" w:space="0" w:color="CBD5E1"/>
-              <w:right w:val="single" w:sz="4" w:space="0" w:color="CBD5E1"/>
-              <w:insideH w:val="single" w:sz="4" w:space="0" w:color="CBD5E1"/>
-              <w:insideV w:val="single" w:sz="4" w:space="0" w:color="CBD5E1"/>
+              <w:top w:val="single" w:sz="4" w:space="0" w:color="C9C9C9"/>
+              <w:left w:val="single" w:sz="4" w:space="0" w:color="C9C9C9"/>
+              <w:bottom w:val="single" w:sz="4" w:space="0" w:color="C9C9C9"/>
+              <w:right w:val="single" w:sz="4" w:space="0" w:color="C9C9C9"/>
+              <w:insideH w:val="single" w:sz="4" w:space="0" w:color="C9C9C9"/>
+              <w:insideV w:val="single" w:sz="4" w:space="0" w:color="C9C9C9"/>
             </w:tcBorders>
           </w:tcPr>
           <w:p>
@@ -1071,7 +843,6 @@
             <w:r>
               <w:rPr>
                 <w:rFonts w:ascii="Menlo" w:hAnsi="Menlo" w:eastAsia="Menlo"/>
-                <w:color w:val="14283C"/>
                 <w:sz w:val="17"/>
               </w:rPr>
               <w:t>module load intel/cuda/12.1</w:t>
@@ -1082,7 +853,6 @@
             <w:r>
               <w:rPr>
                 <w:rFonts w:ascii="Menlo" w:hAnsi="Menlo" w:eastAsia="Menlo"/>
-                <w:color w:val="14283C"/>
                 <w:sz w:val="17"/>
               </w:rPr>
               <w:t>nvcc -O3 -arch=sm_80 v3_cuda/main.cu -o v3_cuda/v3_cuda</w:t>
@@ -1093,7 +863,6 @@
             <w:r>
               <w:rPr>
                 <w:rFonts w:ascii="Menlo" w:hAnsi="Menlo" w:eastAsia="Menlo"/>
-                <w:color w:val="14283C"/>
                 <w:sz w:val="17"/>
               </w:rPr>
               <w:t>sbatch submit.sh ./v3_cuda/v3_cuda</w:t>
@@ -1104,7 +873,6 @@
             <w:r>
               <w:rPr>
                 <w:rFonts w:ascii="Menlo" w:hAnsi="Menlo" w:eastAsia="Menlo"/>
-                <w:color w:val="14283C"/>
                 <w:sz w:val="17"/>
               </w:rPr>
               <w:t>squeue -u bjtu3</w:t>
@@ -1115,10 +883,19 @@
     </w:tbl>
     <w:p>
       <w:pPr>
+        <w:pStyle w:val="Heading2"/>
+      </w:pPr>
+      <w:r>
+        <w:t>3.3 扩展展示场景设计</w:t>
+      </w:r>
+    </w:p>
+    <w:p>
+      <w:pPr>
+        <w:spacing w:after="100"/>
         <w:ind w:firstLine="420"/>
       </w:pPr>
       <w:r>
-        <w:t>实验过程中曾在登录节点直接运行 CUDA 程序并出现 CUDA driver version is insufficient for CUDA runtime version。该问题不是编译错误，而是登录节点通常不提供可用 GPU 运行环境。随后将程序提交到 gpu_4090 分区后，该问题消失，并成功生成 results/v3_output.ppm。作业输出 job.out 中记录 CUDA Render time 为 0.126103 s，说明 GPU 版本已完成实测。</w:t>
+        <w:t>为了使课程设计结果更贴近游戏画面渲染方向，项目额外加入了 racing、blackhole、snow_gt 等场景参数。车辆、公路、雪地和黑洞吸积盘等画面均由程序化几何和材质生成，不依赖商业游戏源代码或贴图资源。</w:t>
       </w:r>
     </w:p>
     <w:p>
@@ -1126,187 +903,109 @@
         <w:pStyle w:val="Heading1"/>
       </w:pPr>
       <w:r>
-        <w:t>7. 渲染结果与图片对比</w:t>
+        <w:t>四、实验结果</w:t>
       </w:r>
     </w:p>
     <w:p>
       <w:pPr>
-        <w:ind w:firstLine="420"/>
+        <w:pStyle w:val="Heading2"/>
       </w:pPr>
       <w:r>
-        <w:t>超算平台生成了串行、OpenMP 和 CUDA 版本的 400×300 PPM 渲染结果。为了便于插入报告，已将关键 PPM 转换为 JPG/PNG，并与运行截图共同保存在 results/report_assets 目录。</w:t>
+        <w:t>4.1 实验一运行结果</w:t>
       </w:r>
     </w:p>
     <w:tbl>
       <w:tblPr>
-        <w:tblW w:type="dxa" w:w="9360"/>
+        <w:tblW w:type="dxa" w:w="8600"/>
         <w:jc w:val="center"/>
         <w:tblLook w:firstColumn="1" w:firstRow="1" w:lastColumn="0" w:lastRow="0" w:noHBand="0" w:noVBand="1" w:val="04A0"/>
       </w:tblPr>
       <w:tblGrid>
-        <w:gridCol w:w="4896"/>
-        <w:gridCol w:w="4896"/>
+        <w:gridCol w:w="8666"/>
       </w:tblGrid>
       <w:tr>
         <w:tc>
           <w:tcPr>
-            <w:tcW w:type="dxa" w:w="4896"/>
-            <w:vAlign w:val="center"/>
+            <w:tcW w:type="dxa" w:w="8666"/>
+            <w:shd w:fill="F2F2F2"/>
             <w:tcBorders>
-              <w:top w:val="single" w:sz="4" w:space="0" w:color="FFFFFF"/>
-              <w:left w:val="single" w:sz="4" w:space="0" w:color="FFFFFF"/>
-              <w:bottom w:val="single" w:sz="4" w:space="0" w:color="FFFFFF"/>
-              <w:right w:val="single" w:sz="4" w:space="0" w:color="FFFFFF"/>
-              <w:insideH w:val="single" w:sz="4" w:space="0" w:color="FFFFFF"/>
-              <w:insideV w:val="single" w:sz="4" w:space="0" w:color="FFFFFF"/>
+              <w:top w:val="single" w:sz="4" w:space="0" w:color="C9C9C9"/>
+              <w:left w:val="single" w:sz="4" w:space="0" w:color="C9C9C9"/>
+              <w:bottom w:val="single" w:sz="4" w:space="0" w:color="C9C9C9"/>
+              <w:right w:val="single" w:sz="4" w:space="0" w:color="C9C9C9"/>
+              <w:insideH w:val="single" w:sz="4" w:space="0" w:color="C9C9C9"/>
+              <w:insideV w:val="single" w:sz="4" w:space="0" w:color="C9C9C9"/>
             </w:tcBorders>
           </w:tcPr>
           <w:p>
             <w:pPr>
-              <w:jc w:val="center"/>
-            </w:pPr>
-            <w:r>
-              <w:drawing>
-                <wp:inline xmlns:a="http://schemas.openxmlformats.org/drawingml/2006/main" xmlns:pic="http://schemas.openxmlformats.org/drawingml/2006/picture">
-                  <wp:extent cx="2743200" cy="2057400"/>
-                  <wp:docPr id="1" name="Picture 1"/>
-                  <wp:cNvGraphicFramePr>
-                    <a:graphicFrameLocks noChangeAspect="1"/>
-                  </wp:cNvGraphicFramePr>
-                  <a:graphic>
-                    <a:graphicData uri="http://schemas.openxmlformats.org/drawingml/2006/picture">
-                      <pic:pic>
-                        <pic:nvPicPr>
-                          <pic:cNvPr id="0" name="hpc_output_1.jpg"/>
-                          <pic:cNvPicPr/>
-                        </pic:nvPicPr>
-                        <pic:blipFill>
-                          <a:blip r:embed="rId11"/>
-                          <a:stretch>
-                            <a:fillRect/>
-                          </a:stretch>
-                        </pic:blipFill>
-                        <pic:spPr>
-                          <a:xfrm>
-                            <a:off x="0" y="0"/>
-                            <a:ext cx="2743200" cy="2057400"/>
-                          </a:xfrm>
-                          <a:prstGeom prst="rect"/>
-                        </pic:spPr>
-                      </pic:pic>
-                    </a:graphicData>
-                  </a:graphic>
-                </wp:inline>
-              </w:drawing>
-            </w:r>
-          </w:p>
-        </w:tc>
-        <w:tc>
-          <w:tcPr>
-            <w:tcW w:type="dxa" w:w="4896"/>
-            <w:vAlign w:val="center"/>
-            <w:tcBorders>
-              <w:top w:val="single" w:sz="4" w:space="0" w:color="FFFFFF"/>
-              <w:left w:val="single" w:sz="4" w:space="0" w:color="FFFFFF"/>
-              <w:bottom w:val="single" w:sz="4" w:space="0" w:color="FFFFFF"/>
-              <w:right w:val="single" w:sz="4" w:space="0" w:color="FFFFFF"/>
-              <w:insideH w:val="single" w:sz="4" w:space="0" w:color="FFFFFF"/>
-              <w:insideV w:val="single" w:sz="4" w:space="0" w:color="FFFFFF"/>
-            </w:tcBorders>
-          </w:tcPr>
-          <w:p>
-            <w:pPr>
-              <w:jc w:val="center"/>
-            </w:pPr>
-            <w:r>
-              <w:drawing>
-                <wp:inline xmlns:a="http://schemas.openxmlformats.org/drawingml/2006/main" xmlns:pic="http://schemas.openxmlformats.org/drawingml/2006/picture">
-                  <wp:extent cx="2743200" cy="2057400"/>
-                  <wp:docPr id="2" name="Picture 2"/>
-                  <wp:cNvGraphicFramePr>
-                    <a:graphicFrameLocks noChangeAspect="1"/>
-                  </wp:cNvGraphicFramePr>
-                  <a:graphic>
-                    <a:graphicData uri="http://schemas.openxmlformats.org/drawingml/2006/picture">
-                      <pic:pic>
-                        <pic:nvPicPr>
-                          <pic:cNvPr id="0" name="hpc_output_3.jpg"/>
-                          <pic:cNvPicPr/>
-                        </pic:nvPicPr>
-                        <pic:blipFill>
-                          <a:blip r:embed="rId12"/>
-                          <a:stretch>
-                            <a:fillRect/>
-                          </a:stretch>
-                        </pic:blipFill>
-                        <pic:spPr>
-                          <a:xfrm>
-                            <a:off x="0" y="0"/>
-                            <a:ext cx="2743200" cy="2057400"/>
-                          </a:xfrm>
-                          <a:prstGeom prst="rect"/>
-                        </pic:spPr>
-                      </pic:pic>
-                    </a:graphicData>
-                  </a:graphic>
-                </wp:inline>
-              </w:drawing>
-            </w:r>
-          </w:p>
-        </w:tc>
-      </w:tr>
-      <w:tr>
-        <w:tc>
-          <w:tcPr>
-            <w:tcW w:type="dxa" w:w="4896"/>
-            <w:vAlign w:val="center"/>
-            <w:tcBorders>
-              <w:top w:val="single" w:sz="4" w:space="0" w:color="FFFFFF"/>
-              <w:left w:val="single" w:sz="4" w:space="0" w:color="FFFFFF"/>
-              <w:bottom w:val="single" w:sz="4" w:space="0" w:color="FFFFFF"/>
-              <w:right w:val="single" w:sz="4" w:space="0" w:color="FFFFFF"/>
-              <w:insideH w:val="single" w:sz="4" w:space="0" w:color="FFFFFF"/>
-              <w:insideV w:val="single" w:sz="4" w:space="0" w:color="FFFFFF"/>
-            </w:tcBorders>
-          </w:tcPr>
-          <w:p>
-            <w:pPr>
-              <w:jc w:val="center"/>
+              <w:spacing w:before="80" w:after="80"/>
             </w:pPr>
             <w:r>
               <w:rPr>
-                <w:i/>
-                <w:color w:val="5A5A5A"/>
-                <w:sz w:val="18"/>
+                <w:rFonts w:ascii="Menlo" w:hAnsi="Menlo" w:eastAsia="Menlo"/>
+                <w:sz w:val="17"/>
               </w:rPr>
-              <w:t>图 3(a)  超算输出 hpc_output_1.ppm 转 JPG</w:t>
+              <w:t>./v1_serial/v1_serial --width 400 --height 300 --samples 64</w:t>
             </w:r>
-          </w:p>
-        </w:tc>
-        <w:tc>
-          <w:tcPr>
-            <w:tcW w:type="dxa" w:w="4896"/>
-            <w:vAlign w:val="center"/>
-            <w:tcBorders>
-              <w:top w:val="single" w:sz="4" w:space="0" w:color="FFFFFF"/>
-              <w:left w:val="single" w:sz="4" w:space="0" w:color="FFFFFF"/>
-              <w:bottom w:val="single" w:sz="4" w:space="0" w:color="FFFFFF"/>
-              <w:right w:val="single" w:sz="4" w:space="0" w:color="FFFFFF"/>
-              <w:insideH w:val="single" w:sz="4" w:space="0" w:color="FFFFFF"/>
-              <w:insideV w:val="single" w:sz="4" w:space="0" w:color="FFFFFF"/>
-            </w:tcBorders>
-          </w:tcPr>
-          <w:p>
-            <w:pPr>
-              <w:jc w:val="center"/>
-            </w:pPr>
+            <w:r>
+              <w:br/>
+            </w:r>
             <w:r>
               <w:rPr>
-                <w:i/>
-                <w:color w:val="5A5A5A"/>
-                <w:sz w:val="18"/>
+                <w:rFonts w:ascii="Menlo" w:hAnsi="Menlo" w:eastAsia="Menlo"/>
+                <w:sz w:val="17"/>
               </w:rPr>
-              <w:t>图 3(b)  超算输出 hpc_output_3.ppm 转 JPG</w:t>
+              <w:t>Rendering scanline 300/300</w:t>
+            </w:r>
+            <w:r>
+              <w:br/>
+            </w:r>
+            <w:r>
+              <w:rPr>
+                <w:rFonts w:ascii="Menlo" w:hAnsi="Menlo" w:eastAsia="Menlo"/>
+                <w:sz w:val="17"/>
+              </w:rPr>
+              <w:t>Done.</w:t>
+            </w:r>
+            <w:r>
+              <w:br/>
+            </w:r>
+            <w:r>
+              <w:rPr>
+                <w:rFonts w:ascii="Menlo" w:hAnsi="Menlo" w:eastAsia="Menlo"/>
+                <w:sz w:val="17"/>
+              </w:rPr>
+              <w:t>Render time: 39.1013 s</w:t>
+            </w:r>
+            <w:r>
+              <w:br/>
+            </w:r>
+            <w:r>
+              <w:rPr>
+                <w:rFonts w:ascii="Menlo" w:hAnsi="Menlo" w:eastAsia="Menlo"/>
+                <w:sz w:val="17"/>
+              </w:rPr>
+            </w:r>
+            <w:r>
+              <w:br/>
+            </w:r>
+            <w:r>
+              <w:rPr>
+                <w:rFonts w:ascii="Menlo" w:hAnsi="Menlo" w:eastAsia="Menlo"/>
+                <w:sz w:val="17"/>
+              </w:rPr>
+              <w:t>OMP_NUM_THREADS=8 ./v2_openmp/v2_openmp --width 400 --height 300 --samples 64</w:t>
+            </w:r>
+            <w:r>
+              <w:br/>
+            </w:r>
+            <w:r>
+              <w:rPr>
+                <w:rFonts w:ascii="Menlo" w:hAnsi="Menlo" w:eastAsia="Menlo"/>
+                <w:sz w:val="17"/>
+              </w:rPr>
+              <w:t>Threads=8 Render time: 9.72383 s</w:t>
             </w:r>
           </w:p>
         </w:tc>
@@ -1314,12 +1013,70 @@
     </w:tbl>
     <w:p>
       <w:pPr>
-        <w:ind w:firstLine="420"/>
+        <w:pStyle w:val="Heading2"/>
       </w:pPr>
       <w:r>
-        <w:t>两张图片均能正确解析为 P3 格式 PPM，尺寸为 400×300。由于随机采样和随机场景生成存在差异，两次输出的局部颜色和小球位置不完全相同，但整体场景、材质和光线追踪效果一致。</w:t>
+        <w:t>4.2 实验二运行结果</w:t>
       </w:r>
     </w:p>
+    <w:tbl>
+      <w:tblPr>
+        <w:tblW w:type="dxa" w:w="8600"/>
+        <w:jc w:val="center"/>
+        <w:tblLook w:firstColumn="1" w:firstRow="1" w:lastColumn="0" w:lastRow="0" w:noHBand="0" w:noVBand="1" w:val="04A0"/>
+      </w:tblPr>
+      <w:tblGrid>
+        <w:gridCol w:w="8666"/>
+      </w:tblGrid>
+      <w:tr>
+        <w:tc>
+          <w:tcPr>
+            <w:tcW w:type="dxa" w:w="8666"/>
+            <w:shd w:fill="F2F2F2"/>
+            <w:tcBorders>
+              <w:top w:val="single" w:sz="4" w:space="0" w:color="C9C9C9"/>
+              <w:left w:val="single" w:sz="4" w:space="0" w:color="C9C9C9"/>
+              <w:bottom w:val="single" w:sz="4" w:space="0" w:color="C9C9C9"/>
+              <w:right w:val="single" w:sz="4" w:space="0" w:color="C9C9C9"/>
+              <w:insideH w:val="single" w:sz="4" w:space="0" w:color="C9C9C9"/>
+              <w:insideV w:val="single" w:sz="4" w:space="0" w:color="C9C9C9"/>
+            </w:tcBorders>
+          </w:tcPr>
+          <w:p>
+            <w:pPr>
+              <w:spacing w:before="80" w:after="80"/>
+            </w:pPr>
+            <w:r>
+              <w:rPr>
+                <w:rFonts w:ascii="Menlo" w:hAnsi="Menlo" w:eastAsia="Menlo"/>
+                <w:sz w:val="17"/>
+              </w:rPr>
+              <w:t>CUDA Render time: 0.126103 s</w:t>
+            </w:r>
+            <w:r>
+              <w:br/>
+            </w:r>
+            <w:r>
+              <w:rPr>
+                <w:rFonts w:ascii="Menlo" w:hAnsi="Menlo" w:eastAsia="Menlo"/>
+                <w:sz w:val="17"/>
+              </w:rPr>
+              <w:t>Output: results/v3_output.ppm</w:t>
+            </w:r>
+            <w:r>
+              <w:br/>
+            </w:r>
+            <w:r>
+              <w:rPr>
+                <w:rFonts w:ascii="Menlo" w:hAnsi="Menlo" w:eastAsia="Menlo"/>
+                <w:sz w:val="17"/>
+              </w:rPr>
+              <w:t>Environment: intel/cuda/12.1, gpu_4090 partition</w:t>
+            </w:r>
+          </w:p>
+        </w:tc>
+      </w:tr>
+    </w:tbl>
     <w:p>
       <w:pPr>
         <w:jc w:val="center"/>
@@ -1327,8 +1084,8 @@
       <w:r>
         <w:drawing>
           <wp:inline xmlns:a="http://schemas.openxmlformats.org/drawingml/2006/main" xmlns:pic="http://schemas.openxmlformats.org/drawingml/2006/picture">
-            <wp:extent cx="5303520" cy="3977640"/>
-            <wp:docPr id="3" name="Picture 3"/>
+            <wp:extent cx="4389120" cy="3291840"/>
+            <wp:docPr id="1" name="Picture 1"/>
             <wp:cNvGraphicFramePr>
               <a:graphicFrameLocks noChangeAspect="1"/>
             </wp:cNvGraphicFramePr>
@@ -1340,7 +1097,7 @@
                     <pic:cNvPicPr/>
                   </pic:nvPicPr>
                   <pic:blipFill>
-                    <a:blip r:embed="rId13"/>
+                    <a:blip r:embed="rId11"/>
                     <a:stretch>
                       <a:fillRect/>
                     </a:stretch>
@@ -1348,7 +1105,7 @@
                   <pic:spPr>
                     <a:xfrm>
                       <a:off x="0" y="0"/>
-                      <a:ext cx="5303520" cy="3977640"/>
+                      <a:ext cx="4389120" cy="3291840"/>
                     </a:xfrm>
                     <a:prstGeom prst="rect"/>
                   </pic:spPr>
@@ -1367,289 +1124,39 @@
       <w:r>
         <w:rPr>
           <w:i/>
-          <w:color w:val="5A5A5A"/>
+          <w:color w:val="505050"/>
           <w:sz w:val="18"/>
+          <w:rFonts w:eastAsia="宋体"/>
         </w:rPr>
-        <w:t>图 4  CUDA 版本超算输出 v3_output.ppm 转 JPG，尺寸为 400×300。</w:t>
-      </w:r>
-    </w:p>
-    <w:p>
-      <w:pPr>
-        <w:pStyle w:val="Heading1"/>
-      </w:pPr>
-      <w:r>
-        <w:t>8. 扩展展示场景</w:t>
-      </w:r>
-    </w:p>
-    <w:p>
-      <w:pPr>
-        <w:ind w:firstLine="420"/>
-      </w:pPr>
-      <w:r>
-        <w:t>为了让结果更接近图形渲染和游戏/科幻画面的展示需求，项目增加了程序化展示场景，包括黑洞吸积盘、城市追车和雪地赛道超跑。这些场景由程序生成，不依赖商业游戏资源或外部贴图。</w:t>
+        <w:t>图 3  CUDA 版本输出 v3_output.ppm 转换后的渲染结果</w:t>
       </w:r>
     </w:p>
     <w:tbl>
       <w:tblPr>
-        <w:tblW w:type="dxa" w:w="9360"/>
+        <w:tblW w:type="dxa" w:w="8600"/>
         <w:jc w:val="center"/>
         <w:tblLook w:firstColumn="1" w:firstRow="1" w:lastColumn="0" w:lastRow="0" w:noHBand="0" w:noVBand="1" w:val="04A0"/>
       </w:tblPr>
       <w:tblGrid>
-        <w:gridCol w:w="4896"/>
-        <w:gridCol w:w="4896"/>
+        <w:gridCol w:w="1733"/>
+        <w:gridCol w:w="1733"/>
+        <w:gridCol w:w="1733"/>
+        <w:gridCol w:w="1733"/>
+        <w:gridCol w:w="1733"/>
       </w:tblGrid>
       <w:tr>
         <w:tc>
           <w:tcPr>
-            <w:tcW w:type="dxa" w:w="4896"/>
+            <w:tcW w:type="dxa" w:w="1733"/>
+            <w:shd w:fill="EDEDED"/>
             <w:vAlign w:val="center"/>
             <w:tcBorders>
-              <w:top w:val="single" w:sz="4" w:space="0" w:color="FFFFFF"/>
-              <w:left w:val="single" w:sz="4" w:space="0" w:color="FFFFFF"/>
-              <w:bottom w:val="single" w:sz="4" w:space="0" w:color="FFFFFF"/>
-              <w:right w:val="single" w:sz="4" w:space="0" w:color="FFFFFF"/>
-              <w:insideH w:val="single" w:sz="4" w:space="0" w:color="FFFFFF"/>
-              <w:insideV w:val="single" w:sz="4" w:space="0" w:color="FFFFFF"/>
-            </w:tcBorders>
-          </w:tcPr>
-          <w:p>
-            <w:pPr>
-              <w:jc w:val="center"/>
-            </w:pPr>
-            <w:r>
-              <w:drawing>
-                <wp:inline xmlns:a="http://schemas.openxmlformats.org/drawingml/2006/main" xmlns:pic="http://schemas.openxmlformats.org/drawingml/2006/picture">
-                  <wp:extent cx="2743200" cy="1543050"/>
-                  <wp:docPr id="4" name="Picture 4"/>
-                  <wp:cNvGraphicFramePr>
-                    <a:graphicFrameLocks noChangeAspect="1"/>
-                  </wp:cNvGraphicFramePr>
-                  <a:graphic>
-                    <a:graphicData uri="http://schemas.openxmlformats.org/drawingml/2006/picture">
-                      <pic:pic>
-                        <pic:nvPicPr>
-                          <pic:cNvPr id="0" name="showcase_blackhole_preview.png"/>
-                          <pic:cNvPicPr/>
-                        </pic:nvPicPr>
-                        <pic:blipFill>
-                          <a:blip r:embed="rId14"/>
-                          <a:stretch>
-                            <a:fillRect/>
-                          </a:stretch>
-                        </pic:blipFill>
-                        <pic:spPr>
-                          <a:xfrm>
-                            <a:off x="0" y="0"/>
-                            <a:ext cx="2743200" cy="1543050"/>
-                          </a:xfrm>
-                          <a:prstGeom prst="rect"/>
-                        </pic:spPr>
-                      </pic:pic>
-                    </a:graphicData>
-                  </a:graphic>
-                </wp:inline>
-              </w:drawing>
-            </w:r>
-          </w:p>
-        </w:tc>
-        <w:tc>
-          <w:tcPr>
-            <w:tcW w:type="dxa" w:w="4896"/>
-            <w:vAlign w:val="center"/>
-            <w:tcBorders>
-              <w:top w:val="single" w:sz="4" w:space="0" w:color="FFFFFF"/>
-              <w:left w:val="single" w:sz="4" w:space="0" w:color="FFFFFF"/>
-              <w:bottom w:val="single" w:sz="4" w:space="0" w:color="FFFFFF"/>
-              <w:right w:val="single" w:sz="4" w:space="0" w:color="FFFFFF"/>
-              <w:insideH w:val="single" w:sz="4" w:space="0" w:color="FFFFFF"/>
-              <w:insideV w:val="single" w:sz="4" w:space="0" w:color="FFFFFF"/>
-            </w:tcBorders>
-          </w:tcPr>
-          <w:p>
-            <w:pPr>
-              <w:jc w:val="center"/>
-            </w:pPr>
-            <w:r>
-              <w:drawing>
-                <wp:inline xmlns:a="http://schemas.openxmlformats.org/drawingml/2006/main" xmlns:pic="http://schemas.openxmlformats.org/drawingml/2006/picture">
-                  <wp:extent cx="2743200" cy="1543050"/>
-                  <wp:docPr id="5" name="Picture 5"/>
-                  <wp:cNvGraphicFramePr>
-                    <a:graphicFrameLocks noChangeAspect="1"/>
-                  </wp:cNvGraphicFramePr>
-                  <a:graphic>
-                    <a:graphicData uri="http://schemas.openxmlformats.org/drawingml/2006/picture">
-                      <pic:pic>
-                        <pic:nvPicPr>
-                          <pic:cNvPr id="0" name="showcase_city_drive_preview.png"/>
-                          <pic:cNvPicPr/>
-                        </pic:nvPicPr>
-                        <pic:blipFill>
-                          <a:blip r:embed="rId15"/>
-                          <a:stretch>
-                            <a:fillRect/>
-                          </a:stretch>
-                        </pic:blipFill>
-                        <pic:spPr>
-                          <a:xfrm>
-                            <a:off x="0" y="0"/>
-                            <a:ext cx="2743200" cy="1543050"/>
-                          </a:xfrm>
-                          <a:prstGeom prst="rect"/>
-                        </pic:spPr>
-                      </pic:pic>
-                    </a:graphicData>
-                  </a:graphic>
-                </wp:inline>
-              </w:drawing>
-            </w:r>
-          </w:p>
-        </w:tc>
-      </w:tr>
-      <w:tr>
-        <w:tc>
-          <w:tcPr>
-            <w:tcW w:type="dxa" w:w="4896"/>
-            <w:vAlign w:val="center"/>
-            <w:tcBorders>
-              <w:top w:val="single" w:sz="4" w:space="0" w:color="FFFFFF"/>
-              <w:left w:val="single" w:sz="4" w:space="0" w:color="FFFFFF"/>
-              <w:bottom w:val="single" w:sz="4" w:space="0" w:color="FFFFFF"/>
-              <w:right w:val="single" w:sz="4" w:space="0" w:color="FFFFFF"/>
-              <w:insideH w:val="single" w:sz="4" w:space="0" w:color="FFFFFF"/>
-              <w:insideV w:val="single" w:sz="4" w:space="0" w:color="FFFFFF"/>
-            </w:tcBorders>
-          </w:tcPr>
-          <w:p>
-            <w:pPr>
-              <w:jc w:val="center"/>
-            </w:pPr>
-            <w:r>
-              <w:rPr>
-                <w:i/>
-                <w:color w:val="5A5A5A"/>
-                <w:sz w:val="18"/>
-              </w:rPr>
-              <w:t>图 5(a)  程序化黑洞吸积盘预览</w:t>
-            </w:r>
-          </w:p>
-        </w:tc>
-        <w:tc>
-          <w:tcPr>
-            <w:tcW w:type="dxa" w:w="4896"/>
-            <w:vAlign w:val="center"/>
-            <w:tcBorders>
-              <w:top w:val="single" w:sz="4" w:space="0" w:color="FFFFFF"/>
-              <w:left w:val="single" w:sz="4" w:space="0" w:color="FFFFFF"/>
-              <w:bottom w:val="single" w:sz="4" w:space="0" w:color="FFFFFF"/>
-              <w:right w:val="single" w:sz="4" w:space="0" w:color="FFFFFF"/>
-              <w:insideH w:val="single" w:sz="4" w:space="0" w:color="FFFFFF"/>
-              <w:insideV w:val="single" w:sz="4" w:space="0" w:color="FFFFFF"/>
-            </w:tcBorders>
-          </w:tcPr>
-          <w:p>
-            <w:pPr>
-              <w:jc w:val="center"/>
-            </w:pPr>
-            <w:r>
-              <w:rPr>
-                <w:i/>
-                <w:color w:val="5A5A5A"/>
-                <w:sz w:val="18"/>
-              </w:rPr>
-              <w:t>图 5(b)  程序化城市追车预览</w:t>
-            </w:r>
-          </w:p>
-        </w:tc>
-      </w:tr>
-    </w:tbl>
-    <w:p>
-      <w:pPr>
-        <w:jc w:val="center"/>
-      </w:pPr>
-      <w:r>
-        <w:drawing>
-          <wp:inline xmlns:a="http://schemas.openxmlformats.org/drawingml/2006/main" xmlns:pic="http://schemas.openxmlformats.org/drawingml/2006/picture">
-            <wp:extent cx="4389120" cy="2468880"/>
-            <wp:docPr id="6" name="Picture 6"/>
-            <wp:cNvGraphicFramePr>
-              <a:graphicFrameLocks noChangeAspect="1"/>
-            </wp:cNvGraphicFramePr>
-            <a:graphic>
-              <a:graphicData uri="http://schemas.openxmlformats.org/drawingml/2006/picture">
-                <pic:pic>
-                  <pic:nvPicPr>
-                    <pic:cNvPr id="0" name="showcase_snow_gt_preview.png"/>
-                    <pic:cNvPicPr/>
-                  </pic:nvPicPr>
-                  <pic:blipFill>
-                    <a:blip r:embed="rId16"/>
-                    <a:stretch>
-                      <a:fillRect/>
-                    </a:stretch>
-                  </pic:blipFill>
-                  <pic:spPr>
-                    <a:xfrm>
-                      <a:off x="0" y="0"/>
-                      <a:ext cx="4389120" cy="2468880"/>
-                    </a:xfrm>
-                    <a:prstGeom prst="rect"/>
-                  </pic:spPr>
-                </pic:pic>
-              </a:graphicData>
-            </a:graphic>
-          </wp:inline>
-        </w:drawing>
-      </w:r>
-    </w:p>
-    <w:p>
-      <w:pPr>
-        <w:spacing w:after="120"/>
-        <w:jc w:val="center"/>
-      </w:pPr>
-      <w:r>
-        <w:rPr>
-          <w:i/>
-          <w:color w:val="5A5A5A"/>
-          <w:sz w:val="18"/>
-        </w:rPr>
-        <w:t>图 6  程序化雪地赛道超跑预览。</w:t>
-      </w:r>
-    </w:p>
-    <w:p>
-      <w:pPr>
-        <w:pStyle w:val="Heading1"/>
-      </w:pPr>
-      <w:r>
-        <w:t>9. 性能结果与分析</w:t>
-      </w:r>
-    </w:p>
-    <w:tbl>
-      <w:tblPr>
-        <w:tblW w:type="dxa" w:w="9360"/>
-        <w:jc w:val="center"/>
-        <w:tblLook w:firstColumn="1" w:firstRow="1" w:lastColumn="0" w:lastRow="0" w:noHBand="0" w:noVBand="1" w:val="04A0"/>
-      </w:tblPr>
-      <w:tblGrid>
-        <w:gridCol w:w="2448"/>
-        <w:gridCol w:w="2448"/>
-        <w:gridCol w:w="2448"/>
-        <w:gridCol w:w="2448"/>
-      </w:tblGrid>
-      <w:tr>
-        <w:tc>
-          <w:tcPr>
-            <w:tcW w:type="dxa" w:w="2448"/>
-            <w:shd w:fill="E8EEF5"/>
-            <w:vAlign w:val="center"/>
-            <w:tcBorders>
-              <w:top w:val="single" w:sz="4" w:space="0" w:color="D9E2EC"/>
-              <w:left w:val="single" w:sz="4" w:space="0" w:color="D9E2EC"/>
-              <w:bottom w:val="single" w:sz="4" w:space="0" w:color="D9E2EC"/>
-              <w:right w:val="single" w:sz="4" w:space="0" w:color="D9E2EC"/>
-              <w:insideH w:val="single" w:sz="4" w:space="0" w:color="D9E2EC"/>
-              <w:insideV w:val="single" w:sz="4" w:space="0" w:color="D9E2EC"/>
+              <w:top w:val="single" w:sz="4" w:space="0" w:color="D9D9D9"/>
+              <w:left w:val="single" w:sz="4" w:space="0" w:color="D9D9D9"/>
+              <w:bottom w:val="single" w:sz="4" w:space="0" w:color="D9D9D9"/>
+              <w:right w:val="single" w:sz="4" w:space="0" w:color="D9D9D9"/>
+              <w:insideH w:val="single" w:sz="4" w:space="0" w:color="D9D9D9"/>
+              <w:insideV w:val="single" w:sz="4" w:space="0" w:color="D9D9D9"/>
             </w:tcBorders>
           </w:tcPr>
           <w:p>
@@ -1664,16 +1171,16 @@
         </w:tc>
         <w:tc>
           <w:tcPr>
-            <w:tcW w:type="dxa" w:w="2448"/>
-            <w:shd w:fill="E8EEF5"/>
+            <w:tcW w:type="dxa" w:w="1733"/>
+            <w:shd w:fill="EDEDED"/>
             <w:vAlign w:val="center"/>
             <w:tcBorders>
-              <w:top w:val="single" w:sz="4" w:space="0" w:color="D9E2EC"/>
-              <w:left w:val="single" w:sz="4" w:space="0" w:color="D9E2EC"/>
-              <w:bottom w:val="single" w:sz="4" w:space="0" w:color="D9E2EC"/>
-              <w:right w:val="single" w:sz="4" w:space="0" w:color="D9E2EC"/>
-              <w:insideH w:val="single" w:sz="4" w:space="0" w:color="D9E2EC"/>
-              <w:insideV w:val="single" w:sz="4" w:space="0" w:color="D9E2EC"/>
+              <w:top w:val="single" w:sz="4" w:space="0" w:color="D9D9D9"/>
+              <w:left w:val="single" w:sz="4" w:space="0" w:color="D9D9D9"/>
+              <w:bottom w:val="single" w:sz="4" w:space="0" w:color="D9D9D9"/>
+              <w:right w:val="single" w:sz="4" w:space="0" w:color="D9D9D9"/>
+              <w:insideH w:val="single" w:sz="4" w:space="0" w:color="D9D9D9"/>
+              <w:insideV w:val="single" w:sz="4" w:space="0" w:color="D9D9D9"/>
             </w:tcBorders>
           </w:tcPr>
           <w:p>
@@ -1682,22 +1189,22 @@
               <w:jc w:val="center"/>
             </w:pPr>
             <w:r>
-              <w:t>线程数</w:t>
+              <w:t>并行方式</w:t>
             </w:r>
           </w:p>
         </w:tc>
         <w:tc>
           <w:tcPr>
-            <w:tcW w:type="dxa" w:w="2448"/>
-            <w:shd w:fill="E8EEF5"/>
+            <w:tcW w:type="dxa" w:w="1733"/>
+            <w:shd w:fill="EDEDED"/>
             <w:vAlign w:val="center"/>
             <w:tcBorders>
-              <w:top w:val="single" w:sz="4" w:space="0" w:color="D9E2EC"/>
-              <w:left w:val="single" w:sz="4" w:space="0" w:color="D9E2EC"/>
-              <w:bottom w:val="single" w:sz="4" w:space="0" w:color="D9E2EC"/>
-              <w:right w:val="single" w:sz="4" w:space="0" w:color="D9E2EC"/>
-              <w:insideH w:val="single" w:sz="4" w:space="0" w:color="D9E2EC"/>
-              <w:insideV w:val="single" w:sz="4" w:space="0" w:color="D9E2EC"/>
+              <w:top w:val="single" w:sz="4" w:space="0" w:color="D9D9D9"/>
+              <w:left w:val="single" w:sz="4" w:space="0" w:color="D9D9D9"/>
+              <w:bottom w:val="single" w:sz="4" w:space="0" w:color="D9D9D9"/>
+              <w:right w:val="single" w:sz="4" w:space="0" w:color="D9D9D9"/>
+              <w:insideH w:val="single" w:sz="4" w:space="0" w:color="D9D9D9"/>
+              <w:insideV w:val="single" w:sz="4" w:space="0" w:color="D9D9D9"/>
             </w:tcBorders>
           </w:tcPr>
           <w:p>
@@ -1706,22 +1213,46 @@
               <w:jc w:val="center"/>
             </w:pPr>
             <w:r>
-              <w:t>运行时间 / s</w:t>
+              <w:t>测试参数</w:t>
             </w:r>
           </w:p>
         </w:tc>
         <w:tc>
           <w:tcPr>
-            <w:tcW w:type="dxa" w:w="2448"/>
-            <w:shd w:fill="E8EEF5"/>
+            <w:tcW w:type="dxa" w:w="1733"/>
+            <w:shd w:fill="EDEDED"/>
             <w:vAlign w:val="center"/>
             <w:tcBorders>
-              <w:top w:val="single" w:sz="4" w:space="0" w:color="D9E2EC"/>
-              <w:left w:val="single" w:sz="4" w:space="0" w:color="D9E2EC"/>
-              <w:bottom w:val="single" w:sz="4" w:space="0" w:color="D9E2EC"/>
-              <w:right w:val="single" w:sz="4" w:space="0" w:color="D9E2EC"/>
-              <w:insideH w:val="single" w:sz="4" w:space="0" w:color="D9E2EC"/>
-              <w:insideV w:val="single" w:sz="4" w:space="0" w:color="D9E2EC"/>
+              <w:top w:val="single" w:sz="4" w:space="0" w:color="D9D9D9"/>
+              <w:left w:val="single" w:sz="4" w:space="0" w:color="D9D9D9"/>
+              <w:bottom w:val="single" w:sz="4" w:space="0" w:color="D9D9D9"/>
+              <w:right w:val="single" w:sz="4" w:space="0" w:color="D9D9D9"/>
+              <w:insideH w:val="single" w:sz="4" w:space="0" w:color="D9D9D9"/>
+              <w:insideV w:val="single" w:sz="4" w:space="0" w:color="D9D9D9"/>
+            </w:tcBorders>
+          </w:tcPr>
+          <w:p>
+            <w:pPr>
+              <w:spacing w:after="40"/>
+              <w:jc w:val="center"/>
+            </w:pPr>
+            <w:r>
+              <w:t>运行时间/s</w:t>
+            </w:r>
+          </w:p>
+        </w:tc>
+        <w:tc>
+          <w:tcPr>
+            <w:tcW w:type="dxa" w:w="1733"/>
+            <w:shd w:fill="EDEDED"/>
+            <w:vAlign w:val="center"/>
+            <w:tcBorders>
+              <w:top w:val="single" w:sz="4" w:space="0" w:color="D9D9D9"/>
+              <w:left w:val="single" w:sz="4" w:space="0" w:color="D9D9D9"/>
+              <w:bottom w:val="single" w:sz="4" w:space="0" w:color="D9D9D9"/>
+              <w:right w:val="single" w:sz="4" w:space="0" w:color="D9D9D9"/>
+              <w:insideH w:val="single" w:sz="4" w:space="0" w:color="D9D9D9"/>
+              <w:insideV w:val="single" w:sz="4" w:space="0" w:color="D9D9D9"/>
             </w:tcBorders>
           </w:tcPr>
           <w:p>
@@ -1738,15 +1269,15 @@
       <w:tr>
         <w:tc>
           <w:tcPr>
-            <w:tcW w:type="dxa" w:w="2448"/>
+            <w:tcW w:type="dxa" w:w="1733"/>
             <w:vAlign w:val="center"/>
             <w:tcBorders>
-              <w:top w:val="single" w:sz="4" w:space="0" w:color="D9E2EC"/>
-              <w:left w:val="single" w:sz="4" w:space="0" w:color="D9E2EC"/>
-              <w:bottom w:val="single" w:sz="4" w:space="0" w:color="D9E2EC"/>
-              <w:right w:val="single" w:sz="4" w:space="0" w:color="D9E2EC"/>
-              <w:insideH w:val="single" w:sz="4" w:space="0" w:color="D9E2EC"/>
-              <w:insideV w:val="single" w:sz="4" w:space="0" w:color="D9E2EC"/>
+              <w:top w:val="single" w:sz="4" w:space="0" w:color="D9D9D9"/>
+              <w:left w:val="single" w:sz="4" w:space="0" w:color="D9D9D9"/>
+              <w:bottom w:val="single" w:sz="4" w:space="0" w:color="D9D9D9"/>
+              <w:right w:val="single" w:sz="4" w:space="0" w:color="D9D9D9"/>
+              <w:insideH w:val="single" w:sz="4" w:space="0" w:color="D9D9D9"/>
+              <w:insideV w:val="single" w:sz="4" w:space="0" w:color="D9D9D9"/>
             </w:tcBorders>
           </w:tcPr>
           <w:p>
@@ -1761,15 +1292,15 @@
         </w:tc>
         <w:tc>
           <w:tcPr>
-            <w:tcW w:type="dxa" w:w="2448"/>
+            <w:tcW w:type="dxa" w:w="1733"/>
             <w:vAlign w:val="center"/>
             <w:tcBorders>
-              <w:top w:val="single" w:sz="4" w:space="0" w:color="D9E2EC"/>
-              <w:left w:val="single" w:sz="4" w:space="0" w:color="D9E2EC"/>
-              <w:bottom w:val="single" w:sz="4" w:space="0" w:color="D9E2EC"/>
-              <w:right w:val="single" w:sz="4" w:space="0" w:color="D9E2EC"/>
-              <w:insideH w:val="single" w:sz="4" w:space="0" w:color="D9E2EC"/>
-              <w:insideV w:val="single" w:sz="4" w:space="0" w:color="D9E2EC"/>
+              <w:top w:val="single" w:sz="4" w:space="0" w:color="D9D9D9"/>
+              <w:left w:val="single" w:sz="4" w:space="0" w:color="D9D9D9"/>
+              <w:bottom w:val="single" w:sz="4" w:space="0" w:color="D9D9D9"/>
+              <w:right w:val="single" w:sz="4" w:space="0" w:color="D9D9D9"/>
+              <w:insideH w:val="single" w:sz="4" w:space="0" w:color="D9D9D9"/>
+              <w:insideV w:val="single" w:sz="4" w:space="0" w:color="D9D9D9"/>
             </w:tcBorders>
           </w:tcPr>
           <w:p>
@@ -1778,21 +1309,44 @@
               <w:jc w:val="center"/>
             </w:pPr>
             <w:r>
-              <w:t>1</w:t>
+              <w:t>单线程 CPU</w:t>
             </w:r>
           </w:p>
         </w:tc>
         <w:tc>
           <w:tcPr>
-            <w:tcW w:type="dxa" w:w="2448"/>
+            <w:tcW w:type="dxa" w:w="1733"/>
             <w:vAlign w:val="center"/>
             <w:tcBorders>
-              <w:top w:val="single" w:sz="4" w:space="0" w:color="D9E2EC"/>
-              <w:left w:val="single" w:sz="4" w:space="0" w:color="D9E2EC"/>
-              <w:bottom w:val="single" w:sz="4" w:space="0" w:color="D9E2EC"/>
-              <w:right w:val="single" w:sz="4" w:space="0" w:color="D9E2EC"/>
-              <w:insideH w:val="single" w:sz="4" w:space="0" w:color="D9E2EC"/>
-              <w:insideV w:val="single" w:sz="4" w:space="0" w:color="D9E2EC"/>
+              <w:top w:val="single" w:sz="4" w:space="0" w:color="D9D9D9"/>
+              <w:left w:val="single" w:sz="4" w:space="0" w:color="D9D9D9"/>
+              <w:bottom w:val="single" w:sz="4" w:space="0" w:color="D9D9D9"/>
+              <w:right w:val="single" w:sz="4" w:space="0" w:color="D9D9D9"/>
+              <w:insideH w:val="single" w:sz="4" w:space="0" w:color="D9D9D9"/>
+              <w:insideV w:val="single" w:sz="4" w:space="0" w:color="D9D9D9"/>
+            </w:tcBorders>
+          </w:tcPr>
+          <w:p>
+            <w:pPr>
+              <w:spacing w:after="40"/>
+              <w:jc w:val="center"/>
+            </w:pPr>
+            <w:r>
+              <w:t>400×300, 64 samples</w:t>
+            </w:r>
+          </w:p>
+        </w:tc>
+        <w:tc>
+          <w:tcPr>
+            <w:tcW w:type="dxa" w:w="1733"/>
+            <w:vAlign w:val="center"/>
+            <w:tcBorders>
+              <w:top w:val="single" w:sz="4" w:space="0" w:color="D9D9D9"/>
+              <w:left w:val="single" w:sz="4" w:space="0" w:color="D9D9D9"/>
+              <w:bottom w:val="single" w:sz="4" w:space="0" w:color="D9D9D9"/>
+              <w:right w:val="single" w:sz="4" w:space="0" w:color="D9D9D9"/>
+              <w:insideH w:val="single" w:sz="4" w:space="0" w:color="D9D9D9"/>
+              <w:insideV w:val="single" w:sz="4" w:space="0" w:color="D9D9D9"/>
             </w:tcBorders>
           </w:tcPr>
           <w:p>
@@ -1807,15 +1361,15 @@
         </w:tc>
         <w:tc>
           <w:tcPr>
-            <w:tcW w:type="dxa" w:w="2448"/>
+            <w:tcW w:type="dxa" w:w="1733"/>
             <w:vAlign w:val="center"/>
             <w:tcBorders>
-              <w:top w:val="single" w:sz="4" w:space="0" w:color="D9E2EC"/>
-              <w:left w:val="single" w:sz="4" w:space="0" w:color="D9E2EC"/>
-              <w:bottom w:val="single" w:sz="4" w:space="0" w:color="D9E2EC"/>
-              <w:right w:val="single" w:sz="4" w:space="0" w:color="D9E2EC"/>
-              <w:insideH w:val="single" w:sz="4" w:space="0" w:color="D9E2EC"/>
-              <w:insideV w:val="single" w:sz="4" w:space="0" w:color="D9E2EC"/>
+              <w:top w:val="single" w:sz="4" w:space="0" w:color="D9D9D9"/>
+              <w:left w:val="single" w:sz="4" w:space="0" w:color="D9D9D9"/>
+              <w:bottom w:val="single" w:sz="4" w:space="0" w:color="D9D9D9"/>
+              <w:right w:val="single" w:sz="4" w:space="0" w:color="D9D9D9"/>
+              <w:insideH w:val="single" w:sz="4" w:space="0" w:color="D9D9D9"/>
+              <w:insideV w:val="single" w:sz="4" w:space="0" w:color="D9D9D9"/>
             </w:tcBorders>
           </w:tcPr>
           <w:p>
@@ -1832,15 +1386,15 @@
       <w:tr>
         <w:tc>
           <w:tcPr>
-            <w:tcW w:type="dxa" w:w="2448"/>
+            <w:tcW w:type="dxa" w:w="1733"/>
             <w:vAlign w:val="center"/>
             <w:tcBorders>
-              <w:top w:val="single" w:sz="4" w:space="0" w:color="D9E2EC"/>
-              <w:left w:val="single" w:sz="4" w:space="0" w:color="D9E2EC"/>
-              <w:bottom w:val="single" w:sz="4" w:space="0" w:color="D9E2EC"/>
-              <w:right w:val="single" w:sz="4" w:space="0" w:color="D9E2EC"/>
-              <w:insideH w:val="single" w:sz="4" w:space="0" w:color="D9E2EC"/>
-              <w:insideV w:val="single" w:sz="4" w:space="0" w:color="D9E2EC"/>
+              <w:top w:val="single" w:sz="4" w:space="0" w:color="D9D9D9"/>
+              <w:left w:val="single" w:sz="4" w:space="0" w:color="D9D9D9"/>
+              <w:bottom w:val="single" w:sz="4" w:space="0" w:color="D9D9D9"/>
+              <w:right w:val="single" w:sz="4" w:space="0" w:color="D9D9D9"/>
+              <w:insideH w:val="single" w:sz="4" w:space="0" w:color="D9D9D9"/>
+              <w:insideV w:val="single" w:sz="4" w:space="0" w:color="D9D9D9"/>
             </w:tcBorders>
           </w:tcPr>
           <w:p>
@@ -1855,15 +1409,15 @@
         </w:tc>
         <w:tc>
           <w:tcPr>
-            <w:tcW w:type="dxa" w:w="2448"/>
+            <w:tcW w:type="dxa" w:w="1733"/>
             <w:vAlign w:val="center"/>
             <w:tcBorders>
-              <w:top w:val="single" w:sz="4" w:space="0" w:color="D9E2EC"/>
-              <w:left w:val="single" w:sz="4" w:space="0" w:color="D9E2EC"/>
-              <w:bottom w:val="single" w:sz="4" w:space="0" w:color="D9E2EC"/>
-              <w:right w:val="single" w:sz="4" w:space="0" w:color="D9E2EC"/>
-              <w:insideH w:val="single" w:sz="4" w:space="0" w:color="D9E2EC"/>
-              <w:insideV w:val="single" w:sz="4" w:space="0" w:color="D9E2EC"/>
+              <w:top w:val="single" w:sz="4" w:space="0" w:color="D9D9D9"/>
+              <w:left w:val="single" w:sz="4" w:space="0" w:color="D9D9D9"/>
+              <w:bottom w:val="single" w:sz="4" w:space="0" w:color="D9D9D9"/>
+              <w:right w:val="single" w:sz="4" w:space="0" w:color="D9D9D9"/>
+              <w:insideH w:val="single" w:sz="4" w:space="0" w:color="D9D9D9"/>
+              <w:insideV w:val="single" w:sz="4" w:space="0" w:color="D9D9D9"/>
             </w:tcBorders>
           </w:tcPr>
           <w:p>
@@ -1872,21 +1426,44 @@
               <w:jc w:val="center"/>
             </w:pPr>
             <w:r>
-              <w:t>8</w:t>
+              <w:t>8 线程 CPU</w:t>
             </w:r>
           </w:p>
         </w:tc>
         <w:tc>
           <w:tcPr>
-            <w:tcW w:type="dxa" w:w="2448"/>
+            <w:tcW w:type="dxa" w:w="1733"/>
             <w:vAlign w:val="center"/>
             <w:tcBorders>
-              <w:top w:val="single" w:sz="4" w:space="0" w:color="D9E2EC"/>
-              <w:left w:val="single" w:sz="4" w:space="0" w:color="D9E2EC"/>
-              <w:bottom w:val="single" w:sz="4" w:space="0" w:color="D9E2EC"/>
-              <w:right w:val="single" w:sz="4" w:space="0" w:color="D9E2EC"/>
-              <w:insideH w:val="single" w:sz="4" w:space="0" w:color="D9E2EC"/>
-              <w:insideV w:val="single" w:sz="4" w:space="0" w:color="D9E2EC"/>
+              <w:top w:val="single" w:sz="4" w:space="0" w:color="D9D9D9"/>
+              <w:left w:val="single" w:sz="4" w:space="0" w:color="D9D9D9"/>
+              <w:bottom w:val="single" w:sz="4" w:space="0" w:color="D9D9D9"/>
+              <w:right w:val="single" w:sz="4" w:space="0" w:color="D9D9D9"/>
+              <w:insideH w:val="single" w:sz="4" w:space="0" w:color="D9D9D9"/>
+              <w:insideV w:val="single" w:sz="4" w:space="0" w:color="D9D9D9"/>
+            </w:tcBorders>
+          </w:tcPr>
+          <w:p>
+            <w:pPr>
+              <w:spacing w:after="40"/>
+              <w:jc w:val="center"/>
+            </w:pPr>
+            <w:r>
+              <w:t>400×300, 64 samples</w:t>
+            </w:r>
+          </w:p>
+        </w:tc>
+        <w:tc>
+          <w:tcPr>
+            <w:tcW w:type="dxa" w:w="1733"/>
+            <w:vAlign w:val="center"/>
+            <w:tcBorders>
+              <w:top w:val="single" w:sz="4" w:space="0" w:color="D9D9D9"/>
+              <w:left w:val="single" w:sz="4" w:space="0" w:color="D9D9D9"/>
+              <w:bottom w:val="single" w:sz="4" w:space="0" w:color="D9D9D9"/>
+              <w:right w:val="single" w:sz="4" w:space="0" w:color="D9D9D9"/>
+              <w:insideH w:val="single" w:sz="4" w:space="0" w:color="D9D9D9"/>
+              <w:insideV w:val="single" w:sz="4" w:space="0" w:color="D9D9D9"/>
             </w:tcBorders>
           </w:tcPr>
           <w:p>
@@ -1901,15 +1478,15 @@
         </w:tc>
         <w:tc>
           <w:tcPr>
-            <w:tcW w:type="dxa" w:w="2448"/>
+            <w:tcW w:type="dxa" w:w="1733"/>
             <w:vAlign w:val="center"/>
             <w:tcBorders>
-              <w:top w:val="single" w:sz="4" w:space="0" w:color="D9E2EC"/>
-              <w:left w:val="single" w:sz="4" w:space="0" w:color="D9E2EC"/>
-              <w:bottom w:val="single" w:sz="4" w:space="0" w:color="D9E2EC"/>
-              <w:right w:val="single" w:sz="4" w:space="0" w:color="D9E2EC"/>
-              <w:insideH w:val="single" w:sz="4" w:space="0" w:color="D9E2EC"/>
-              <w:insideV w:val="single" w:sz="4" w:space="0" w:color="D9E2EC"/>
+              <w:top w:val="single" w:sz="4" w:space="0" w:color="D9D9D9"/>
+              <w:left w:val="single" w:sz="4" w:space="0" w:color="D9D9D9"/>
+              <w:bottom w:val="single" w:sz="4" w:space="0" w:color="D9D9D9"/>
+              <w:right w:val="single" w:sz="4" w:space="0" w:color="D9D9D9"/>
+              <w:insideH w:val="single" w:sz="4" w:space="0" w:color="D9D9D9"/>
+              <w:insideV w:val="single" w:sz="4" w:space="0" w:color="D9D9D9"/>
             </w:tcBorders>
           </w:tcPr>
           <w:p>
@@ -1926,15 +1503,15 @@
       <w:tr>
         <w:tc>
           <w:tcPr>
-            <w:tcW w:type="dxa" w:w="2448"/>
+            <w:tcW w:type="dxa" w:w="1733"/>
             <w:vAlign w:val="center"/>
             <w:tcBorders>
-              <w:top w:val="single" w:sz="4" w:space="0" w:color="D9E2EC"/>
-              <w:left w:val="single" w:sz="4" w:space="0" w:color="D9E2EC"/>
-              <w:bottom w:val="single" w:sz="4" w:space="0" w:color="D9E2EC"/>
-              <w:right w:val="single" w:sz="4" w:space="0" w:color="D9E2EC"/>
-              <w:insideH w:val="single" w:sz="4" w:space="0" w:color="D9E2EC"/>
-              <w:insideV w:val="single" w:sz="4" w:space="0" w:color="D9E2EC"/>
+              <w:top w:val="single" w:sz="4" w:space="0" w:color="D9D9D9"/>
+              <w:left w:val="single" w:sz="4" w:space="0" w:color="D9D9D9"/>
+              <w:bottom w:val="single" w:sz="4" w:space="0" w:color="D9D9D9"/>
+              <w:right w:val="single" w:sz="4" w:space="0" w:color="D9D9D9"/>
+              <w:insideH w:val="single" w:sz="4" w:space="0" w:color="D9D9D9"/>
+              <w:insideV w:val="single" w:sz="4" w:space="0" w:color="D9D9D9"/>
             </w:tcBorders>
           </w:tcPr>
           <w:p>
@@ -1949,15 +1526,15 @@
         </w:tc>
         <w:tc>
           <w:tcPr>
-            <w:tcW w:type="dxa" w:w="2448"/>
+            <w:tcW w:type="dxa" w:w="1733"/>
             <w:vAlign w:val="center"/>
             <w:tcBorders>
-              <w:top w:val="single" w:sz="4" w:space="0" w:color="D9E2EC"/>
-              <w:left w:val="single" w:sz="4" w:space="0" w:color="D9E2EC"/>
-              <w:bottom w:val="single" w:sz="4" w:space="0" w:color="D9E2EC"/>
-              <w:right w:val="single" w:sz="4" w:space="0" w:color="D9E2EC"/>
-              <w:insideH w:val="single" w:sz="4" w:space="0" w:color="D9E2EC"/>
-              <w:insideV w:val="single" w:sz="4" w:space="0" w:color="D9E2EC"/>
+              <w:top w:val="single" w:sz="4" w:space="0" w:color="D9D9D9"/>
+              <w:left w:val="single" w:sz="4" w:space="0" w:color="D9D9D9"/>
+              <w:bottom w:val="single" w:sz="4" w:space="0" w:color="D9D9D9"/>
+              <w:right w:val="single" w:sz="4" w:space="0" w:color="D9D9D9"/>
+              <w:insideH w:val="single" w:sz="4" w:space="0" w:color="D9D9D9"/>
+              <w:insideV w:val="single" w:sz="4" w:space="0" w:color="D9D9D9"/>
             </w:tcBorders>
           </w:tcPr>
           <w:p>
@@ -1966,21 +1543,44 @@
               <w:jc w:val="center"/>
             </w:pPr>
             <w:r>
-              <w:t>GPU</w:t>
+              <w:t>GPU 并行</w:t>
             </w:r>
           </w:p>
         </w:tc>
         <w:tc>
           <w:tcPr>
-            <w:tcW w:type="dxa" w:w="2448"/>
+            <w:tcW w:type="dxa" w:w="1733"/>
             <w:vAlign w:val="center"/>
             <w:tcBorders>
-              <w:top w:val="single" w:sz="4" w:space="0" w:color="D9E2EC"/>
-              <w:left w:val="single" w:sz="4" w:space="0" w:color="D9E2EC"/>
-              <w:bottom w:val="single" w:sz="4" w:space="0" w:color="D9E2EC"/>
-              <w:right w:val="single" w:sz="4" w:space="0" w:color="D9E2EC"/>
-              <w:insideH w:val="single" w:sz="4" w:space="0" w:color="D9E2EC"/>
-              <w:insideV w:val="single" w:sz="4" w:space="0" w:color="D9E2EC"/>
+              <w:top w:val="single" w:sz="4" w:space="0" w:color="D9D9D9"/>
+              <w:left w:val="single" w:sz="4" w:space="0" w:color="D9D9D9"/>
+              <w:bottom w:val="single" w:sz="4" w:space="0" w:color="D9D9D9"/>
+              <w:right w:val="single" w:sz="4" w:space="0" w:color="D9D9D9"/>
+              <w:insideH w:val="single" w:sz="4" w:space="0" w:color="D9D9D9"/>
+              <w:insideV w:val="single" w:sz="4" w:space="0" w:color="D9D9D9"/>
+            </w:tcBorders>
+          </w:tcPr>
+          <w:p>
+            <w:pPr>
+              <w:spacing w:after="40"/>
+              <w:jc w:val="center"/>
+            </w:pPr>
+            <w:r>
+              <w:t>400×300, 64 samples</w:t>
+            </w:r>
+          </w:p>
+        </w:tc>
+        <w:tc>
+          <w:tcPr>
+            <w:tcW w:type="dxa" w:w="1733"/>
+            <w:vAlign w:val="center"/>
+            <w:tcBorders>
+              <w:top w:val="single" w:sz="4" w:space="0" w:color="D9D9D9"/>
+              <w:left w:val="single" w:sz="4" w:space="0" w:color="D9D9D9"/>
+              <w:bottom w:val="single" w:sz="4" w:space="0" w:color="D9D9D9"/>
+              <w:right w:val="single" w:sz="4" w:space="0" w:color="D9D9D9"/>
+              <w:insideH w:val="single" w:sz="4" w:space="0" w:color="D9D9D9"/>
+              <w:insideV w:val="single" w:sz="4" w:space="0" w:color="D9D9D9"/>
             </w:tcBorders>
           </w:tcPr>
           <w:p>
@@ -1995,15 +1595,15 @@
         </w:tc>
         <w:tc>
           <w:tcPr>
-            <w:tcW w:type="dxa" w:w="2448"/>
+            <w:tcW w:type="dxa" w:w="1733"/>
             <w:vAlign w:val="center"/>
             <w:tcBorders>
-              <w:top w:val="single" w:sz="4" w:space="0" w:color="D9E2EC"/>
-              <w:left w:val="single" w:sz="4" w:space="0" w:color="D9E2EC"/>
-              <w:bottom w:val="single" w:sz="4" w:space="0" w:color="D9E2EC"/>
-              <w:right w:val="single" w:sz="4" w:space="0" w:color="D9E2EC"/>
-              <w:insideH w:val="single" w:sz="4" w:space="0" w:color="D9E2EC"/>
-              <w:insideV w:val="single" w:sz="4" w:space="0" w:color="D9E2EC"/>
+              <w:top w:val="single" w:sz="4" w:space="0" w:color="D9D9D9"/>
+              <w:left w:val="single" w:sz="4" w:space="0" w:color="D9D9D9"/>
+              <w:bottom w:val="single" w:sz="4" w:space="0" w:color="D9D9D9"/>
+              <w:right w:val="single" w:sz="4" w:space="0" w:color="D9D9D9"/>
+              <w:insideH w:val="single" w:sz="4" w:space="0" w:color="D9D9D9"/>
+              <w:insideV w:val="single" w:sz="4" w:space="0" w:color="D9D9D9"/>
             </w:tcBorders>
           </w:tcPr>
           <w:p>
@@ -2026,49 +1626,480 @@
       <w:r>
         <w:rPr>
           <w:i/>
-          <w:color w:val="5A5A5A"/>
+          <w:color w:val="505050"/>
           <w:sz w:val="18"/>
+          <w:rFonts w:eastAsia="宋体"/>
         </w:rPr>
-        <w:t>表 1  400×300、64 samples 下的超算实测结果；OpenMP 8 线程效率约 50.3%，CUDA 相对串行加速约 310.07×。</w:t>
+        <w:t>表 1  串行、OpenMP 与 CUDA 三版本超算实测性能对比</w:t>
       </w:r>
     </w:p>
     <w:p>
       <w:pPr>
-        <w:ind w:firstLine="420"/>
+        <w:pStyle w:val="Heading2"/>
       </w:pPr>
       <w:r>
-        <w:t>由表 1 可见，OpenMP 8 线程版本将运行时间从 39.1013 s 降低到 9.72383 s，加速比约为 4.02×。CUDA 版本进一步将运行时间降低到 0.126103 s，相对串行版本加速约 310.07×，说明像素级光线追踪任务非常适合 GPU 大规模并行。</w:t>
+        <w:t>4.3 渲染效果展示</w:t>
       </w:r>
     </w:p>
     <w:p>
       <w:pPr>
+        <w:spacing w:after="100"/>
         <w:ind w:firstLine="420"/>
       </w:pPr>
       <w:r>
-        <w:t>OpenMP 加速比未达到理想值的原因主要包括：场景初始化和文件输出仍存在串行部分；不同像素追踪深度不同导致负载不均；动态调度和随机数生成带来额外开销。CUDA 版本速度提升更明显，是因为每个像素可映射到独立 GPU 线程，显卡可以同时调度大量线程隐藏访存延迟。但 CUDA 仍会受到分支发散、随机数状态访问和显存传输等因素影响。</w:t>
+        <w:t>下图为从超算结果和程序化展示场景中选取的代表性图片，用于说明程序不仅可以完成性能测试，也能生成具有游戏画面风格的可视化结果。</w:t>
       </w:r>
     </w:p>
     <w:tbl>
       <w:tblPr>
-        <w:tblW w:type="dxa" w:w="9360"/>
+        <w:tblW w:type="dxa" w:w="8600"/>
         <w:jc w:val="center"/>
         <w:tblLook w:firstColumn="1" w:firstRow="1" w:lastColumn="0" w:lastRow="0" w:noHBand="0" w:noVBand="1" w:val="04A0"/>
       </w:tblPr>
       <w:tblGrid>
-        <w:gridCol w:w="9792"/>
+        <w:gridCol w:w="4333"/>
+        <w:gridCol w:w="4333"/>
       </w:tblGrid>
       <w:tr>
         <w:tc>
           <w:tcPr>
-            <w:tcW w:type="dxa" w:w="9792"/>
-            <w:shd w:fill="F4F6F9"/>
+            <w:tcW w:type="dxa" w:w="4333"/>
+            <w:vAlign w:val="center"/>
             <w:tcBorders>
-              <w:top w:val="single" w:sz="4" w:space="0" w:color="CBD5E1"/>
-              <w:left w:val="single" w:sz="4" w:space="0" w:color="CBD5E1"/>
-              <w:bottom w:val="single" w:sz="4" w:space="0" w:color="CBD5E1"/>
-              <w:right w:val="single" w:sz="4" w:space="0" w:color="CBD5E1"/>
-              <w:insideH w:val="single" w:sz="4" w:space="0" w:color="CBD5E1"/>
-              <w:insideV w:val="single" w:sz="4" w:space="0" w:color="CBD5E1"/>
+              <w:top w:val="single" w:sz="4" w:space="0" w:color="FFFFFF"/>
+              <w:left w:val="single" w:sz="4" w:space="0" w:color="FFFFFF"/>
+              <w:bottom w:val="single" w:sz="4" w:space="0" w:color="FFFFFF"/>
+              <w:right w:val="single" w:sz="4" w:space="0" w:color="FFFFFF"/>
+              <w:insideH w:val="single" w:sz="4" w:space="0" w:color="FFFFFF"/>
+              <w:insideV w:val="single" w:sz="4" w:space="0" w:color="FFFFFF"/>
+            </w:tcBorders>
+          </w:tcPr>
+          <w:p>
+            <w:pPr>
+              <w:jc w:val="center"/>
+            </w:pPr>
+            <w:r>
+              <w:drawing>
+                <wp:inline xmlns:a="http://schemas.openxmlformats.org/drawingml/2006/main" xmlns:pic="http://schemas.openxmlformats.org/drawingml/2006/picture">
+                  <wp:extent cx="2651760" cy="1988820"/>
+                  <wp:docPr id="2" name="Picture 2"/>
+                  <wp:cNvGraphicFramePr>
+                    <a:graphicFrameLocks noChangeAspect="1"/>
+                  </wp:cNvGraphicFramePr>
+                  <a:graphic>
+                    <a:graphicData uri="http://schemas.openxmlformats.org/drawingml/2006/picture">
+                      <pic:pic>
+                        <pic:nvPicPr>
+                          <pic:cNvPr id="0" name="hpc_output_1.jpg"/>
+                          <pic:cNvPicPr/>
+                        </pic:nvPicPr>
+                        <pic:blipFill>
+                          <a:blip r:embed="rId12"/>
+                          <a:stretch>
+                            <a:fillRect/>
+                          </a:stretch>
+                        </pic:blipFill>
+                        <pic:spPr>
+                          <a:xfrm>
+                            <a:off x="0" y="0"/>
+                            <a:ext cx="2651760" cy="1988820"/>
+                          </a:xfrm>
+                          <a:prstGeom prst="rect"/>
+                        </pic:spPr>
+                      </pic:pic>
+                    </a:graphicData>
+                  </a:graphic>
+                </wp:inline>
+              </w:drawing>
+            </w:r>
+          </w:p>
+        </w:tc>
+        <w:tc>
+          <w:tcPr>
+            <w:tcW w:type="dxa" w:w="4333"/>
+            <w:vAlign w:val="center"/>
+            <w:tcBorders>
+              <w:top w:val="single" w:sz="4" w:space="0" w:color="FFFFFF"/>
+              <w:left w:val="single" w:sz="4" w:space="0" w:color="FFFFFF"/>
+              <w:bottom w:val="single" w:sz="4" w:space="0" w:color="FFFFFF"/>
+              <w:right w:val="single" w:sz="4" w:space="0" w:color="FFFFFF"/>
+              <w:insideH w:val="single" w:sz="4" w:space="0" w:color="FFFFFF"/>
+              <w:insideV w:val="single" w:sz="4" w:space="0" w:color="FFFFFF"/>
+            </w:tcBorders>
+          </w:tcPr>
+          <w:p>
+            <w:pPr>
+              <w:jc w:val="center"/>
+            </w:pPr>
+            <w:r>
+              <w:drawing>
+                <wp:inline xmlns:a="http://schemas.openxmlformats.org/drawingml/2006/main" xmlns:pic="http://schemas.openxmlformats.org/drawingml/2006/picture">
+                  <wp:extent cx="2651760" cy="1988820"/>
+                  <wp:docPr id="3" name="Picture 3"/>
+                  <wp:cNvGraphicFramePr>
+                    <a:graphicFrameLocks noChangeAspect="1"/>
+                  </wp:cNvGraphicFramePr>
+                  <a:graphic>
+                    <a:graphicData uri="http://schemas.openxmlformats.org/drawingml/2006/picture">
+                      <pic:pic>
+                        <pic:nvPicPr>
+                          <pic:cNvPr id="0" name="hpc_output_3.jpg"/>
+                          <pic:cNvPicPr/>
+                        </pic:nvPicPr>
+                        <pic:blipFill>
+                          <a:blip r:embed="rId13"/>
+                          <a:stretch>
+                            <a:fillRect/>
+                          </a:stretch>
+                        </pic:blipFill>
+                        <pic:spPr>
+                          <a:xfrm>
+                            <a:off x="0" y="0"/>
+                            <a:ext cx="2651760" cy="1988820"/>
+                          </a:xfrm>
+                          <a:prstGeom prst="rect"/>
+                        </pic:spPr>
+                      </pic:pic>
+                    </a:graphicData>
+                  </a:graphic>
+                </wp:inline>
+              </w:drawing>
+            </w:r>
+          </w:p>
+        </w:tc>
+      </w:tr>
+      <w:tr>
+        <w:tc>
+          <w:tcPr>
+            <w:tcW w:type="dxa" w:w="4333"/>
+            <w:vAlign w:val="center"/>
+            <w:tcBorders>
+              <w:top w:val="single" w:sz="4" w:space="0" w:color="FFFFFF"/>
+              <w:left w:val="single" w:sz="4" w:space="0" w:color="FFFFFF"/>
+              <w:bottom w:val="single" w:sz="4" w:space="0" w:color="FFFFFF"/>
+              <w:right w:val="single" w:sz="4" w:space="0" w:color="FFFFFF"/>
+              <w:insideH w:val="single" w:sz="4" w:space="0" w:color="FFFFFF"/>
+              <w:insideV w:val="single" w:sz="4" w:space="0" w:color="FFFFFF"/>
+            </w:tcBorders>
+          </w:tcPr>
+          <w:p>
+            <w:pPr>
+              <w:jc w:val="center"/>
+            </w:pPr>
+            <w:r>
+              <w:rPr>
+                <w:i/>
+                <w:sz w:val="18"/>
+                <w:rFonts w:eastAsia="宋体"/>
+              </w:rPr>
+              <w:t>图 4(a)  超算输出 hpc_output_1.ppm</w:t>
+            </w:r>
+          </w:p>
+        </w:tc>
+        <w:tc>
+          <w:tcPr>
+            <w:tcW w:type="dxa" w:w="4333"/>
+            <w:vAlign w:val="center"/>
+            <w:tcBorders>
+              <w:top w:val="single" w:sz="4" w:space="0" w:color="FFFFFF"/>
+              <w:left w:val="single" w:sz="4" w:space="0" w:color="FFFFFF"/>
+              <w:bottom w:val="single" w:sz="4" w:space="0" w:color="FFFFFF"/>
+              <w:right w:val="single" w:sz="4" w:space="0" w:color="FFFFFF"/>
+              <w:insideH w:val="single" w:sz="4" w:space="0" w:color="FFFFFF"/>
+              <w:insideV w:val="single" w:sz="4" w:space="0" w:color="FFFFFF"/>
+            </w:tcBorders>
+          </w:tcPr>
+          <w:p>
+            <w:pPr>
+              <w:jc w:val="center"/>
+            </w:pPr>
+            <w:r>
+              <w:rPr>
+                <w:i/>
+                <w:sz w:val="18"/>
+                <w:rFonts w:eastAsia="宋体"/>
+              </w:rPr>
+              <w:t>图 4(b)  超算输出 hpc_output_3.ppm</w:t>
+            </w:r>
+          </w:p>
+        </w:tc>
+      </w:tr>
+    </w:tbl>
+    <w:tbl>
+      <w:tblPr>
+        <w:tblW w:type="dxa" w:w="8600"/>
+        <w:jc w:val="center"/>
+        <w:tblLook w:firstColumn="1" w:firstRow="1" w:lastColumn="0" w:lastRow="0" w:noHBand="0" w:noVBand="1" w:val="04A0"/>
+      </w:tblPr>
+      <w:tblGrid>
+        <w:gridCol w:w="4333"/>
+        <w:gridCol w:w="4333"/>
+      </w:tblGrid>
+      <w:tr>
+        <w:tc>
+          <w:tcPr>
+            <w:tcW w:type="dxa" w:w="4333"/>
+            <w:vAlign w:val="center"/>
+            <w:tcBorders>
+              <w:top w:val="single" w:sz="4" w:space="0" w:color="FFFFFF"/>
+              <w:left w:val="single" w:sz="4" w:space="0" w:color="FFFFFF"/>
+              <w:bottom w:val="single" w:sz="4" w:space="0" w:color="FFFFFF"/>
+              <w:right w:val="single" w:sz="4" w:space="0" w:color="FFFFFF"/>
+              <w:insideH w:val="single" w:sz="4" w:space="0" w:color="FFFFFF"/>
+              <w:insideV w:val="single" w:sz="4" w:space="0" w:color="FFFFFF"/>
+            </w:tcBorders>
+          </w:tcPr>
+          <w:p>
+            <w:pPr>
+              <w:jc w:val="center"/>
+            </w:pPr>
+            <w:r>
+              <w:drawing>
+                <wp:inline xmlns:a="http://schemas.openxmlformats.org/drawingml/2006/main" xmlns:pic="http://schemas.openxmlformats.org/drawingml/2006/picture">
+                  <wp:extent cx="2651760" cy="1491615"/>
+                  <wp:docPr id="4" name="Picture 4"/>
+                  <wp:cNvGraphicFramePr>
+                    <a:graphicFrameLocks noChangeAspect="1"/>
+                  </wp:cNvGraphicFramePr>
+                  <a:graphic>
+                    <a:graphicData uri="http://schemas.openxmlformats.org/drawingml/2006/picture">
+                      <pic:pic>
+                        <pic:nvPicPr>
+                          <pic:cNvPr id="0" name="showcase_city_drive_preview.png"/>
+                          <pic:cNvPicPr/>
+                        </pic:nvPicPr>
+                        <pic:blipFill>
+                          <a:blip r:embed="rId14"/>
+                          <a:stretch>
+                            <a:fillRect/>
+                          </a:stretch>
+                        </pic:blipFill>
+                        <pic:spPr>
+                          <a:xfrm>
+                            <a:off x="0" y="0"/>
+                            <a:ext cx="2651760" cy="1491615"/>
+                          </a:xfrm>
+                          <a:prstGeom prst="rect"/>
+                        </pic:spPr>
+                      </pic:pic>
+                    </a:graphicData>
+                  </a:graphic>
+                </wp:inline>
+              </w:drawing>
+            </w:r>
+          </w:p>
+        </w:tc>
+        <w:tc>
+          <w:tcPr>
+            <w:tcW w:type="dxa" w:w="4333"/>
+            <w:vAlign w:val="center"/>
+            <w:tcBorders>
+              <w:top w:val="single" w:sz="4" w:space="0" w:color="FFFFFF"/>
+              <w:left w:val="single" w:sz="4" w:space="0" w:color="FFFFFF"/>
+              <w:bottom w:val="single" w:sz="4" w:space="0" w:color="FFFFFF"/>
+              <w:right w:val="single" w:sz="4" w:space="0" w:color="FFFFFF"/>
+              <w:insideH w:val="single" w:sz="4" w:space="0" w:color="FFFFFF"/>
+              <w:insideV w:val="single" w:sz="4" w:space="0" w:color="FFFFFF"/>
+            </w:tcBorders>
+          </w:tcPr>
+          <w:p>
+            <w:pPr>
+              <w:jc w:val="center"/>
+            </w:pPr>
+            <w:r>
+              <w:drawing>
+                <wp:inline xmlns:a="http://schemas.openxmlformats.org/drawingml/2006/main" xmlns:pic="http://schemas.openxmlformats.org/drawingml/2006/picture">
+                  <wp:extent cx="2651760" cy="1491615"/>
+                  <wp:docPr id="5" name="Picture 5"/>
+                  <wp:cNvGraphicFramePr>
+                    <a:graphicFrameLocks noChangeAspect="1"/>
+                  </wp:cNvGraphicFramePr>
+                  <a:graphic>
+                    <a:graphicData uri="http://schemas.openxmlformats.org/drawingml/2006/picture">
+                      <pic:pic>
+                        <pic:nvPicPr>
+                          <pic:cNvPr id="0" name="showcase_snow_gt_preview.png"/>
+                          <pic:cNvPicPr/>
+                        </pic:nvPicPr>
+                        <pic:blipFill>
+                          <a:blip r:embed="rId15"/>
+                          <a:stretch>
+                            <a:fillRect/>
+                          </a:stretch>
+                        </pic:blipFill>
+                        <pic:spPr>
+                          <a:xfrm>
+                            <a:off x="0" y="0"/>
+                            <a:ext cx="2651760" cy="1491615"/>
+                          </a:xfrm>
+                          <a:prstGeom prst="rect"/>
+                        </pic:spPr>
+                      </pic:pic>
+                    </a:graphicData>
+                  </a:graphic>
+                </wp:inline>
+              </w:drawing>
+            </w:r>
+          </w:p>
+        </w:tc>
+      </w:tr>
+      <w:tr>
+        <w:tc>
+          <w:tcPr>
+            <w:tcW w:type="dxa" w:w="4333"/>
+            <w:vAlign w:val="center"/>
+            <w:tcBorders>
+              <w:top w:val="single" w:sz="4" w:space="0" w:color="FFFFFF"/>
+              <w:left w:val="single" w:sz="4" w:space="0" w:color="FFFFFF"/>
+              <w:bottom w:val="single" w:sz="4" w:space="0" w:color="FFFFFF"/>
+              <w:right w:val="single" w:sz="4" w:space="0" w:color="FFFFFF"/>
+              <w:insideH w:val="single" w:sz="4" w:space="0" w:color="FFFFFF"/>
+              <w:insideV w:val="single" w:sz="4" w:space="0" w:color="FFFFFF"/>
+            </w:tcBorders>
+          </w:tcPr>
+          <w:p>
+            <w:pPr>
+              <w:jc w:val="center"/>
+            </w:pPr>
+            <w:r>
+              <w:rPr>
+                <w:i/>
+                <w:sz w:val="18"/>
+                <w:rFonts w:eastAsia="宋体"/>
+              </w:rPr>
+              <w:t>图 5(a)  城市追车风格展示图</w:t>
+            </w:r>
+          </w:p>
+        </w:tc>
+        <w:tc>
+          <w:tcPr>
+            <w:tcW w:type="dxa" w:w="4333"/>
+            <w:vAlign w:val="center"/>
+            <w:tcBorders>
+              <w:top w:val="single" w:sz="4" w:space="0" w:color="FFFFFF"/>
+              <w:left w:val="single" w:sz="4" w:space="0" w:color="FFFFFF"/>
+              <w:bottom w:val="single" w:sz="4" w:space="0" w:color="FFFFFF"/>
+              <w:right w:val="single" w:sz="4" w:space="0" w:color="FFFFFF"/>
+              <w:insideH w:val="single" w:sz="4" w:space="0" w:color="FFFFFF"/>
+              <w:insideV w:val="single" w:sz="4" w:space="0" w:color="FFFFFF"/>
+            </w:tcBorders>
+          </w:tcPr>
+          <w:p>
+            <w:pPr>
+              <w:jc w:val="center"/>
+            </w:pPr>
+            <w:r>
+              <w:rPr>
+                <w:i/>
+                <w:sz w:val="18"/>
+                <w:rFonts w:eastAsia="宋体"/>
+              </w:rPr>
+              <w:t>图 5(b)  雪地赛道风格展示图</w:t>
+            </w:r>
+          </w:p>
+        </w:tc>
+      </w:tr>
+    </w:tbl>
+    <w:p>
+      <w:pPr>
+        <w:jc w:val="center"/>
+      </w:pPr>
+      <w:r>
+        <w:drawing>
+          <wp:inline xmlns:a="http://schemas.openxmlformats.org/drawingml/2006/main" xmlns:pic="http://schemas.openxmlformats.org/drawingml/2006/picture">
+            <wp:extent cx="5212080" cy="2931795"/>
+            <wp:docPr id="6" name="Picture 6"/>
+            <wp:cNvGraphicFramePr>
+              <a:graphicFrameLocks noChangeAspect="1"/>
+            </wp:cNvGraphicFramePr>
+            <a:graphic>
+              <a:graphicData uri="http://schemas.openxmlformats.org/drawingml/2006/picture">
+                <pic:pic>
+                  <pic:nvPicPr>
+                    <pic:cNvPr id="0" name="showcase_blackhole_preview.png"/>
+                    <pic:cNvPicPr/>
+                  </pic:nvPicPr>
+                  <pic:blipFill>
+                    <a:blip r:embed="rId16"/>
+                    <a:stretch>
+                      <a:fillRect/>
+                    </a:stretch>
+                  </pic:blipFill>
+                  <pic:spPr>
+                    <a:xfrm>
+                      <a:off x="0" y="0"/>
+                      <a:ext cx="5212080" cy="2931795"/>
+                    </a:xfrm>
+                    <a:prstGeom prst="rect"/>
+                  </pic:spPr>
+                </pic:pic>
+              </a:graphicData>
+            </a:graphic>
+          </wp:inline>
+        </w:drawing>
+      </w:r>
+    </w:p>
+    <w:p>
+      <w:pPr>
+        <w:spacing w:after="120"/>
+        <w:jc w:val="center"/>
+      </w:pPr>
+      <w:r>
+        <w:rPr>
+          <w:i/>
+          <w:color w:val="505050"/>
+          <w:sz w:val="18"/>
+          <w:rFonts w:eastAsia="宋体"/>
+        </w:rPr>
+        <w:t>图 6  黑洞吸积盘风格展示图</w:t>
+      </w:r>
+    </w:p>
+    <w:p>
+      <w:pPr>
+        <w:pStyle w:val="Heading1"/>
+      </w:pPr>
+      <w:r>
+        <w:t>五、结果分析与问题说明</w:t>
+      </w:r>
+    </w:p>
+    <w:p>
+      <w:pPr>
+        <w:pStyle w:val="Heading2"/>
+      </w:pPr>
+      <w:r>
+        <w:t>5.1 OpenMP 加速效果分析</w:t>
+      </w:r>
+    </w:p>
+    <w:p>
+      <w:pPr>
+        <w:spacing w:after="100"/>
+        <w:ind w:firstLine="420"/>
+      </w:pPr>
+      <w:r>
+        <w:t>OpenMP 8 线程版本将运行时间由 39.1013 s 降低到 9.72383 s，加速比约为 4.02。由于文件输出、场景初始化和部分随机数处理仍存在串行开销，并且不同像素的反射/折射次数不完全一致，因此没有达到理想的 8 倍加速。</w:t>
+      </w:r>
+    </w:p>
+    <w:tbl>
+      <w:tblPr>
+        <w:tblW w:type="dxa" w:w="8600"/>
+        <w:jc w:val="center"/>
+        <w:tblLook w:firstColumn="1" w:firstRow="1" w:lastColumn="0" w:lastRow="0" w:noHBand="0" w:noVBand="1" w:val="04A0"/>
+      </w:tblPr>
+      <w:tblGrid>
+        <w:gridCol w:w="8666"/>
+      </w:tblGrid>
+      <w:tr>
+        <w:tc>
+          <w:tcPr>
+            <w:tcW w:type="dxa" w:w="8666"/>
+            <w:shd w:fill="F2F2F2"/>
+            <w:tcBorders>
+              <w:top w:val="single" w:sz="4" w:space="0" w:color="C9C9C9"/>
+              <w:left w:val="single" w:sz="4" w:space="0" w:color="C9C9C9"/>
+              <w:bottom w:val="single" w:sz="4" w:space="0" w:color="C9C9C9"/>
+              <w:right w:val="single" w:sz="4" w:space="0" w:color="C9C9C9"/>
+              <w:insideH w:val="single" w:sz="4" w:space="0" w:color="C9C9C9"/>
+              <w:insideV w:val="single" w:sz="4" w:space="0" w:color="C9C9C9"/>
             </w:tcBorders>
           </w:tcPr>
           <w:p>
@@ -2078,18 +2109,6 @@
             <w:r>
               <w:rPr>
                 <w:rFonts w:ascii="Menlo" w:hAnsi="Menlo" w:eastAsia="Menlo"/>
-                <w:color w:val="14283C"/>
-                <w:sz w:val="17"/>
-              </w:rPr>
-              <w:t>Speedup = T_serial / T_parallel</w:t>
-            </w:r>
-            <w:r>
-              <w:br/>
-            </w:r>
-            <w:r>
-              <w:rPr>
-                <w:rFonts w:ascii="Menlo" w:hAnsi="Menlo" w:eastAsia="Menlo"/>
-                <w:color w:val="14283C"/>
                 <w:sz w:val="17"/>
               </w:rPr>
               <w:t>OpenMP Speedup = 39.1013 / 9.72383 ≈ 4.02</w:t>
@@ -2100,38 +2119,61 @@
             <w:r>
               <w:rPr>
                 <w:rFonts w:ascii="Menlo" w:hAnsi="Menlo" w:eastAsia="Menlo"/>
-                <w:color w:val="14283C"/>
                 <w:sz w:val="17"/>
               </w:rPr>
+              <w:t>OpenMP Efficiency = 4.02 / 8 ≈ 50.3%</w:t>
             </w:r>
-            <w:r>
-              <w:br/>
-            </w:r>
+          </w:p>
+        </w:tc>
+      </w:tr>
+    </w:tbl>
+    <w:p>
+      <w:pPr>
+        <w:pStyle w:val="Heading2"/>
+      </w:pPr>
+      <w:r>
+        <w:t>5.2 CUDA 加速效果分析</w:t>
+      </w:r>
+    </w:p>
+    <w:p>
+      <w:pPr>
+        <w:spacing w:after="100"/>
+        <w:ind w:firstLine="420"/>
+      </w:pPr>
+      <w:r>
+        <w:t>CUDA 版本将每个像素交给独立 GPU 线程处理，在 400×300、64 samples 的测试参数下运行时间为 0.126103 s，相对串行版本加速约 310.07 倍。该结果说明光线追踪中的像素级并行度很高，适合使用 GPU 大规模并行计算。</w:t>
+      </w:r>
+    </w:p>
+    <w:tbl>
+      <w:tblPr>
+        <w:tblW w:type="dxa" w:w="8600"/>
+        <w:jc w:val="center"/>
+        <w:tblLook w:firstColumn="1" w:firstRow="1" w:lastColumn="0" w:lastRow="0" w:noHBand="0" w:noVBand="1" w:val="04A0"/>
+      </w:tblPr>
+      <w:tblGrid>
+        <w:gridCol w:w="8666"/>
+      </w:tblGrid>
+      <w:tr>
+        <w:tc>
+          <w:tcPr>
+            <w:tcW w:type="dxa" w:w="8666"/>
+            <w:shd w:fill="F2F2F2"/>
+            <w:tcBorders>
+              <w:top w:val="single" w:sz="4" w:space="0" w:color="C9C9C9"/>
+              <w:left w:val="single" w:sz="4" w:space="0" w:color="C9C9C9"/>
+              <w:bottom w:val="single" w:sz="4" w:space="0" w:color="C9C9C9"/>
+              <w:right w:val="single" w:sz="4" w:space="0" w:color="C9C9C9"/>
+              <w:insideH w:val="single" w:sz="4" w:space="0" w:color="C9C9C9"/>
+              <w:insideV w:val="single" w:sz="4" w:space="0" w:color="C9C9C9"/>
+            </w:tcBorders>
+          </w:tcPr>
+          <w:p>
+            <w:pPr>
+              <w:spacing w:before="80" w:after="80"/>
+            </w:pPr>
             <w:r>
               <w:rPr>
                 <w:rFonts w:ascii="Menlo" w:hAnsi="Menlo" w:eastAsia="Menlo"/>
-                <w:color w:val="14283C"/>
-                <w:sz w:val="17"/>
-              </w:rPr>
-              <w:t>Efficiency(8 threads) = Speedup / 8 ≈ 50.3%</w:t>
-            </w:r>
-            <w:r>
-              <w:br/>
-            </w:r>
-            <w:r>
-              <w:rPr>
-                <w:rFonts w:ascii="Menlo" w:hAnsi="Menlo" w:eastAsia="Menlo"/>
-                <w:color w:val="14283C"/>
-                <w:sz w:val="17"/>
-              </w:rPr>
-            </w:r>
-            <w:r>
-              <w:br/>
-            </w:r>
-            <w:r>
-              <w:rPr>
-                <w:rFonts w:ascii="Menlo" w:hAnsi="Menlo" w:eastAsia="Menlo"/>
-                <w:color w:val="14283C"/>
                 <w:sz w:val="17"/>
               </w:rPr>
               <w:t>CUDA Speedup = 39.1013 / 0.126103 ≈ 310.07</w:t>
@@ -2142,147 +2184,19 @@
     </w:tbl>
     <w:p>
       <w:pPr>
-        <w:pStyle w:val="Heading1"/>
+        <w:pStyle w:val="Heading2"/>
       </w:pPr>
       <w:r>
-        <w:t>10. 复现方法与提交文件说明</w:t>
+        <w:t>5.3 两实验对比总结</w:t>
       </w:r>
     </w:p>
     <w:p>
       <w:pPr>
+        <w:spacing w:after="100"/>
         <w:ind w:firstLine="420"/>
       </w:pPr>
       <w:r>
-        <w:t>提交压缩包命名为“大作业-8号.zip”，包含原始串行代码、OpenMP 优化代码、CUDA 优化代码、运行说明、实验报告以及答辩 PPT PDF。助教可按以下命令复现小规模正确性测试。</w:t>
-      </w:r>
-    </w:p>
-    <w:tbl>
-      <w:tblPr>
-        <w:tblW w:type="dxa" w:w="9360"/>
-        <w:jc w:val="center"/>
-        <w:tblLook w:firstColumn="1" w:firstRow="1" w:lastColumn="0" w:lastRow="0" w:noHBand="0" w:noVBand="1" w:val="04A0"/>
-      </w:tblPr>
-      <w:tblGrid>
-        <w:gridCol w:w="9792"/>
-      </w:tblGrid>
-      <w:tr>
-        <w:tc>
-          <w:tcPr>
-            <w:tcW w:type="dxa" w:w="9792"/>
-            <w:shd w:fill="F4F6F9"/>
-            <w:tcBorders>
-              <w:top w:val="single" w:sz="4" w:space="0" w:color="CBD5E1"/>
-              <w:left w:val="single" w:sz="4" w:space="0" w:color="CBD5E1"/>
-              <w:bottom w:val="single" w:sz="4" w:space="0" w:color="CBD5E1"/>
-              <w:right w:val="single" w:sz="4" w:space="0" w:color="CBD5E1"/>
-              <w:insideH w:val="single" w:sz="4" w:space="0" w:color="CBD5E1"/>
-              <w:insideV w:val="single" w:sz="4" w:space="0" w:color="CBD5E1"/>
-            </w:tcBorders>
-          </w:tcPr>
-          <w:p>
-            <w:pPr>
-              <w:spacing w:before="80" w:after="80"/>
-            </w:pPr>
-            <w:r>
-              <w:rPr>
-                <w:rFonts w:ascii="Menlo" w:hAnsi="Menlo" w:eastAsia="Menlo"/>
-                <w:color w:val="14283C"/>
-                <w:sz w:val="17"/>
-              </w:rPr>
-              <w:t>g++ -O2 -std=c++17 v1_serial/main.cpp -o v1_serial/v1_serial</w:t>
-            </w:r>
-            <w:r>
-              <w:br/>
-            </w:r>
-            <w:r>
-              <w:rPr>
-                <w:rFonts w:ascii="Menlo" w:hAnsi="Menlo" w:eastAsia="Menlo"/>
-                <w:color w:val="14283C"/>
-                <w:sz w:val="17"/>
-              </w:rPr>
-              <w:t>g++ -O2 -std=c++17 -fopenmp v2_openmp/main.cpp -o v2_openmp/v2_openmp</w:t>
-            </w:r>
-            <w:r>
-              <w:br/>
-            </w:r>
-            <w:r>
-              <w:rPr>
-                <w:rFonts w:ascii="Menlo" w:hAnsi="Menlo" w:eastAsia="Menlo"/>
-                <w:color w:val="14283C"/>
-                <w:sz w:val="17"/>
-              </w:rPr>
-              <w:t>module load intel/cuda/12.1</w:t>
-            </w:r>
-            <w:r>
-              <w:br/>
-            </w:r>
-            <w:r>
-              <w:rPr>
-                <w:rFonts w:ascii="Menlo" w:hAnsi="Menlo" w:eastAsia="Menlo"/>
-                <w:color w:val="14283C"/>
-                <w:sz w:val="17"/>
-              </w:rPr>
-              <w:t>nvcc -O3 -arch=sm_80 v3_cuda/main.cu -o v3_cuda/v3_cuda</w:t>
-            </w:r>
-            <w:r>
-              <w:br/>
-            </w:r>
-            <w:r>
-              <w:rPr>
-                <w:rFonts w:ascii="Menlo" w:hAnsi="Menlo" w:eastAsia="Menlo"/>
-                <w:color w:val="14283C"/>
-                <w:sz w:val="17"/>
-              </w:rPr>
-              <w:t>OMP_NUM_THREADS=8 ./v2_openmp/v2_openmp --width 400 --height 300 --samples 64 --scene racing</w:t>
-            </w:r>
-            <w:r>
-              <w:br/>
-            </w:r>
-            <w:r>
-              <w:rPr>
-                <w:rFonts w:ascii="Menlo" w:hAnsi="Menlo" w:eastAsia="Menlo"/>
-                <w:color w:val="14283C"/>
-                <w:sz w:val="17"/>
-              </w:rPr>
-              <w:t>sbatch submit.sh ./v3_cuda/v3_cuda</w:t>
-            </w:r>
-          </w:p>
-        </w:tc>
-      </w:tr>
-    </w:tbl>
-    <w:p>
-      <w:pPr>
-        <w:pStyle w:val="Heading1"/>
-      </w:pPr>
-      <w:r>
-        <w:t>11. 遇到的问题与后续计划</w:t>
-      </w:r>
-    </w:p>
-    <w:p>
-      <w:pPr>
-        <w:pStyle w:val="ListBullet"/>
-        <w:spacing w:after="60"/>
-      </w:pPr>
-      <w:r>
-        <w:t>CUDA 登录节点运行限制：登录节点不能作为正式 GPU 运行环境，应通过 Slurm 提交到 GPU 分区。</w:t>
-      </w:r>
-    </w:p>
-    <w:p>
-      <w:pPr>
-        <w:pStyle w:val="ListBullet"/>
-        <w:spacing w:after="60"/>
-      </w:pPr>
-      <w:r>
-        <w:t>不同平台作业脚本差异：PBS 与 Slurm 的队列参数不同，本项目同时保留了 scripts/submit_gpu_slurm.sh 与当前平台使用的 submit.sh。</w:t>
-      </w:r>
-    </w:p>
-    <w:p>
-      <w:pPr>
-        <w:pStyle w:val="ListBullet"/>
-        <w:spacing w:after="60"/>
-      </w:pPr>
-      <w:r>
-        <w:t>图像展示仍可提升：如果时间允许，可加入 OBJ 模型加载、三角形求交和 BVH 加速结构，提升车辆和城市场景的真实感。</w:t>
+        <w:t>CPU 多线程优化实现简单、调试方便，适合作为第一步并行化方案；GPU 优化对内存布局、线程组织和设备运行环境要求更高，但在像素数量较多、采样次数较高时能够获得更突出的加速效果。实验过程中曾出现登录节点 CUDA runtime 与 driver 不匹配的问题，最终通过 Slurm 提交至 gpu_4090 分区解决。</w:t>
       </w:r>
     </w:p>
     <w:p>
@@ -2290,30 +2204,32 @@
         <w:pStyle w:val="Heading1"/>
       </w:pPr>
       <w:r>
-        <w:t>12. 结论</w:t>
+        <w:t>六、实验体会</w:t>
       </w:r>
     </w:p>
     <w:p>
       <w:pPr>
+        <w:spacing w:after="100"/>
         <w:ind w:firstLine="420"/>
       </w:pPr>
       <w:r>
-        <w:t>本实验完成了光线追踪渲染器的串行、OpenMP 和 CUDA 三版本实现，并在超算平台完成三版本实测。OpenMP 8 线程相对串行版本获得约 4.02× 加速，CUDA GPU 版本相对串行版本获得约 310.07× 加速。</w:t>
+        <w:t>通过本次课程设计，我们从一个串行光线追踪程序出发，逐步完成 OpenMP 和 CUDA 两种并行优化。实验体会最深的是：高性能计算不仅是添加并行语句，还需要考虑任务划分、内存访问、随机数状态、输出同步和运行平台差异。</w:t>
       </w:r>
     </w:p>
     <w:p>
       <w:pPr>
+        <w:spacing w:after="100"/>
         <w:ind w:firstLine="420"/>
       </w:pPr>
       <w:r>
-        <w:t>总体来看，光线追踪具有明显的像素级并行特征，非常适合使用 OpenMP 和 CUDA 加速。本项目不仅验证了多核 CPU 并行的效果，也为后续 GPU 大规模并行实验和更复杂场景渲染奠定了基础。</w:t>
+        <w:t>本项目最终能够在超算平台生成渲染图片并取得明显加速，说明光线追踪渲染是展示高性能计算价值的合适案例。后续若继续完善，可加入 OBJ 模型加载、BVH 加速结构和更复杂材质，从而进一步接近真实游戏渲染管线。</w:t>
       </w:r>
     </w:p>
     <w:sectPr>
       <w:headerReference w:type="default" r:id="rId9"/>
       <w:footerReference w:type="default" r:id="rId10"/>
-      <w:pgSz w:w="12240" w:h="15840"/>
-      <w:pgMar w:top="1080" w:right="1224" w:bottom="1080" w:left="1224" w:header="720" w:footer="720" w:gutter="0"/>
+      <w:pgSz w:w="11906" w:h="16838"/>
+      <w:pgMar w:top="1440" w:right="1440" w:bottom="1440" w:left="1800" w:header="709" w:footer="709" w:gutter="0"/>
       <w:cols w:space="720"/>
       <w:docGrid w:linePitch="360"/>
     </w:sectPr>
@@ -2330,10 +2246,11 @@
     </w:pPr>
     <w:r>
       <w:rPr>
-        <w:color w:val="787878"/>
+        <w:color w:val="646464"/>
         <w:sz w:val="18"/>
-      </w:rPr>
-      <w:t>第 8 组 · 24281098 胡哲祺 / 24281100 李建宇</w:t>
+        <w:rFonts w:eastAsia="宋体"/>
+      </w:rPr>
+      <w:t>第 8 组  24281098 胡哲祺 / 24281100 李建宇</w:t>
     </w:r>
   </w:p>
 </w:ftr>
@@ -2350,8 +2267,9 @@
       <w:rPr>
         <w:color w:val="646464"/>
         <w:sz w:val="18"/>
-      </w:rPr>
-      <w:t>高性能计算大作业：光线追踪渲染器并行加速</w:t>
+        <w:rFonts w:eastAsia="宋体"/>
+      </w:rPr>
+      <w:t>并行编程实验设计文档</w:t>
     </w:r>
   </w:p>
 </w:hdr>
@@ -2721,10 +2639,10 @@
     <w:qFormat/>
     <w:rsid w:val="00FC693F"/>
     <w:pPr>
-      <w:spacing w:line="269" w:lineRule="auto" w:after="100"/>
+      <w:spacing w:line="300" w:lineRule="auto" w:after="80"/>
     </w:pPr>
     <w:rPr>
-      <w:rFonts w:ascii="Calibri" w:hAnsi="Calibri" w:eastAsia="宋体"/>
+      <w:rFonts w:ascii="Times New Roman" w:hAnsi="Times New Roman" w:eastAsia="宋体"/>
       <w:sz w:val="21"/>
     </w:rPr>
   </w:style>
@@ -2783,15 +2701,15 @@
     <w:pPr>
       <w:keepNext/>
       <w:keepLines/>
-      <w:spacing w:before="280" w:after="140"/>
+      <w:spacing w:before="240" w:after="120"/>
       <w:outlineLvl w:val="0"/>
     </w:pPr>
     <w:rPr>
-      <w:rFonts w:asciiTheme="majorHAnsi" w:eastAsiaTheme="majorEastAsia" w:hAnsiTheme="majorHAnsi" w:cstheme="majorBidi" w:ascii="Calibri" w:hAnsi="Calibri" w:eastAsia="黑体"/>
+      <w:rFonts w:asciiTheme="majorHAnsi" w:eastAsiaTheme="majorEastAsia" w:hAnsiTheme="majorHAnsi" w:cstheme="majorBidi" w:ascii="Times New Roman" w:hAnsi="Times New Roman" w:eastAsia="黑体"/>
       <w:b/>
       <w:bCs/>
-      <w:color w:val="1F4D78"/>
-      <w:sz w:val="32"/>
+      <w:color w:val="000000"/>
+      <w:sz w:val="30"/>
       <w:szCs w:val="28"/>
     </w:rPr>
   </w:style>
@@ -2807,14 +2725,14 @@
     <w:pPr>
       <w:keepNext/>
       <w:keepLines/>
-      <w:spacing w:before="200" w:after="100"/>
+      <w:spacing w:before="160" w:after="80"/>
       <w:outlineLvl w:val="1"/>
     </w:pPr>
     <w:rPr>
-      <w:rFonts w:asciiTheme="majorHAnsi" w:eastAsiaTheme="majorEastAsia" w:hAnsiTheme="majorHAnsi" w:cstheme="majorBidi" w:ascii="Calibri" w:hAnsi="Calibri" w:eastAsia="黑体"/>
+      <w:rFonts w:asciiTheme="majorHAnsi" w:eastAsiaTheme="majorEastAsia" w:hAnsiTheme="majorHAnsi" w:cstheme="majorBidi" w:ascii="Times New Roman" w:hAnsi="Times New Roman" w:eastAsia="黑体"/>
       <w:b/>
       <w:bCs/>
-      <w:color w:val="2E74B5"/>
+      <w:color w:val="000000"/>
       <w:sz w:val="26"/>
       <w:szCs w:val="26"/>
     </w:rPr>
@@ -2831,15 +2749,14 @@
     <w:pPr>
       <w:keepNext/>
       <w:keepLines/>
-      <w:spacing w:before="140" w:after="60"/>
+      <w:spacing w:before="200" w:after="0"/>
       <w:outlineLvl w:val="2"/>
     </w:pPr>
     <w:rPr>
-      <w:rFonts w:asciiTheme="majorHAnsi" w:eastAsiaTheme="majorEastAsia" w:hAnsiTheme="majorHAnsi" w:cstheme="majorBidi" w:ascii="Calibri" w:hAnsi="Calibri" w:eastAsia="黑体"/>
+      <w:rFonts w:asciiTheme="majorHAnsi" w:eastAsiaTheme="majorEastAsia" w:hAnsiTheme="majorHAnsi" w:cstheme="majorBidi"/>
       <w:b/>
       <w:bCs/>
-      <w:color w:val="1F4D78"/>
-      <w:sz w:val="23"/>
+      <w:color w:val="4F81BD" w:themeColor="accent1"/>
     </w:rPr>
   </w:style>
   <w:style w:type="paragraph" w:styleId="Heading4">

</xml_diff>